<commit_message>
Update report: VPC objective completed and documented
Marks 'Create and manage a VPC' as Done, adds Section 7.1 describing the custom VPC (subnet, IGW, route table, DynamoDB gateway endpoint, security group), verified live (EC2 in-VPC returns HTTP 200).
</commit_message>
<xml_diff>
--- a/report/BZ-Agent_Report.docx
+++ b/report/BZ-Agent_Report.docx
@@ -2546,7 +2546,15 @@
         <w:pStyle w:val="Heading2"/>
       </w:pPr>
       <w:r>
-        <w:t xml:space="preserve">7.1 Hardening still recommended</w:t>
+        <w:t xml:space="preserve">7.1 Network isolation — custom VPC</w:t>
+      </w:r>
+    </w:p>
+    <w:p>
+      <w:pPr>
+        <w:spacing w:after="120"/>
+      </w:pPr>
+      <w:r>
+        <w:t xml:space="preserve">The EC2 workload runs inside a purpose-built Virtual Private Cloud rather than the default VPC, demonstrating network-level control:</w:t>
       </w:r>
     </w:p>
     <w:p>
@@ -2559,7 +2567,7 @@
         <w:spacing w:after="60"/>
       </w:pPr>
       <w:r>
-        <w:t xml:space="preserve">Move EC2 and Lambda into a custom VPC with private subnets and VPC endpoints for DynamoDB/Bedrock.</w:t>
+        <w:t xml:space="preserve">VPC 10.0.0.0/16 with DNS support and hostnames enabled.</w:t>
       </w:r>
     </w:p>
     <w:p>
@@ -2572,7 +2580,67 @@
         <w:spacing w:after="60"/>
       </w:pPr>
       <w:r>
-        <w:t xml:space="preserve">Enable MFA on the root account; serve EC2 over HTTPS; store any future secret in AWS Secrets Manager.</w:t>
+        <w:t xml:space="preserve">A public subnet (10.0.1.0/24) with an Internet Gateway and a 0.0.0.0/0 route, so the instance can reach the Open Data Hub and Bedrock.</w:t>
+      </w:r>
+    </w:p>
+    <w:p>
+      <w:pPr>
+        <w:pStyle w:val="ListParagraph"/>
+        <w:numPr>
+          <w:ilvl w:val="0"/>
+          <w:numId w:val="2"/>
+        </w:numPr>
+        <w:spacing w:after="60"/>
+      </w:pPr>
+      <w:r>
+        <w:t xml:space="preserve">A DynamoDB gateway VPC endpoint attached to the route table, so state traffic to DynamoDB stays on the AWS private network instead of the public internet (and incurs no extra cost).</w:t>
+      </w:r>
+    </w:p>
+    <w:p>
+      <w:pPr>
+        <w:pStyle w:val="ListParagraph"/>
+        <w:numPr>
+          <w:ilvl w:val="0"/>
+          <w:numId w:val="2"/>
+        </w:numPr>
+        <w:spacing w:after="60"/>
+      </w:pPr>
+      <w:r>
+        <w:t xml:space="preserve">A security group that allows only inbound TCP 8080, acting as a stateful virtual firewall.</w:t>
+      </w:r>
+    </w:p>
+    <w:p>
+      <w:pPr>
+        <w:pStyle w:val="Heading2"/>
+      </w:pPr>
+      <w:r>
+        <w:t xml:space="preserve">7.2 Hardening still recommended</w:t>
+      </w:r>
+    </w:p>
+    <w:p>
+      <w:pPr>
+        <w:pStyle w:val="ListParagraph"/>
+        <w:numPr>
+          <w:ilvl w:val="0"/>
+          <w:numId w:val="2"/>
+        </w:numPr>
+        <w:spacing w:after="60"/>
+      </w:pPr>
+      <w:r>
+        <w:t xml:space="preserve">Move the Lambda into private subnets with interface endpoints; serve EC2 over HTTPS behind a load balancer.</w:t>
+      </w:r>
+    </w:p>
+    <w:p>
+      <w:pPr>
+        <w:pStyle w:val="ListParagraph"/>
+        <w:numPr>
+          <w:ilvl w:val="0"/>
+          <w:numId w:val="2"/>
+        </w:numPr>
+        <w:spacing w:after="60"/>
+      </w:pPr>
+      <w:r>
+        <w:t xml:space="preserve">Enable MFA on the root account; store any future secret in AWS Secrets Manager.</w:t>
       </w:r>
     </w:p>
     <w:p>
@@ -3633,7 +3701,7 @@
                 <w:sz w:val="20"/>
                 <w:szCs w:val="20"/>
               </w:rPr>
-              <w:t xml:space="preserve">Planned</w:t>
+              <w:t xml:space="preserve">Done</w:t>
             </w:r>
           </w:p>
         </w:tc>
@@ -3665,7 +3733,7 @@
                 <w:sz w:val="20"/>
                 <w:szCs w:val="20"/>
               </w:rPr>
-              <w:t xml:space="preserve">Section 7.1 (next phase)</w:t>
+              <w:t xml:space="preserve">Section 7.1</w:t>
             </w:r>
           </w:p>
         </w:tc>
@@ -3992,7 +4060,7 @@
         <w:spacing w:after="60"/>
       </w:pPr>
       <w:r>
-        <w:t xml:space="preserve">Custom VPC with private subnets and VPC endpoints (the remaining graded objective).</w:t>
+        <w:t xml:space="preserve">Extend the VPC with private subnets and place the Lambda inside it with interface endpoints.</w:t>
       </w:r>
     </w:p>
     <w:p>

</xml_diff>

<commit_message>
Update report: streaming, IaC, and cost-aware Lambda-in-VPC decision
Marks SSE streaming and Terraform IaC as delivered; documents Lambda-in-private-subnets as deliberately deferred on NAT/endpoint cost grounds.
</commit_message>
<xml_diff>
--- a/report/BZ-Agent_Report.docx
+++ b/report/BZ-Agent_Report.docx
@@ -2856,7 +2856,7 @@
                 <w:sz w:val="20"/>
                 <w:szCs w:val="20"/>
               </w:rPr>
-              <w:t xml:space="preserve">EC2 (Architecture B)</w:t>
+              <w:t xml:space="preserve">EC2 (Architecture B, in custom VPC)</w:t>
             </w:r>
           </w:p>
         </w:tc>
@@ -2994,7 +2994,7 @@
                 <w:sz w:val="20"/>
                 <w:szCs w:val="20"/>
               </w:rPr>
-              <w:t xml:space="preserve">DynamoDB state</w:t>
+              <w:t xml:space="preserve">SSE progress streaming</w:t>
             </w:r>
           </w:p>
         </w:tc>
@@ -3026,7 +3026,7 @@
                 <w:sz w:val="20"/>
                 <w:szCs w:val="20"/>
               </w:rPr>
-              <w:t xml:space="preserve">Scratchpad written per node (retriever/reasoner/generator)</w:t>
+              <w:t xml:space="preserve">Live: emits 3 progress events, then the itinerary</w:t>
             </w:r>
           </w:p>
         </w:tc>
@@ -3063,6 +3063,75 @@
                 <w:sz w:val="20"/>
                 <w:szCs w:val="20"/>
               </w:rPr>
+              <w:t xml:space="preserve">DynamoDB state</w:t>
+            </w:r>
+          </w:p>
+        </w:tc>
+        <w:tc>
+          <w:tcPr>
+            <w:tcW w:type="dxa" w:w="6240"/>
+            <w:tcBorders>
+              <w:top w:val="single" w:color="CCCCCC" w:sz="1"/>
+              <w:left w:val="single" w:color="CCCCCC" w:sz="1"/>
+              <w:bottom w:val="single" w:color="CCCCCC" w:sz="1"/>
+              <w:right w:val="single" w:color="CCCCCC" w:sz="1"/>
+            </w:tcBorders>
+            <w:tcMar>
+              <w:top w:type="dxa" w:w="60"/>
+              <w:left w:type="dxa" w:w="110"/>
+              <w:bottom w:type="dxa" w:w="60"/>
+              <w:right w:type="dxa" w:w="110"/>
+            </w:tcMar>
+            <w:vAlign w:val="center"/>
+          </w:tcPr>
+          <w:p>
+            <w:pPr>
+              <w:spacing w:after="0"/>
+            </w:pPr>
+            <w:r>
+              <w:rPr>
+                <w:b w:val="false"/>
+                <w:bCs w:val="false"/>
+                <w:sz w:val="20"/>
+                <w:szCs w:val="20"/>
+              </w:rPr>
+              <w:t xml:space="preserve">Scratchpad written per node (retriever/reasoner/generator)</w:t>
+            </w:r>
+          </w:p>
+        </w:tc>
+      </w:tr>
+      <w:tr>
+        <w:trPr>
+          <w:tblHeader w:val="false"/>
+        </w:trPr>
+        <w:tc>
+          <w:tcPr>
+            <w:tcW w:type="dxa" w:w="3120"/>
+            <w:tcBorders>
+              <w:top w:val="single" w:color="CCCCCC" w:sz="1"/>
+              <w:left w:val="single" w:color="CCCCCC" w:sz="1"/>
+              <w:bottom w:val="single" w:color="CCCCCC" w:sz="1"/>
+              <w:right w:val="single" w:color="CCCCCC" w:sz="1"/>
+            </w:tcBorders>
+            <w:tcMar>
+              <w:top w:type="dxa" w:w="60"/>
+              <w:left w:type="dxa" w:w="110"/>
+              <w:bottom w:type="dxa" w:w="60"/>
+              <w:right w:type="dxa" w:w="110"/>
+            </w:tcMar>
+            <w:vAlign w:val="center"/>
+          </w:tcPr>
+          <w:p>
+            <w:pPr>
+              <w:spacing w:after="0"/>
+            </w:pPr>
+            <w:r>
+              <w:rPr>
+                <w:b w:val="false"/>
+                <w:bCs w:val="false"/>
+                <w:sz w:val="20"/>
+                <w:szCs w:val="20"/>
+              </w:rPr>
               <w:t xml:space="preserve">Bedrock Claude Sonnet 4.5</w:t>
             </w:r>
           </w:p>
@@ -3101,6 +3170,14 @@
         </w:tc>
       </w:tr>
     </w:tbl>
+    <w:p>
+      <w:pPr>
+        <w:spacing w:after="120"/>
+      </w:pPr>
+      <w:r>
+        <w:t xml:space="preserve">A Server-Sent Events endpoint (POST /plan-itinerary/stream) streams progress to the browser, so the UI shows a live checklist — “Fetched live data”, “Reasoned over constraints”, “Wrote your itinerary” — as each agent finishes. The whole stack is also codified as Terraform (infra/) for reproducible, one-command provisioning.</w:t>
+      </w:r>
+    </w:p>
     <w:p>
       <w:pPr>
         <w:pStyle w:val="Heading1"/>
@@ -4060,7 +4137,7 @@
         <w:spacing w:after="60"/>
       </w:pPr>
       <w:r>
-        <w:t xml:space="preserve">Extend the VPC with private subnets and place the Lambda inside it with interface endpoints.</w:t>
+        <w:t xml:space="preserve">Live SASA bus / GTFS schedules so the Reasoner can suggest exact departures. (Not in the ODH public flat API; would require integrating SASA’s separate GTFS feed.)</w:t>
       </w:r>
     </w:p>
     <w:p>
@@ -4073,7 +4150,7 @@
         <w:spacing w:after="60"/>
       </w:pPr>
       <w:r>
-        <w:t xml:space="preserve">Live SASA bus / GTFS schedules so the Reasoner can suggest exact departures.</w:t>
+        <w:t xml:space="preserve">Place the Lambda inside private subnets. Designed but deferred on cost grounds: reaching the public Open Data Hub from a private subnet needs a NAT Gateway (~$38/month) plus a Bedrock interface endpoint (~$8/month); not justified for a demo. Documented as a deliberate cost-aware decision.</w:t>
       </w:r>
     </w:p>
     <w:p>
@@ -4086,33 +4163,7 @@
         <w:spacing w:after="60"/>
       </w:pPr>
       <w:r>
-        <w:t xml:space="preserve">WebSocket streaming of progress (“Fetching weather… Calculating routes…”) to the UI.</w:t>
-      </w:r>
-    </w:p>
-    <w:p>
-      <w:pPr>
-        <w:pStyle w:val="ListParagraph"/>
-        <w:numPr>
-          <w:ilvl w:val="0"/>
-          <w:numId w:val="2"/>
-        </w:numPr>
-        <w:spacing w:after="60"/>
-      </w:pPr>
-      <w:r>
-        <w:t xml:space="preserve">Infrastructure as Code (AWS CDK or Terraform) wrapping the deploy scripts.</w:t>
-      </w:r>
-    </w:p>
-    <w:p>
-      <w:pPr>
-        <w:pStyle w:val="ListParagraph"/>
-        <w:numPr>
-          <w:ilvl w:val="0"/>
-          <w:numId w:val="2"/>
-        </w:numPr>
-        <w:spacing w:after="60"/>
-      </w:pPr>
-      <w:r>
-        <w:t xml:space="preserve">Multi-turn memory so follow-up questions reuse prior session context.</w:t>
+        <w:t xml:space="preserve">Multi-turn memory so follow-up questions reuse prior session context (history is already persisted in DynamoDB).</w:t>
       </w:r>
     </w:p>
     <w:p>

</xml_diff>

<commit_message>
Regenerate report .docx with load-test section (251 paragraphs)
</commit_message>
<xml_diff>
--- a/report/BZ-Agent_Report.docx
+++ b/report/BZ-Agent_Report.docx
@@ -1999,6 +1999,2354 @@
           <w:bCs/>
         </w:rPr>
         <w:t xml:space="preserve">Conclusion: for an interactive planner with bursty, unpredictable usage, Lambda + API Gateway is the cost-efficient default (zero idle cost). EC2 becomes preferable only if traffic is steady enough to keep the instance busy, or if an agent run could exceed Lambda’s 15-minute ceiling.</w:t>
+      </w:r>
+    </w:p>
+    <w:p>
+      <w:pPr>
+        <w:pStyle w:val="Heading2"/>
+      </w:pPr>
+      <w:r>
+        <w:t xml:space="preserve">5.1 Load-testing methodology</w:t>
+      </w:r>
+    </w:p>
+    <w:p>
+      <w:pPr>
+        <w:spacing w:after="120"/>
+      </w:pPr>
+      <w:r>
+        <w:t xml:space="preserve">The two architectures were compared under increasing concurrency of approximately 50, 200, and 1000 simulated users. Because every /plan-itinerary call triggers ~3 Amazon Bedrock requests, a sustained 1000-user run would generate tens of thousands of Bedrock calls — incurring real cost and hitting Bedrock’s per-minute quota — so a hybrid approach was used:</w:t>
+      </w:r>
+    </w:p>
+    <w:p>
+      <w:pPr>
+        <w:pStyle w:val="ListParagraph"/>
+        <w:numPr>
+          <w:ilvl w:val="0"/>
+          <w:numId w:val="2"/>
+        </w:numPr>
+        <w:spacing w:after="60"/>
+      </w:pPr>
+      <w:r>
+        <w:t xml:space="preserve">k6 scripts (load50 / load200 / stress1000 scenarios) provide the aggressive, repeatable load generator.</w:t>
+      </w:r>
+    </w:p>
+    <w:p>
+      <w:pPr>
+        <w:pStyle w:val="ListParagraph"/>
+        <w:numPr>
+          <w:ilvl w:val="0"/>
+          <w:numId w:val="2"/>
+        </w:numPr>
+        <w:spacing w:after="60"/>
+      </w:pPr>
+      <w:r>
+        <w:t xml:space="preserve">Real measurements were taken for single-request latency and for raw infrastructure concurrency on the cost-free /health endpoint.</w:t>
+      </w:r>
+    </w:p>
+    <w:p>
+      <w:pPr>
+        <w:pStyle w:val="ListParagraph"/>
+        <w:numPr>
+          <w:ilvl w:val="0"/>
+          <w:numId w:val="2"/>
+        </w:numPr>
+        <w:spacing w:after="60"/>
+      </w:pPr>
+      <w:r>
+        <w:t xml:space="preserve">The full 50/200/1000-user workload is then modelled from those real numbers plus documented AWS service limits, with estimates clearly labelled.</w:t>
+      </w:r>
+    </w:p>
+    <w:p>
+      <w:pPr>
+        <w:pStyle w:val="Heading2"/>
+      </w:pPr>
+      <w:r>
+        <w:t xml:space="preserve">5.2 Measured results</w:t>
+      </w:r>
+    </w:p>
+    <w:p>
+      <w:pPr>
+        <w:spacing w:after="120"/>
+      </w:pPr>
+      <w:r>
+        <w:t xml:space="preserve">Single-request latency (EC2 t3.small, warm): six sequential requests averaged 16.9 s (min 14.7 s, max 18.4 s); Lambda was comparable (~13–15 s warm, ~17.8 s cold). Latency is dominated by the three sequential Bedrock calls, so it is similar for both architectures. Raw infrastructure concurrency on /health:</w:t>
+      </w:r>
+    </w:p>
+    <w:tbl>
+      <w:tblPr>
+        <w:tblW w:type="dxa" w:w="9360"/>
+        <w:tblBorders>
+          <w:top w:val="single" w:color="auto" w:sz="4"/>
+          <w:left w:val="single" w:color="auto" w:sz="4"/>
+          <w:bottom w:val="single" w:color="auto" w:sz="4"/>
+          <w:right w:val="single" w:color="auto" w:sz="4"/>
+          <w:insideH w:val="single" w:color="auto" w:sz="4"/>
+          <w:insideV w:val="single" w:color="auto" w:sz="4"/>
+        </w:tblBorders>
+      </w:tblPr>
+      <w:tblGrid>
+        <w:gridCol w:w="1560"/>
+        <w:gridCol w:w="1560"/>
+        <w:gridCol w:w="1560"/>
+        <w:gridCol w:w="1560"/>
+        <w:gridCol w:w="1560"/>
+        <w:gridCol w:w="1560"/>
+      </w:tblGrid>
+      <w:tr>
+        <w:trPr>
+          <w:tblHeader/>
+        </w:trPr>
+        <w:tc>
+          <w:tcPr>
+            <w:tcW w:type="dxa" w:w="1560"/>
+            <w:tcBorders>
+              <w:top w:val="single" w:color="CCCCCC" w:sz="1"/>
+              <w:left w:val="single" w:color="CCCCCC" w:sz="1"/>
+              <w:bottom w:val="single" w:color="CCCCCC" w:sz="1"/>
+              <w:right w:val="single" w:color="CCCCCC" w:sz="1"/>
+            </w:tcBorders>
+            <w:shd w:fill="D5E8F0" w:val="clear"/>
+            <w:tcMar>
+              <w:top w:type="dxa" w:w="60"/>
+              <w:left w:type="dxa" w:w="110"/>
+              <w:bottom w:type="dxa" w:w="60"/>
+              <w:right w:type="dxa" w:w="110"/>
+            </w:tcMar>
+            <w:vAlign w:val="center"/>
+          </w:tcPr>
+          <w:p>
+            <w:pPr>
+              <w:spacing w:after="0"/>
+            </w:pPr>
+            <w:r>
+              <w:rPr>
+                <w:b/>
+                <w:bCs/>
+                <w:color w:val="0F172A"/>
+                <w:sz w:val="20"/>
+                <w:szCs w:val="20"/>
+              </w:rPr>
+              <w:t xml:space="preserve">Concurrency</w:t>
+            </w:r>
+          </w:p>
+        </w:tc>
+        <w:tc>
+          <w:tcPr>
+            <w:tcW w:type="dxa" w:w="1560"/>
+            <w:tcBorders>
+              <w:top w:val="single" w:color="CCCCCC" w:sz="1"/>
+              <w:left w:val="single" w:color="CCCCCC" w:sz="1"/>
+              <w:bottom w:val="single" w:color="CCCCCC" w:sz="1"/>
+              <w:right w:val="single" w:color="CCCCCC" w:sz="1"/>
+            </w:tcBorders>
+            <w:shd w:fill="D5E8F0" w:val="clear"/>
+            <w:tcMar>
+              <w:top w:type="dxa" w:w="60"/>
+              <w:left w:type="dxa" w:w="110"/>
+              <w:bottom w:type="dxa" w:w="60"/>
+              <w:right w:type="dxa" w:w="110"/>
+            </w:tcMar>
+            <w:vAlign w:val="center"/>
+          </w:tcPr>
+          <w:p>
+            <w:pPr>
+              <w:spacing w:after="0"/>
+            </w:pPr>
+            <w:r>
+              <w:rPr>
+                <w:b/>
+                <w:bCs/>
+                <w:color w:val="0F172A"/>
+                <w:sz w:val="20"/>
+                <w:szCs w:val="20"/>
+              </w:rPr>
+              <w:t xml:space="preserve">Throughput</w:t>
+            </w:r>
+          </w:p>
+        </w:tc>
+        <w:tc>
+          <w:tcPr>
+            <w:tcW w:type="dxa" w:w="1560"/>
+            <w:tcBorders>
+              <w:top w:val="single" w:color="CCCCCC" w:sz="1"/>
+              <w:left w:val="single" w:color="CCCCCC" w:sz="1"/>
+              <w:bottom w:val="single" w:color="CCCCCC" w:sz="1"/>
+              <w:right w:val="single" w:color="CCCCCC" w:sz="1"/>
+            </w:tcBorders>
+            <w:shd w:fill="D5E8F0" w:val="clear"/>
+            <w:tcMar>
+              <w:top w:type="dxa" w:w="60"/>
+              <w:left w:type="dxa" w:w="110"/>
+              <w:bottom w:type="dxa" w:w="60"/>
+              <w:right w:type="dxa" w:w="110"/>
+            </w:tcMar>
+            <w:vAlign w:val="center"/>
+          </w:tcPr>
+          <w:p>
+            <w:pPr>
+              <w:spacing w:after="0"/>
+            </w:pPr>
+            <w:r>
+              <w:rPr>
+                <w:b/>
+                <w:bCs/>
+                <w:color w:val="0F172A"/>
+                <w:sz w:val="20"/>
+                <w:szCs w:val="20"/>
+              </w:rPr>
+              <w:t xml:space="preserve">p50</w:t>
+            </w:r>
+          </w:p>
+        </w:tc>
+        <w:tc>
+          <w:tcPr>
+            <w:tcW w:type="dxa" w:w="1560"/>
+            <w:tcBorders>
+              <w:top w:val="single" w:color="CCCCCC" w:sz="1"/>
+              <w:left w:val="single" w:color="CCCCCC" w:sz="1"/>
+              <w:bottom w:val="single" w:color="CCCCCC" w:sz="1"/>
+              <w:right w:val="single" w:color="CCCCCC" w:sz="1"/>
+            </w:tcBorders>
+            <w:shd w:fill="D5E8F0" w:val="clear"/>
+            <w:tcMar>
+              <w:top w:type="dxa" w:w="60"/>
+              <w:left w:type="dxa" w:w="110"/>
+              <w:bottom w:type="dxa" w:w="60"/>
+              <w:right w:type="dxa" w:w="110"/>
+            </w:tcMar>
+            <w:vAlign w:val="center"/>
+          </w:tcPr>
+          <w:p>
+            <w:pPr>
+              <w:spacing w:after="0"/>
+            </w:pPr>
+            <w:r>
+              <w:rPr>
+                <w:b/>
+                <w:bCs/>
+                <w:color w:val="0F172A"/>
+                <w:sz w:val="20"/>
+                <w:szCs w:val="20"/>
+              </w:rPr>
+              <w:t xml:space="preserve">p95</w:t>
+            </w:r>
+          </w:p>
+        </w:tc>
+        <w:tc>
+          <w:tcPr>
+            <w:tcW w:type="dxa" w:w="1560"/>
+            <w:tcBorders>
+              <w:top w:val="single" w:color="CCCCCC" w:sz="1"/>
+              <w:left w:val="single" w:color="CCCCCC" w:sz="1"/>
+              <w:bottom w:val="single" w:color="CCCCCC" w:sz="1"/>
+              <w:right w:val="single" w:color="CCCCCC" w:sz="1"/>
+            </w:tcBorders>
+            <w:shd w:fill="D5E8F0" w:val="clear"/>
+            <w:tcMar>
+              <w:top w:type="dxa" w:w="60"/>
+              <w:left w:type="dxa" w:w="110"/>
+              <w:bottom w:type="dxa" w:w="60"/>
+              <w:right w:type="dxa" w:w="110"/>
+            </w:tcMar>
+            <w:vAlign w:val="center"/>
+          </w:tcPr>
+          <w:p>
+            <w:pPr>
+              <w:spacing w:after="0"/>
+            </w:pPr>
+            <w:r>
+              <w:rPr>
+                <w:b/>
+                <w:bCs/>
+                <w:color w:val="0F172A"/>
+                <w:sz w:val="20"/>
+                <w:szCs w:val="20"/>
+              </w:rPr>
+              <w:t xml:space="preserve">p99</w:t>
+            </w:r>
+          </w:p>
+        </w:tc>
+        <w:tc>
+          <w:tcPr>
+            <w:tcW w:type="dxa" w:w="1560"/>
+            <w:tcBorders>
+              <w:top w:val="single" w:color="CCCCCC" w:sz="1"/>
+              <w:left w:val="single" w:color="CCCCCC" w:sz="1"/>
+              <w:bottom w:val="single" w:color="CCCCCC" w:sz="1"/>
+              <w:right w:val="single" w:color="CCCCCC" w:sz="1"/>
+            </w:tcBorders>
+            <w:shd w:fill="D5E8F0" w:val="clear"/>
+            <w:tcMar>
+              <w:top w:type="dxa" w:w="60"/>
+              <w:left w:type="dxa" w:w="110"/>
+              <w:bottom w:type="dxa" w:w="60"/>
+              <w:right w:type="dxa" w:w="110"/>
+            </w:tcMar>
+            <w:vAlign w:val="center"/>
+          </w:tcPr>
+          <w:p>
+            <w:pPr>
+              <w:spacing w:after="0"/>
+            </w:pPr>
+            <w:r>
+              <w:rPr>
+                <w:b/>
+                <w:bCs/>
+                <w:color w:val="0F172A"/>
+                <w:sz w:val="20"/>
+                <w:szCs w:val="20"/>
+              </w:rPr>
+              <w:t xml:space="preserve">Errors</w:t>
+            </w:r>
+          </w:p>
+        </w:tc>
+      </w:tr>
+      <w:tr>
+        <w:trPr>
+          <w:tblHeader w:val="false"/>
+        </w:trPr>
+        <w:tc>
+          <w:tcPr>
+            <w:tcW w:type="dxa" w:w="1560"/>
+            <w:tcBorders>
+              <w:top w:val="single" w:color="CCCCCC" w:sz="1"/>
+              <w:left w:val="single" w:color="CCCCCC" w:sz="1"/>
+              <w:bottom w:val="single" w:color="CCCCCC" w:sz="1"/>
+              <w:right w:val="single" w:color="CCCCCC" w:sz="1"/>
+            </w:tcBorders>
+            <w:tcMar>
+              <w:top w:type="dxa" w:w="60"/>
+              <w:left w:type="dxa" w:w="110"/>
+              <w:bottom w:type="dxa" w:w="60"/>
+              <w:right w:type="dxa" w:w="110"/>
+            </w:tcMar>
+            <w:vAlign w:val="center"/>
+          </w:tcPr>
+          <w:p>
+            <w:pPr>
+              <w:spacing w:after="0"/>
+            </w:pPr>
+            <w:r>
+              <w:rPr>
+                <w:b w:val="false"/>
+                <w:bCs w:val="false"/>
+                <w:sz w:val="20"/>
+                <w:szCs w:val="20"/>
+              </w:rPr>
+              <w:t xml:space="preserve">50</w:t>
+            </w:r>
+          </w:p>
+        </w:tc>
+        <w:tc>
+          <w:tcPr>
+            <w:tcW w:type="dxa" w:w="1560"/>
+            <w:tcBorders>
+              <w:top w:val="single" w:color="CCCCCC" w:sz="1"/>
+              <w:left w:val="single" w:color="CCCCCC" w:sz="1"/>
+              <w:bottom w:val="single" w:color="CCCCCC" w:sz="1"/>
+              <w:right w:val="single" w:color="CCCCCC" w:sz="1"/>
+            </w:tcBorders>
+            <w:tcMar>
+              <w:top w:type="dxa" w:w="60"/>
+              <w:left w:type="dxa" w:w="110"/>
+              <w:bottom w:type="dxa" w:w="60"/>
+              <w:right w:type="dxa" w:w="110"/>
+            </w:tcMar>
+            <w:vAlign w:val="center"/>
+          </w:tcPr>
+          <w:p>
+            <w:pPr>
+              <w:spacing w:after="0"/>
+            </w:pPr>
+            <w:r>
+              <w:rPr>
+                <w:b w:val="false"/>
+                <w:bCs w:val="false"/>
+                <w:sz w:val="20"/>
+                <w:szCs w:val="20"/>
+              </w:rPr>
+              <w:t xml:space="preserve">252 req/s</w:t>
+            </w:r>
+          </w:p>
+        </w:tc>
+        <w:tc>
+          <w:tcPr>
+            <w:tcW w:type="dxa" w:w="1560"/>
+            <w:tcBorders>
+              <w:top w:val="single" w:color="CCCCCC" w:sz="1"/>
+              <w:left w:val="single" w:color="CCCCCC" w:sz="1"/>
+              <w:bottom w:val="single" w:color="CCCCCC" w:sz="1"/>
+              <w:right w:val="single" w:color="CCCCCC" w:sz="1"/>
+            </w:tcBorders>
+            <w:tcMar>
+              <w:top w:type="dxa" w:w="60"/>
+              <w:left w:type="dxa" w:w="110"/>
+              <w:bottom w:type="dxa" w:w="60"/>
+              <w:right w:type="dxa" w:w="110"/>
+            </w:tcMar>
+            <w:vAlign w:val="center"/>
+          </w:tcPr>
+          <w:p>
+            <w:pPr>
+              <w:spacing w:after="0"/>
+            </w:pPr>
+            <w:r>
+              <w:rPr>
+                <w:b w:val="false"/>
+                <w:bCs w:val="false"/>
+                <w:sz w:val="20"/>
+                <w:szCs w:val="20"/>
+              </w:rPr>
+              <w:t xml:space="preserve">76 ms</w:t>
+            </w:r>
+          </w:p>
+        </w:tc>
+        <w:tc>
+          <w:tcPr>
+            <w:tcW w:type="dxa" w:w="1560"/>
+            <w:tcBorders>
+              <w:top w:val="single" w:color="CCCCCC" w:sz="1"/>
+              <w:left w:val="single" w:color="CCCCCC" w:sz="1"/>
+              <w:bottom w:val="single" w:color="CCCCCC" w:sz="1"/>
+              <w:right w:val="single" w:color="CCCCCC" w:sz="1"/>
+            </w:tcBorders>
+            <w:tcMar>
+              <w:top w:type="dxa" w:w="60"/>
+              <w:left w:type="dxa" w:w="110"/>
+              <w:bottom w:type="dxa" w:w="60"/>
+              <w:right w:type="dxa" w:w="110"/>
+            </w:tcMar>
+            <w:vAlign w:val="center"/>
+          </w:tcPr>
+          <w:p>
+            <w:pPr>
+              <w:spacing w:after="0"/>
+            </w:pPr>
+            <w:r>
+              <w:rPr>
+                <w:b w:val="false"/>
+                <w:bCs w:val="false"/>
+                <w:sz w:val="20"/>
+                <w:szCs w:val="20"/>
+              </w:rPr>
+              <w:t xml:space="preserve">733 ms</w:t>
+            </w:r>
+          </w:p>
+        </w:tc>
+        <w:tc>
+          <w:tcPr>
+            <w:tcW w:type="dxa" w:w="1560"/>
+            <w:tcBorders>
+              <w:top w:val="single" w:color="CCCCCC" w:sz="1"/>
+              <w:left w:val="single" w:color="CCCCCC" w:sz="1"/>
+              <w:bottom w:val="single" w:color="CCCCCC" w:sz="1"/>
+              <w:right w:val="single" w:color="CCCCCC" w:sz="1"/>
+            </w:tcBorders>
+            <w:tcMar>
+              <w:top w:type="dxa" w:w="60"/>
+              <w:left w:type="dxa" w:w="110"/>
+              <w:bottom w:type="dxa" w:w="60"/>
+              <w:right w:type="dxa" w:w="110"/>
+            </w:tcMar>
+            <w:vAlign w:val="center"/>
+          </w:tcPr>
+          <w:p>
+            <w:pPr>
+              <w:spacing w:after="0"/>
+            </w:pPr>
+            <w:r>
+              <w:rPr>
+                <w:b w:val="false"/>
+                <w:bCs w:val="false"/>
+                <w:sz w:val="20"/>
+                <w:szCs w:val="20"/>
+              </w:rPr>
+              <w:t xml:space="preserve">1153 ms</w:t>
+            </w:r>
+          </w:p>
+        </w:tc>
+        <w:tc>
+          <w:tcPr>
+            <w:tcW w:type="dxa" w:w="1560"/>
+            <w:tcBorders>
+              <w:top w:val="single" w:color="CCCCCC" w:sz="1"/>
+              <w:left w:val="single" w:color="CCCCCC" w:sz="1"/>
+              <w:bottom w:val="single" w:color="CCCCCC" w:sz="1"/>
+              <w:right w:val="single" w:color="CCCCCC" w:sz="1"/>
+            </w:tcBorders>
+            <w:tcMar>
+              <w:top w:type="dxa" w:w="60"/>
+              <w:left w:type="dxa" w:w="110"/>
+              <w:bottom w:type="dxa" w:w="60"/>
+              <w:right w:type="dxa" w:w="110"/>
+            </w:tcMar>
+            <w:vAlign w:val="center"/>
+          </w:tcPr>
+          <w:p>
+            <w:pPr>
+              <w:spacing w:after="0"/>
+            </w:pPr>
+            <w:r>
+              <w:rPr>
+                <w:b w:val="false"/>
+                <w:bCs w:val="false"/>
+                <w:sz w:val="20"/>
+                <w:szCs w:val="20"/>
+              </w:rPr>
+              <w:t xml:space="preserve">0.07%</w:t>
+            </w:r>
+          </w:p>
+        </w:tc>
+      </w:tr>
+      <w:tr>
+        <w:trPr>
+          <w:tblHeader w:val="false"/>
+        </w:trPr>
+        <w:tc>
+          <w:tcPr>
+            <w:tcW w:type="dxa" w:w="1560"/>
+            <w:tcBorders>
+              <w:top w:val="single" w:color="CCCCCC" w:sz="1"/>
+              <w:left w:val="single" w:color="CCCCCC" w:sz="1"/>
+              <w:bottom w:val="single" w:color="CCCCCC" w:sz="1"/>
+              <w:right w:val="single" w:color="CCCCCC" w:sz="1"/>
+            </w:tcBorders>
+            <w:tcMar>
+              <w:top w:type="dxa" w:w="60"/>
+              <w:left w:type="dxa" w:w="110"/>
+              <w:bottom w:type="dxa" w:w="60"/>
+              <w:right w:type="dxa" w:w="110"/>
+            </w:tcMar>
+            <w:vAlign w:val="center"/>
+          </w:tcPr>
+          <w:p>
+            <w:pPr>
+              <w:spacing w:after="0"/>
+            </w:pPr>
+            <w:r>
+              <w:rPr>
+                <w:b w:val="false"/>
+                <w:bCs w:val="false"/>
+                <w:sz w:val="20"/>
+                <w:szCs w:val="20"/>
+              </w:rPr>
+              <w:t xml:space="preserve">200</w:t>
+            </w:r>
+          </w:p>
+        </w:tc>
+        <w:tc>
+          <w:tcPr>
+            <w:tcW w:type="dxa" w:w="1560"/>
+            <w:tcBorders>
+              <w:top w:val="single" w:color="CCCCCC" w:sz="1"/>
+              <w:left w:val="single" w:color="CCCCCC" w:sz="1"/>
+              <w:bottom w:val="single" w:color="CCCCCC" w:sz="1"/>
+              <w:right w:val="single" w:color="CCCCCC" w:sz="1"/>
+            </w:tcBorders>
+            <w:tcMar>
+              <w:top w:type="dxa" w:w="60"/>
+              <w:left w:type="dxa" w:w="110"/>
+              <w:bottom w:type="dxa" w:w="60"/>
+              <w:right w:type="dxa" w:w="110"/>
+            </w:tcMar>
+            <w:vAlign w:val="center"/>
+          </w:tcPr>
+          <w:p>
+            <w:pPr>
+              <w:spacing w:after="0"/>
+            </w:pPr>
+            <w:r>
+              <w:rPr>
+                <w:b w:val="false"/>
+                <w:bCs w:val="false"/>
+                <w:sz w:val="20"/>
+                <w:szCs w:val="20"/>
+              </w:rPr>
+              <w:t xml:space="preserve">90 req/s</w:t>
+            </w:r>
+          </w:p>
+        </w:tc>
+        <w:tc>
+          <w:tcPr>
+            <w:tcW w:type="dxa" w:w="1560"/>
+            <w:tcBorders>
+              <w:top w:val="single" w:color="CCCCCC" w:sz="1"/>
+              <w:left w:val="single" w:color="CCCCCC" w:sz="1"/>
+              <w:bottom w:val="single" w:color="CCCCCC" w:sz="1"/>
+              <w:right w:val="single" w:color="CCCCCC" w:sz="1"/>
+            </w:tcBorders>
+            <w:tcMar>
+              <w:top w:type="dxa" w:w="60"/>
+              <w:left w:type="dxa" w:w="110"/>
+              <w:bottom w:type="dxa" w:w="60"/>
+              <w:right w:type="dxa" w:w="110"/>
+            </w:tcMar>
+            <w:vAlign w:val="center"/>
+          </w:tcPr>
+          <w:p>
+            <w:pPr>
+              <w:spacing w:after="0"/>
+            </w:pPr>
+            <w:r>
+              <w:rPr>
+                <w:b w:val="false"/>
+                <w:bCs w:val="false"/>
+                <w:sz w:val="20"/>
+                <w:szCs w:val="20"/>
+              </w:rPr>
+              <w:t xml:space="preserve">1673 ms</w:t>
+            </w:r>
+          </w:p>
+        </w:tc>
+        <w:tc>
+          <w:tcPr>
+            <w:tcW w:type="dxa" w:w="1560"/>
+            <w:tcBorders>
+              <w:top w:val="single" w:color="CCCCCC" w:sz="1"/>
+              <w:left w:val="single" w:color="CCCCCC" w:sz="1"/>
+              <w:bottom w:val="single" w:color="CCCCCC" w:sz="1"/>
+              <w:right w:val="single" w:color="CCCCCC" w:sz="1"/>
+            </w:tcBorders>
+            <w:tcMar>
+              <w:top w:type="dxa" w:w="60"/>
+              <w:left w:type="dxa" w:w="110"/>
+              <w:bottom w:type="dxa" w:w="60"/>
+              <w:right w:type="dxa" w:w="110"/>
+            </w:tcMar>
+            <w:vAlign w:val="center"/>
+          </w:tcPr>
+          <w:p>
+            <w:pPr>
+              <w:spacing w:after="0"/>
+            </w:pPr>
+            <w:r>
+              <w:rPr>
+                <w:b w:val="false"/>
+                <w:bCs w:val="false"/>
+                <w:sz w:val="20"/>
+                <w:szCs w:val="20"/>
+              </w:rPr>
+              <w:t xml:space="preserve">5879 ms</w:t>
+            </w:r>
+          </w:p>
+        </w:tc>
+        <w:tc>
+          <w:tcPr>
+            <w:tcW w:type="dxa" w:w="1560"/>
+            <w:tcBorders>
+              <w:top w:val="single" w:color="CCCCCC" w:sz="1"/>
+              <w:left w:val="single" w:color="CCCCCC" w:sz="1"/>
+              <w:bottom w:val="single" w:color="CCCCCC" w:sz="1"/>
+              <w:right w:val="single" w:color="CCCCCC" w:sz="1"/>
+            </w:tcBorders>
+            <w:tcMar>
+              <w:top w:type="dxa" w:w="60"/>
+              <w:left w:type="dxa" w:w="110"/>
+              <w:bottom w:type="dxa" w:w="60"/>
+              <w:right w:type="dxa" w:w="110"/>
+            </w:tcMar>
+            <w:vAlign w:val="center"/>
+          </w:tcPr>
+          <w:p>
+            <w:pPr>
+              <w:spacing w:after="0"/>
+            </w:pPr>
+            <w:r>
+              <w:rPr>
+                <w:b w:val="false"/>
+                <w:bCs w:val="false"/>
+                <w:sz w:val="20"/>
+                <w:szCs w:val="20"/>
+              </w:rPr>
+              <w:t xml:space="preserve">6547 ms</w:t>
+            </w:r>
+          </w:p>
+        </w:tc>
+        <w:tc>
+          <w:tcPr>
+            <w:tcW w:type="dxa" w:w="1560"/>
+            <w:tcBorders>
+              <w:top w:val="single" w:color="CCCCCC" w:sz="1"/>
+              <w:left w:val="single" w:color="CCCCCC" w:sz="1"/>
+              <w:bottom w:val="single" w:color="CCCCCC" w:sz="1"/>
+              <w:right w:val="single" w:color="CCCCCC" w:sz="1"/>
+            </w:tcBorders>
+            <w:tcMar>
+              <w:top w:type="dxa" w:w="60"/>
+              <w:left w:type="dxa" w:w="110"/>
+              <w:bottom w:type="dxa" w:w="60"/>
+              <w:right w:type="dxa" w:w="110"/>
+            </w:tcMar>
+            <w:vAlign w:val="center"/>
+          </w:tcPr>
+          <w:p>
+            <w:pPr>
+              <w:spacing w:after="0"/>
+            </w:pPr>
+            <w:r>
+              <w:rPr>
+                <w:b w:val="false"/>
+                <w:bCs w:val="false"/>
+                <w:sz w:val="20"/>
+                <w:szCs w:val="20"/>
+              </w:rPr>
+              <w:t xml:space="preserve">0.55%</w:t>
+            </w:r>
+          </w:p>
+        </w:tc>
+      </w:tr>
+    </w:tbl>
+    <w:p>
+      <w:pPr>
+        <w:spacing w:after="120"/>
+      </w:pPr>
+      <w:r>
+        <w:rPr>
+          <w:b/>
+          <w:bCs/>
+        </w:rPr>
+        <w:t xml:space="preserve">Key finding: from 50 to 200 concurrent connections the single instance’s throughput fell (252 → 90 req/s) while latency rose roughly 20×. The t3.small is already saturating at 200 concurrent connections even on a trivial endpoint — direct evidence of EC2’s single-instance scaling limit.</w:t>
+      </w:r>
+    </w:p>
+    <w:p>
+      <w:pPr>
+        <w:pStyle w:val="Heading2"/>
+      </w:pPr>
+      <w:r>
+        <w:t xml:space="preserve">5.3 Modelled behaviour at 50 / 200 / 1000 users</w:t>
+      </w:r>
+    </w:p>
+    <w:p>
+      <w:pPr>
+        <w:spacing w:after="120"/>
+      </w:pPr>
+      <w:r>
+        <w:t xml:space="preserve">Assuming ~17 s per request and a new request roughly every 20 s per user, demand ≈ users / 20 req/s. One t3.small serves the async workload at ~40 in-flight requests, a ceiling of ≈ 2.4 req/s.</w:t>
+      </w:r>
+    </w:p>
+    <w:tbl>
+      <w:tblPr>
+        <w:tblW w:type="dxa" w:w="9360"/>
+        <w:tblBorders>
+          <w:top w:val="single" w:color="auto" w:sz="4"/>
+          <w:left w:val="single" w:color="auto" w:sz="4"/>
+          <w:bottom w:val="single" w:color="auto" w:sz="4"/>
+          <w:right w:val="single" w:color="auto" w:sz="4"/>
+          <w:insideH w:val="single" w:color="auto" w:sz="4"/>
+          <w:insideV w:val="single" w:color="auto" w:sz="4"/>
+        </w:tblBorders>
+      </w:tblPr>
+      <w:tblGrid>
+        <w:gridCol w:w="1300"/>
+        <w:gridCol w:w="1500"/>
+        <w:gridCol w:w="3280"/>
+        <w:gridCol w:w="3280"/>
+      </w:tblGrid>
+      <w:tr>
+        <w:trPr>
+          <w:tblHeader/>
+        </w:trPr>
+        <w:tc>
+          <w:tcPr>
+            <w:tcW w:type="dxa" w:w="1300"/>
+            <w:tcBorders>
+              <w:top w:val="single" w:color="CCCCCC" w:sz="1"/>
+              <w:left w:val="single" w:color="CCCCCC" w:sz="1"/>
+              <w:bottom w:val="single" w:color="CCCCCC" w:sz="1"/>
+              <w:right w:val="single" w:color="CCCCCC" w:sz="1"/>
+            </w:tcBorders>
+            <w:shd w:fill="D5E8F0" w:val="clear"/>
+            <w:tcMar>
+              <w:top w:type="dxa" w:w="60"/>
+              <w:left w:type="dxa" w:w="110"/>
+              <w:bottom w:type="dxa" w:w="60"/>
+              <w:right w:type="dxa" w:w="110"/>
+            </w:tcMar>
+            <w:vAlign w:val="center"/>
+          </w:tcPr>
+          <w:p>
+            <w:pPr>
+              <w:spacing w:after="0"/>
+            </w:pPr>
+            <w:r>
+              <w:rPr>
+                <w:b/>
+                <w:bCs/>
+                <w:color w:val="0F172A"/>
+                <w:sz w:val="20"/>
+                <w:szCs w:val="20"/>
+              </w:rPr>
+              <w:t xml:space="preserve">Users</w:t>
+            </w:r>
+          </w:p>
+        </w:tc>
+        <w:tc>
+          <w:tcPr>
+            <w:tcW w:type="dxa" w:w="1500"/>
+            <w:tcBorders>
+              <w:top w:val="single" w:color="CCCCCC" w:sz="1"/>
+              <w:left w:val="single" w:color="CCCCCC" w:sz="1"/>
+              <w:bottom w:val="single" w:color="CCCCCC" w:sz="1"/>
+              <w:right w:val="single" w:color="CCCCCC" w:sz="1"/>
+            </w:tcBorders>
+            <w:shd w:fill="D5E8F0" w:val="clear"/>
+            <w:tcMar>
+              <w:top w:type="dxa" w:w="60"/>
+              <w:left w:type="dxa" w:w="110"/>
+              <w:bottom w:type="dxa" w:w="60"/>
+              <w:right w:type="dxa" w:w="110"/>
+            </w:tcMar>
+            <w:vAlign w:val="center"/>
+          </w:tcPr>
+          <w:p>
+            <w:pPr>
+              <w:spacing w:after="0"/>
+            </w:pPr>
+            <w:r>
+              <w:rPr>
+                <w:b/>
+                <w:bCs/>
+                <w:color w:val="0F172A"/>
+                <w:sz w:val="20"/>
+                <w:szCs w:val="20"/>
+              </w:rPr>
+              <w:t xml:space="preserve">Demand</w:t>
+            </w:r>
+          </w:p>
+        </w:tc>
+        <w:tc>
+          <w:tcPr>
+            <w:tcW w:type="dxa" w:w="3280"/>
+            <w:tcBorders>
+              <w:top w:val="single" w:color="CCCCCC" w:sz="1"/>
+              <w:left w:val="single" w:color="CCCCCC" w:sz="1"/>
+              <w:bottom w:val="single" w:color="CCCCCC" w:sz="1"/>
+              <w:right w:val="single" w:color="CCCCCC" w:sz="1"/>
+            </w:tcBorders>
+            <w:shd w:fill="D5E8F0" w:val="clear"/>
+            <w:tcMar>
+              <w:top w:type="dxa" w:w="60"/>
+              <w:left w:type="dxa" w:w="110"/>
+              <w:bottom w:type="dxa" w:w="60"/>
+              <w:right w:type="dxa" w:w="110"/>
+            </w:tcMar>
+            <w:vAlign w:val="center"/>
+          </w:tcPr>
+          <w:p>
+            <w:pPr>
+              <w:spacing w:after="0"/>
+            </w:pPr>
+            <w:r>
+              <w:rPr>
+                <w:b/>
+                <w:bCs/>
+                <w:color w:val="0F172A"/>
+                <w:sz w:val="20"/>
+                <w:szCs w:val="20"/>
+              </w:rPr>
+              <w:t xml:space="preserve">EC2 t3.small (1 instance)</w:t>
+            </w:r>
+          </w:p>
+        </w:tc>
+        <w:tc>
+          <w:tcPr>
+            <w:tcW w:type="dxa" w:w="3280"/>
+            <w:tcBorders>
+              <w:top w:val="single" w:color="CCCCCC" w:sz="1"/>
+              <w:left w:val="single" w:color="CCCCCC" w:sz="1"/>
+              <w:bottom w:val="single" w:color="CCCCCC" w:sz="1"/>
+              <w:right w:val="single" w:color="CCCCCC" w:sz="1"/>
+            </w:tcBorders>
+            <w:shd w:fill="D5E8F0" w:val="clear"/>
+            <w:tcMar>
+              <w:top w:type="dxa" w:w="60"/>
+              <w:left w:type="dxa" w:w="110"/>
+              <w:bottom w:type="dxa" w:w="60"/>
+              <w:right w:type="dxa" w:w="110"/>
+            </w:tcMar>
+            <w:vAlign w:val="center"/>
+          </w:tcPr>
+          <w:p>
+            <w:pPr>
+              <w:spacing w:after="0"/>
+            </w:pPr>
+            <w:r>
+              <w:rPr>
+                <w:b/>
+                <w:bCs/>
+                <w:color w:val="0F172A"/>
+                <w:sz w:val="20"/>
+                <w:szCs w:val="20"/>
+              </w:rPr>
+              <w:t xml:space="preserve">Lambda (auto-scale)</w:t>
+            </w:r>
+          </w:p>
+        </w:tc>
+      </w:tr>
+      <w:tr>
+        <w:trPr>
+          <w:tblHeader w:val="false"/>
+        </w:trPr>
+        <w:tc>
+          <w:tcPr>
+            <w:tcW w:type="dxa" w:w="1300"/>
+            <w:tcBorders>
+              <w:top w:val="single" w:color="CCCCCC" w:sz="1"/>
+              <w:left w:val="single" w:color="CCCCCC" w:sz="1"/>
+              <w:bottom w:val="single" w:color="CCCCCC" w:sz="1"/>
+              <w:right w:val="single" w:color="CCCCCC" w:sz="1"/>
+            </w:tcBorders>
+            <w:tcMar>
+              <w:top w:type="dxa" w:w="60"/>
+              <w:left w:type="dxa" w:w="110"/>
+              <w:bottom w:type="dxa" w:w="60"/>
+              <w:right w:type="dxa" w:w="110"/>
+            </w:tcMar>
+            <w:vAlign w:val="center"/>
+          </w:tcPr>
+          <w:p>
+            <w:pPr>
+              <w:spacing w:after="0"/>
+            </w:pPr>
+            <w:r>
+              <w:rPr>
+                <w:b w:val="false"/>
+                <w:bCs w:val="false"/>
+                <w:sz w:val="20"/>
+                <w:szCs w:val="20"/>
+              </w:rPr>
+              <w:t xml:space="preserve">50</w:t>
+            </w:r>
+          </w:p>
+        </w:tc>
+        <w:tc>
+          <w:tcPr>
+            <w:tcW w:type="dxa" w:w="1500"/>
+            <w:tcBorders>
+              <w:top w:val="single" w:color="CCCCCC" w:sz="1"/>
+              <w:left w:val="single" w:color="CCCCCC" w:sz="1"/>
+              <w:bottom w:val="single" w:color="CCCCCC" w:sz="1"/>
+              <w:right w:val="single" w:color="CCCCCC" w:sz="1"/>
+            </w:tcBorders>
+            <w:tcMar>
+              <w:top w:type="dxa" w:w="60"/>
+              <w:left w:type="dxa" w:w="110"/>
+              <w:bottom w:type="dxa" w:w="60"/>
+              <w:right w:type="dxa" w:w="110"/>
+            </w:tcMar>
+            <w:vAlign w:val="center"/>
+          </w:tcPr>
+          <w:p>
+            <w:pPr>
+              <w:spacing w:after="0"/>
+            </w:pPr>
+            <w:r>
+              <w:rPr>
+                <w:b w:val="false"/>
+                <w:bCs w:val="false"/>
+                <w:sz w:val="20"/>
+                <w:szCs w:val="20"/>
+              </w:rPr>
+              <w:t xml:space="preserve">~2.5 req/s</w:t>
+            </w:r>
+          </w:p>
+        </w:tc>
+        <w:tc>
+          <w:tcPr>
+            <w:tcW w:type="dxa" w:w="3280"/>
+            <w:tcBorders>
+              <w:top w:val="single" w:color="CCCCCC" w:sz="1"/>
+              <w:left w:val="single" w:color="CCCCCC" w:sz="1"/>
+              <w:bottom w:val="single" w:color="CCCCCC" w:sz="1"/>
+              <w:right w:val="single" w:color="CCCCCC" w:sz="1"/>
+            </w:tcBorders>
+            <w:tcMar>
+              <w:top w:type="dxa" w:w="60"/>
+              <w:left w:type="dxa" w:w="110"/>
+              <w:bottom w:type="dxa" w:w="60"/>
+              <w:right w:type="dxa" w:w="110"/>
+            </w:tcMar>
+            <w:vAlign w:val="center"/>
+          </w:tcPr>
+          <w:p>
+            <w:pPr>
+              <w:spacing w:after="0"/>
+            </w:pPr>
+            <w:r>
+              <w:rPr>
+                <w:b w:val="false"/>
+                <w:bCs w:val="false"/>
+                <w:sz w:val="20"/>
+                <w:szCs w:val="20"/>
+              </w:rPr>
+              <w:t xml:space="preserve">At capacity; minor queueing; p95 rises</w:t>
+            </w:r>
+          </w:p>
+        </w:tc>
+        <w:tc>
+          <w:tcPr>
+            <w:tcW w:type="dxa" w:w="3280"/>
+            <w:tcBorders>
+              <w:top w:val="single" w:color="CCCCCC" w:sz="1"/>
+              <w:left w:val="single" w:color="CCCCCC" w:sz="1"/>
+              <w:bottom w:val="single" w:color="CCCCCC" w:sz="1"/>
+              <w:right w:val="single" w:color="CCCCCC" w:sz="1"/>
+            </w:tcBorders>
+            <w:tcMar>
+              <w:top w:type="dxa" w:w="60"/>
+              <w:left w:type="dxa" w:w="110"/>
+              <w:bottom w:type="dxa" w:w="60"/>
+              <w:right w:type="dxa" w:w="110"/>
+            </w:tcMar>
+            <w:vAlign w:val="center"/>
+          </w:tcPr>
+          <w:p>
+            <w:pPr>
+              <w:spacing w:after="0"/>
+            </w:pPr>
+            <w:r>
+              <w:rPr>
+                <w:b w:val="false"/>
+                <w:bCs w:val="false"/>
+                <w:sz w:val="20"/>
+                <w:szCs w:val="20"/>
+              </w:rPr>
+              <w:t xml:space="preserve">~50 concurrent; fine; some cold starts on ramp</w:t>
+            </w:r>
+          </w:p>
+        </w:tc>
+      </w:tr>
+      <w:tr>
+        <w:trPr>
+          <w:tblHeader w:val="false"/>
+        </w:trPr>
+        <w:tc>
+          <w:tcPr>
+            <w:tcW w:type="dxa" w:w="1300"/>
+            <w:tcBorders>
+              <w:top w:val="single" w:color="CCCCCC" w:sz="1"/>
+              <w:left w:val="single" w:color="CCCCCC" w:sz="1"/>
+              <w:bottom w:val="single" w:color="CCCCCC" w:sz="1"/>
+              <w:right w:val="single" w:color="CCCCCC" w:sz="1"/>
+            </w:tcBorders>
+            <w:tcMar>
+              <w:top w:type="dxa" w:w="60"/>
+              <w:left w:type="dxa" w:w="110"/>
+              <w:bottom w:type="dxa" w:w="60"/>
+              <w:right w:type="dxa" w:w="110"/>
+            </w:tcMar>
+            <w:vAlign w:val="center"/>
+          </w:tcPr>
+          <w:p>
+            <w:pPr>
+              <w:spacing w:after="0"/>
+            </w:pPr>
+            <w:r>
+              <w:rPr>
+                <w:b w:val="false"/>
+                <w:bCs w:val="false"/>
+                <w:sz w:val="20"/>
+                <w:szCs w:val="20"/>
+              </w:rPr>
+              <w:t xml:space="preserve">200</w:t>
+            </w:r>
+          </w:p>
+        </w:tc>
+        <w:tc>
+          <w:tcPr>
+            <w:tcW w:type="dxa" w:w="1500"/>
+            <w:tcBorders>
+              <w:top w:val="single" w:color="CCCCCC" w:sz="1"/>
+              <w:left w:val="single" w:color="CCCCCC" w:sz="1"/>
+              <w:bottom w:val="single" w:color="CCCCCC" w:sz="1"/>
+              <w:right w:val="single" w:color="CCCCCC" w:sz="1"/>
+            </w:tcBorders>
+            <w:tcMar>
+              <w:top w:type="dxa" w:w="60"/>
+              <w:left w:type="dxa" w:w="110"/>
+              <w:bottom w:type="dxa" w:w="60"/>
+              <w:right w:type="dxa" w:w="110"/>
+            </w:tcMar>
+            <w:vAlign w:val="center"/>
+          </w:tcPr>
+          <w:p>
+            <w:pPr>
+              <w:spacing w:after="0"/>
+            </w:pPr>
+            <w:r>
+              <w:rPr>
+                <w:b w:val="false"/>
+                <w:bCs w:val="false"/>
+                <w:sz w:val="20"/>
+                <w:szCs w:val="20"/>
+              </w:rPr>
+              <w:t xml:space="preserve">~10 req/s</w:t>
+            </w:r>
+          </w:p>
+        </w:tc>
+        <w:tc>
+          <w:tcPr>
+            <w:tcW w:type="dxa" w:w="3280"/>
+            <w:tcBorders>
+              <w:top w:val="single" w:color="CCCCCC" w:sz="1"/>
+              <w:left w:val="single" w:color="CCCCCC" w:sz="1"/>
+              <w:bottom w:val="single" w:color="CCCCCC" w:sz="1"/>
+              <w:right w:val="single" w:color="CCCCCC" w:sz="1"/>
+            </w:tcBorders>
+            <w:tcMar>
+              <w:top w:type="dxa" w:w="60"/>
+              <w:left w:type="dxa" w:w="110"/>
+              <w:bottom w:type="dxa" w:w="60"/>
+              <w:right w:type="dxa" w:w="110"/>
+            </w:tcMar>
+            <w:vAlign w:val="center"/>
+          </w:tcPr>
+          <w:p>
+            <w:pPr>
+              <w:spacing w:after="0"/>
+            </w:pPr>
+            <w:r>
+              <w:rPr>
+                <w:b w:val="false"/>
+                <w:bCs w:val="false"/>
+                <w:sz w:val="20"/>
+                <w:szCs w:val="20"/>
+              </w:rPr>
+              <w:t xml:space="preserve">4× over capacity → queue blow-up, timeouts, errors</w:t>
+            </w:r>
+          </w:p>
+        </w:tc>
+        <w:tc>
+          <w:tcPr>
+            <w:tcW w:type="dxa" w:w="3280"/>
+            <w:tcBorders>
+              <w:top w:val="single" w:color="CCCCCC" w:sz="1"/>
+              <w:left w:val="single" w:color="CCCCCC" w:sz="1"/>
+              <w:bottom w:val="single" w:color="CCCCCC" w:sz="1"/>
+              <w:right w:val="single" w:color="CCCCCC" w:sz="1"/>
+            </w:tcBorders>
+            <w:tcMar>
+              <w:top w:type="dxa" w:w="60"/>
+              <w:left w:type="dxa" w:w="110"/>
+              <w:bottom w:type="dxa" w:w="60"/>
+              <w:right w:type="dxa" w:w="110"/>
+            </w:tcMar>
+            <w:vAlign w:val="center"/>
+          </w:tcPr>
+          <w:p>
+            <w:pPr>
+              <w:spacing w:after="0"/>
+            </w:pPr>
+            <w:r>
+              <w:rPr>
+                <w:b w:val="false"/>
+                <w:bCs w:val="false"/>
+                <w:sz w:val="20"/>
+                <w:szCs w:val="20"/>
+              </w:rPr>
+              <w:t xml:space="preserve">~200 concurrent; fine if account limit ≥200; Bedrock RPM may begin to throttle</w:t>
+            </w:r>
+          </w:p>
+        </w:tc>
+      </w:tr>
+      <w:tr>
+        <w:trPr>
+          <w:tblHeader w:val="false"/>
+        </w:trPr>
+        <w:tc>
+          <w:tcPr>
+            <w:tcW w:type="dxa" w:w="1300"/>
+            <w:tcBorders>
+              <w:top w:val="single" w:color="CCCCCC" w:sz="1"/>
+              <w:left w:val="single" w:color="CCCCCC" w:sz="1"/>
+              <w:bottom w:val="single" w:color="CCCCCC" w:sz="1"/>
+              <w:right w:val="single" w:color="CCCCCC" w:sz="1"/>
+            </w:tcBorders>
+            <w:tcMar>
+              <w:top w:type="dxa" w:w="60"/>
+              <w:left w:type="dxa" w:w="110"/>
+              <w:bottom w:type="dxa" w:w="60"/>
+              <w:right w:type="dxa" w:w="110"/>
+            </w:tcMar>
+            <w:vAlign w:val="center"/>
+          </w:tcPr>
+          <w:p>
+            <w:pPr>
+              <w:spacing w:after="0"/>
+            </w:pPr>
+            <w:r>
+              <w:rPr>
+                <w:b w:val="false"/>
+                <w:bCs w:val="false"/>
+                <w:sz w:val="20"/>
+                <w:szCs w:val="20"/>
+              </w:rPr>
+              <w:t xml:space="preserve">1000</w:t>
+            </w:r>
+          </w:p>
+        </w:tc>
+        <w:tc>
+          <w:tcPr>
+            <w:tcW w:type="dxa" w:w="1500"/>
+            <w:tcBorders>
+              <w:top w:val="single" w:color="CCCCCC" w:sz="1"/>
+              <w:left w:val="single" w:color="CCCCCC" w:sz="1"/>
+              <w:bottom w:val="single" w:color="CCCCCC" w:sz="1"/>
+              <w:right w:val="single" w:color="CCCCCC" w:sz="1"/>
+            </w:tcBorders>
+            <w:tcMar>
+              <w:top w:type="dxa" w:w="60"/>
+              <w:left w:type="dxa" w:w="110"/>
+              <w:bottom w:type="dxa" w:w="60"/>
+              <w:right w:type="dxa" w:w="110"/>
+            </w:tcMar>
+            <w:vAlign w:val="center"/>
+          </w:tcPr>
+          <w:p>
+            <w:pPr>
+              <w:spacing w:after="0"/>
+            </w:pPr>
+            <w:r>
+              <w:rPr>
+                <w:b w:val="false"/>
+                <w:bCs w:val="false"/>
+                <w:sz w:val="20"/>
+                <w:szCs w:val="20"/>
+              </w:rPr>
+              <w:t xml:space="preserve">~50 req/s</w:t>
+            </w:r>
+          </w:p>
+        </w:tc>
+        <w:tc>
+          <w:tcPr>
+            <w:tcW w:type="dxa" w:w="3280"/>
+            <w:tcBorders>
+              <w:top w:val="single" w:color="CCCCCC" w:sz="1"/>
+              <w:left w:val="single" w:color="CCCCCC" w:sz="1"/>
+              <w:bottom w:val="single" w:color="CCCCCC" w:sz="1"/>
+              <w:right w:val="single" w:color="CCCCCC" w:sz="1"/>
+            </w:tcBorders>
+            <w:tcMar>
+              <w:top w:type="dxa" w:w="60"/>
+              <w:left w:type="dxa" w:w="110"/>
+              <w:bottom w:type="dxa" w:w="60"/>
+              <w:right w:type="dxa" w:w="110"/>
+            </w:tcMar>
+            <w:vAlign w:val="center"/>
+          </w:tcPr>
+          <w:p>
+            <w:pPr>
+              <w:spacing w:after="0"/>
+            </w:pPr>
+            <w:r>
+              <w:rPr>
+                <w:b w:val="false"/>
+                <w:bCs w:val="false"/>
+                <w:sz w:val="20"/>
+                <w:szCs w:val="20"/>
+              </w:rPr>
+              <w:t xml:space="preserve">~20× over → fails; needs ~21 instances + load balancer</w:t>
+            </w:r>
+          </w:p>
+        </w:tc>
+        <w:tc>
+          <w:tcPr>
+            <w:tcW w:type="dxa" w:w="3280"/>
+            <w:tcBorders>
+              <w:top w:val="single" w:color="CCCCCC" w:sz="1"/>
+              <w:left w:val="single" w:color="CCCCCC" w:sz="1"/>
+              <w:bottom w:val="single" w:color="CCCCCC" w:sz="1"/>
+              <w:right w:val="single" w:color="CCCCCC" w:sz="1"/>
+            </w:tcBorders>
+            <w:tcMar>
+              <w:top w:type="dxa" w:w="60"/>
+              <w:left w:type="dxa" w:w="110"/>
+              <w:bottom w:type="dxa" w:w="60"/>
+              <w:right w:type="dxa" w:w="110"/>
+            </w:tcMar>
+            <w:vAlign w:val="center"/>
+          </w:tcPr>
+          <w:p>
+            <w:pPr>
+              <w:spacing w:after="0"/>
+            </w:pPr>
+            <w:r>
+              <w:rPr>
+                <w:b w:val="false"/>
+                <w:bCs w:val="false"/>
+                <w:sz w:val="20"/>
+                <w:szCs w:val="20"/>
+              </w:rPr>
+              <w:t xml:space="preserve">~1000 concurrent (at default limit); Bedrock per-minute quota becomes the shared bottleneck</w:t>
+            </w:r>
+          </w:p>
+        </w:tc>
+      </w:tr>
+    </w:tbl>
+    <w:p>
+      <w:pPr>
+        <w:pStyle w:val="Heading2"/>
+      </w:pPr>
+      <w:r>
+        <w:t xml:space="preserve">5.4 Reliability</w:t>
+      </w:r>
+    </w:p>
+    <w:tbl>
+      <w:tblPr>
+        <w:tblW w:type="dxa" w:w="9360"/>
+        <w:tblBorders>
+          <w:top w:val="single" w:color="auto" w:sz="4"/>
+          <w:left w:val="single" w:color="auto" w:sz="4"/>
+          <w:bottom w:val="single" w:color="auto" w:sz="4"/>
+          <w:right w:val="single" w:color="auto" w:sz="4"/>
+          <w:insideH w:val="single" w:color="auto" w:sz="4"/>
+          <w:insideV w:val="single" w:color="auto" w:sz="4"/>
+        </w:tblBorders>
+      </w:tblPr>
+      <w:tblGrid>
+        <w:gridCol w:w="3120"/>
+        <w:gridCol w:w="3120"/>
+        <w:gridCol w:w="3120"/>
+      </w:tblGrid>
+      <w:tr>
+        <w:trPr>
+          <w:tblHeader/>
+        </w:trPr>
+        <w:tc>
+          <w:tcPr>
+            <w:tcW w:type="dxa" w:w="3120"/>
+            <w:tcBorders>
+              <w:top w:val="single" w:color="CCCCCC" w:sz="1"/>
+              <w:left w:val="single" w:color="CCCCCC" w:sz="1"/>
+              <w:bottom w:val="single" w:color="CCCCCC" w:sz="1"/>
+              <w:right w:val="single" w:color="CCCCCC" w:sz="1"/>
+            </w:tcBorders>
+            <w:shd w:fill="D5E8F0" w:val="clear"/>
+            <w:tcMar>
+              <w:top w:type="dxa" w:w="60"/>
+              <w:left w:type="dxa" w:w="110"/>
+              <w:bottom w:type="dxa" w:w="60"/>
+              <w:right w:type="dxa" w:w="110"/>
+            </w:tcMar>
+            <w:vAlign w:val="center"/>
+          </w:tcPr>
+          <w:p>
+            <w:pPr>
+              <w:spacing w:after="0"/>
+            </w:pPr>
+            <w:r>
+              <w:rPr>
+                <w:b/>
+                <w:bCs/>
+                <w:color w:val="0F172A"/>
+                <w:sz w:val="20"/>
+                <w:szCs w:val="20"/>
+              </w:rPr>
+              <w:t xml:space="preserve">Aspect</w:t>
+            </w:r>
+          </w:p>
+        </w:tc>
+        <w:tc>
+          <w:tcPr>
+            <w:tcW w:type="dxa" w:w="3120"/>
+            <w:tcBorders>
+              <w:top w:val="single" w:color="CCCCCC" w:sz="1"/>
+              <w:left w:val="single" w:color="CCCCCC" w:sz="1"/>
+              <w:bottom w:val="single" w:color="CCCCCC" w:sz="1"/>
+              <w:right w:val="single" w:color="CCCCCC" w:sz="1"/>
+            </w:tcBorders>
+            <w:shd w:fill="D5E8F0" w:val="clear"/>
+            <w:tcMar>
+              <w:top w:type="dxa" w:w="60"/>
+              <w:left w:type="dxa" w:w="110"/>
+              <w:bottom w:type="dxa" w:w="60"/>
+              <w:right w:type="dxa" w:w="110"/>
+            </w:tcMar>
+            <w:vAlign w:val="center"/>
+          </w:tcPr>
+          <w:p>
+            <w:pPr>
+              <w:spacing w:after="0"/>
+            </w:pPr>
+            <w:r>
+              <w:rPr>
+                <w:b/>
+                <w:bCs/>
+                <w:color w:val="0F172A"/>
+                <w:sz w:val="20"/>
+                <w:szCs w:val="20"/>
+              </w:rPr>
+              <w:t xml:space="preserve">EC2 (single instance)</w:t>
+            </w:r>
+          </w:p>
+        </w:tc>
+        <w:tc>
+          <w:tcPr>
+            <w:tcW w:type="dxa" w:w="3120"/>
+            <w:tcBorders>
+              <w:top w:val="single" w:color="CCCCCC" w:sz="1"/>
+              <w:left w:val="single" w:color="CCCCCC" w:sz="1"/>
+              <w:bottom w:val="single" w:color="CCCCCC" w:sz="1"/>
+              <w:right w:val="single" w:color="CCCCCC" w:sz="1"/>
+            </w:tcBorders>
+            <w:shd w:fill="D5E8F0" w:val="clear"/>
+            <w:tcMar>
+              <w:top w:type="dxa" w:w="60"/>
+              <w:left w:type="dxa" w:w="110"/>
+              <w:bottom w:type="dxa" w:w="60"/>
+              <w:right w:type="dxa" w:w="110"/>
+            </w:tcMar>
+            <w:vAlign w:val="center"/>
+          </w:tcPr>
+          <w:p>
+            <w:pPr>
+              <w:spacing w:after="0"/>
+            </w:pPr>
+            <w:r>
+              <w:rPr>
+                <w:b/>
+                <w:bCs/>
+                <w:color w:val="0F172A"/>
+                <w:sz w:val="20"/>
+                <w:szCs w:val="20"/>
+              </w:rPr>
+              <w:t xml:space="preserve">Lambda</w:t>
+            </w:r>
+          </w:p>
+        </w:tc>
+      </w:tr>
+      <w:tr>
+        <w:trPr>
+          <w:tblHeader w:val="false"/>
+        </w:trPr>
+        <w:tc>
+          <w:tcPr>
+            <w:tcW w:type="dxa" w:w="3120"/>
+            <w:tcBorders>
+              <w:top w:val="single" w:color="CCCCCC" w:sz="1"/>
+              <w:left w:val="single" w:color="CCCCCC" w:sz="1"/>
+              <w:bottom w:val="single" w:color="CCCCCC" w:sz="1"/>
+              <w:right w:val="single" w:color="CCCCCC" w:sz="1"/>
+            </w:tcBorders>
+            <w:tcMar>
+              <w:top w:type="dxa" w:w="60"/>
+              <w:left w:type="dxa" w:w="110"/>
+              <w:bottom w:type="dxa" w:w="60"/>
+              <w:right w:type="dxa" w:w="110"/>
+            </w:tcMar>
+            <w:vAlign w:val="center"/>
+          </w:tcPr>
+          <w:p>
+            <w:pPr>
+              <w:spacing w:after="0"/>
+            </w:pPr>
+            <w:r>
+              <w:rPr>
+                <w:b w:val="false"/>
+                <w:bCs w:val="false"/>
+                <w:sz w:val="20"/>
+                <w:szCs w:val="20"/>
+              </w:rPr>
+              <w:t xml:space="preserve">Redundancy</w:t>
+            </w:r>
+          </w:p>
+        </w:tc>
+        <w:tc>
+          <w:tcPr>
+            <w:tcW w:type="dxa" w:w="3120"/>
+            <w:tcBorders>
+              <w:top w:val="single" w:color="CCCCCC" w:sz="1"/>
+              <w:left w:val="single" w:color="CCCCCC" w:sz="1"/>
+              <w:bottom w:val="single" w:color="CCCCCC" w:sz="1"/>
+              <w:right w:val="single" w:color="CCCCCC" w:sz="1"/>
+            </w:tcBorders>
+            <w:tcMar>
+              <w:top w:type="dxa" w:w="60"/>
+              <w:left w:type="dxa" w:w="110"/>
+              <w:bottom w:type="dxa" w:w="60"/>
+              <w:right w:type="dxa" w:w="110"/>
+            </w:tcMar>
+            <w:vAlign w:val="center"/>
+          </w:tcPr>
+          <w:p>
+            <w:pPr>
+              <w:spacing w:after="0"/>
+            </w:pPr>
+            <w:r>
+              <w:rPr>
+                <w:b w:val="false"/>
+                <w:bCs w:val="false"/>
+                <w:sz w:val="20"/>
+                <w:szCs w:val="20"/>
+              </w:rPr>
+              <w:t xml:space="preserve">None — single point of failure</w:t>
+            </w:r>
+          </w:p>
+        </w:tc>
+        <w:tc>
+          <w:tcPr>
+            <w:tcW w:type="dxa" w:w="3120"/>
+            <w:tcBorders>
+              <w:top w:val="single" w:color="CCCCCC" w:sz="1"/>
+              <w:left w:val="single" w:color="CCCCCC" w:sz="1"/>
+              <w:bottom w:val="single" w:color="CCCCCC" w:sz="1"/>
+              <w:right w:val="single" w:color="CCCCCC" w:sz="1"/>
+            </w:tcBorders>
+            <w:tcMar>
+              <w:top w:type="dxa" w:w="60"/>
+              <w:left w:type="dxa" w:w="110"/>
+              <w:bottom w:type="dxa" w:w="60"/>
+              <w:right w:type="dxa" w:w="110"/>
+            </w:tcMar>
+            <w:vAlign w:val="center"/>
+          </w:tcPr>
+          <w:p>
+            <w:pPr>
+              <w:spacing w:after="0"/>
+            </w:pPr>
+            <w:r>
+              <w:rPr>
+                <w:b w:val="false"/>
+                <w:bCs w:val="false"/>
+                <w:sz w:val="20"/>
+                <w:szCs w:val="20"/>
+              </w:rPr>
+              <w:t xml:space="preserve">Multi-AZ by default</w:t>
+            </w:r>
+          </w:p>
+        </w:tc>
+      </w:tr>
+      <w:tr>
+        <w:trPr>
+          <w:tblHeader w:val="false"/>
+        </w:trPr>
+        <w:tc>
+          <w:tcPr>
+            <w:tcW w:type="dxa" w:w="3120"/>
+            <w:tcBorders>
+              <w:top w:val="single" w:color="CCCCCC" w:sz="1"/>
+              <w:left w:val="single" w:color="CCCCCC" w:sz="1"/>
+              <w:bottom w:val="single" w:color="CCCCCC" w:sz="1"/>
+              <w:right w:val="single" w:color="CCCCCC" w:sz="1"/>
+            </w:tcBorders>
+            <w:tcMar>
+              <w:top w:type="dxa" w:w="60"/>
+              <w:left w:type="dxa" w:w="110"/>
+              <w:bottom w:type="dxa" w:w="60"/>
+              <w:right w:type="dxa" w:w="110"/>
+            </w:tcMar>
+            <w:vAlign w:val="center"/>
+          </w:tcPr>
+          <w:p>
+            <w:pPr>
+              <w:spacing w:after="0"/>
+            </w:pPr>
+            <w:r>
+              <w:rPr>
+                <w:b w:val="false"/>
+                <w:bCs w:val="false"/>
+                <w:sz w:val="20"/>
+                <w:szCs w:val="20"/>
+              </w:rPr>
+              <w:t xml:space="preserve">Instance/AZ failure</w:t>
+            </w:r>
+          </w:p>
+        </w:tc>
+        <w:tc>
+          <w:tcPr>
+            <w:tcW w:type="dxa" w:w="3120"/>
+            <w:tcBorders>
+              <w:top w:val="single" w:color="CCCCCC" w:sz="1"/>
+              <w:left w:val="single" w:color="CCCCCC" w:sz="1"/>
+              <w:bottom w:val="single" w:color="CCCCCC" w:sz="1"/>
+              <w:right w:val="single" w:color="CCCCCC" w:sz="1"/>
+            </w:tcBorders>
+            <w:tcMar>
+              <w:top w:type="dxa" w:w="60"/>
+              <w:left w:type="dxa" w:w="110"/>
+              <w:bottom w:type="dxa" w:w="60"/>
+              <w:right w:type="dxa" w:w="110"/>
+            </w:tcMar>
+            <w:vAlign w:val="center"/>
+          </w:tcPr>
+          <w:p>
+            <w:pPr>
+              <w:spacing w:after="0"/>
+            </w:pPr>
+            <w:r>
+              <w:rPr>
+                <w:b w:val="false"/>
+                <w:bCs w:val="false"/>
+                <w:sz w:val="20"/>
+                <w:szCs w:val="20"/>
+              </w:rPr>
+              <w:t xml:space="preserve">Full outage until restart</w:t>
+            </w:r>
+          </w:p>
+        </w:tc>
+        <w:tc>
+          <w:tcPr>
+            <w:tcW w:type="dxa" w:w="3120"/>
+            <w:tcBorders>
+              <w:top w:val="single" w:color="CCCCCC" w:sz="1"/>
+              <w:left w:val="single" w:color="CCCCCC" w:sz="1"/>
+              <w:bottom w:val="single" w:color="CCCCCC" w:sz="1"/>
+              <w:right w:val="single" w:color="CCCCCC" w:sz="1"/>
+            </w:tcBorders>
+            <w:tcMar>
+              <w:top w:type="dxa" w:w="60"/>
+              <w:left w:type="dxa" w:w="110"/>
+              <w:bottom w:type="dxa" w:w="60"/>
+              <w:right w:type="dxa" w:w="110"/>
+            </w:tcMar>
+            <w:vAlign w:val="center"/>
+          </w:tcPr>
+          <w:p>
+            <w:pPr>
+              <w:spacing w:after="0"/>
+            </w:pPr>
+            <w:r>
+              <w:rPr>
+                <w:b w:val="false"/>
+                <w:bCs w:val="false"/>
+                <w:sz w:val="20"/>
+                <w:szCs w:val="20"/>
+              </w:rPr>
+              <w:t xml:space="preserve">Handled transparently by AWS</w:t>
+            </w:r>
+          </w:p>
+        </w:tc>
+      </w:tr>
+      <w:tr>
+        <w:trPr>
+          <w:tblHeader w:val="false"/>
+        </w:trPr>
+        <w:tc>
+          <w:tcPr>
+            <w:tcW w:type="dxa" w:w="3120"/>
+            <w:tcBorders>
+              <w:top w:val="single" w:color="CCCCCC" w:sz="1"/>
+              <w:left w:val="single" w:color="CCCCCC" w:sz="1"/>
+              <w:bottom w:val="single" w:color="CCCCCC" w:sz="1"/>
+              <w:right w:val="single" w:color="CCCCCC" w:sz="1"/>
+            </w:tcBorders>
+            <w:tcMar>
+              <w:top w:type="dxa" w:w="60"/>
+              <w:left w:type="dxa" w:w="110"/>
+              <w:bottom w:type="dxa" w:w="60"/>
+              <w:right w:type="dxa" w:w="110"/>
+            </w:tcMar>
+            <w:vAlign w:val="center"/>
+          </w:tcPr>
+          <w:p>
+            <w:pPr>
+              <w:spacing w:after="0"/>
+            </w:pPr>
+            <w:r>
+              <w:rPr>
+                <w:b w:val="false"/>
+                <w:bCs w:val="false"/>
+                <w:sz w:val="20"/>
+                <w:szCs w:val="20"/>
+              </w:rPr>
+              <w:t xml:space="preserve">Burst absorption</w:t>
+            </w:r>
+          </w:p>
+        </w:tc>
+        <w:tc>
+          <w:tcPr>
+            <w:tcW w:type="dxa" w:w="3120"/>
+            <w:tcBorders>
+              <w:top w:val="single" w:color="CCCCCC" w:sz="1"/>
+              <w:left w:val="single" w:color="CCCCCC" w:sz="1"/>
+              <w:bottom w:val="single" w:color="CCCCCC" w:sz="1"/>
+              <w:right w:val="single" w:color="CCCCCC" w:sz="1"/>
+            </w:tcBorders>
+            <w:tcMar>
+              <w:top w:type="dxa" w:w="60"/>
+              <w:left w:type="dxa" w:w="110"/>
+              <w:bottom w:type="dxa" w:w="60"/>
+              <w:right w:type="dxa" w:w="110"/>
+            </w:tcMar>
+            <w:vAlign w:val="center"/>
+          </w:tcPr>
+          <w:p>
+            <w:pPr>
+              <w:spacing w:after="0"/>
+            </w:pPr>
+            <w:r>
+              <w:rPr>
+                <w:b w:val="false"/>
+                <w:bCs w:val="false"/>
+                <w:sz w:val="20"/>
+                <w:szCs w:val="20"/>
+              </w:rPr>
+              <w:t xml:space="preserve">Poor (fixed capacity)</w:t>
+            </w:r>
+          </w:p>
+        </w:tc>
+        <w:tc>
+          <w:tcPr>
+            <w:tcW w:type="dxa" w:w="3120"/>
+            <w:tcBorders>
+              <w:top w:val="single" w:color="CCCCCC" w:sz="1"/>
+              <w:left w:val="single" w:color="CCCCCC" w:sz="1"/>
+              <w:bottom w:val="single" w:color="CCCCCC" w:sz="1"/>
+              <w:right w:val="single" w:color="CCCCCC" w:sz="1"/>
+            </w:tcBorders>
+            <w:tcMar>
+              <w:top w:type="dxa" w:w="60"/>
+              <w:left w:type="dxa" w:w="110"/>
+              <w:bottom w:type="dxa" w:w="60"/>
+              <w:right w:type="dxa" w:w="110"/>
+            </w:tcMar>
+            <w:vAlign w:val="center"/>
+          </w:tcPr>
+          <w:p>
+            <w:pPr>
+              <w:spacing w:after="0"/>
+            </w:pPr>
+            <w:r>
+              <w:rPr>
+                <w:b w:val="false"/>
+                <w:bCs w:val="false"/>
+                <w:sz w:val="20"/>
+                <w:szCs w:val="20"/>
+              </w:rPr>
+              <w:t xml:space="preserve">Automatic per-request scaling</w:t>
+            </w:r>
+          </w:p>
+        </w:tc>
+      </w:tr>
+      <w:tr>
+        <w:trPr>
+          <w:tblHeader w:val="false"/>
+        </w:trPr>
+        <w:tc>
+          <w:tcPr>
+            <w:tcW w:type="dxa" w:w="3120"/>
+            <w:tcBorders>
+              <w:top w:val="single" w:color="CCCCCC" w:sz="1"/>
+              <w:left w:val="single" w:color="CCCCCC" w:sz="1"/>
+              <w:bottom w:val="single" w:color="CCCCCC" w:sz="1"/>
+              <w:right w:val="single" w:color="CCCCCC" w:sz="1"/>
+            </w:tcBorders>
+            <w:tcMar>
+              <w:top w:type="dxa" w:w="60"/>
+              <w:left w:type="dxa" w:w="110"/>
+              <w:bottom w:type="dxa" w:w="60"/>
+              <w:right w:type="dxa" w:w="110"/>
+            </w:tcMar>
+            <w:vAlign w:val="center"/>
+          </w:tcPr>
+          <w:p>
+            <w:pPr>
+              <w:spacing w:after="0"/>
+            </w:pPr>
+            <w:r>
+              <w:rPr>
+                <w:b w:val="false"/>
+                <w:bCs w:val="false"/>
+                <w:sz w:val="20"/>
+                <w:szCs w:val="20"/>
+              </w:rPr>
+              <w:t xml:space="preserve">To match the other</w:t>
+            </w:r>
+          </w:p>
+        </w:tc>
+        <w:tc>
+          <w:tcPr>
+            <w:tcW w:type="dxa" w:w="3120"/>
+            <w:tcBorders>
+              <w:top w:val="single" w:color="CCCCCC" w:sz="1"/>
+              <w:left w:val="single" w:color="CCCCCC" w:sz="1"/>
+              <w:bottom w:val="single" w:color="CCCCCC" w:sz="1"/>
+              <w:right w:val="single" w:color="CCCCCC" w:sz="1"/>
+            </w:tcBorders>
+            <w:tcMar>
+              <w:top w:type="dxa" w:w="60"/>
+              <w:left w:type="dxa" w:w="110"/>
+              <w:bottom w:type="dxa" w:w="60"/>
+              <w:right w:type="dxa" w:w="110"/>
+            </w:tcMar>
+            <w:vAlign w:val="center"/>
+          </w:tcPr>
+          <w:p>
+            <w:pPr>
+              <w:spacing w:after="0"/>
+            </w:pPr>
+            <w:r>
+              <w:rPr>
+                <w:b w:val="false"/>
+                <w:bCs w:val="false"/>
+                <w:sz w:val="20"/>
+                <w:szCs w:val="20"/>
+              </w:rPr>
+              <w:t xml:space="preserve">Add Auto Scaling Group + ALB</w:t>
+            </w:r>
+          </w:p>
+        </w:tc>
+        <w:tc>
+          <w:tcPr>
+            <w:tcW w:type="dxa" w:w="3120"/>
+            <w:tcBorders>
+              <w:top w:val="single" w:color="CCCCCC" w:sz="1"/>
+              <w:left w:val="single" w:color="CCCCCC" w:sz="1"/>
+              <w:bottom w:val="single" w:color="CCCCCC" w:sz="1"/>
+              <w:right w:val="single" w:color="CCCCCC" w:sz="1"/>
+            </w:tcBorders>
+            <w:tcMar>
+              <w:top w:type="dxa" w:w="60"/>
+              <w:left w:type="dxa" w:w="110"/>
+              <w:bottom w:type="dxa" w:w="60"/>
+              <w:right w:type="dxa" w:w="110"/>
+            </w:tcMar>
+            <w:vAlign w:val="center"/>
+          </w:tcPr>
+          <w:p>
+            <w:pPr>
+              <w:spacing w:after="0"/>
+            </w:pPr>
+            <w:r>
+              <w:rPr>
+                <w:b w:val="false"/>
+                <w:bCs w:val="false"/>
+                <w:sz w:val="20"/>
+                <w:szCs w:val="20"/>
+              </w:rPr>
+              <w:t xml:space="preserve">Built-in</w:t>
+            </w:r>
+          </w:p>
+        </w:tc>
+      </w:tr>
+    </w:tbl>
+    <w:p>
+      <w:pPr>
+        <w:pStyle w:val="Heading2"/>
+      </w:pPr>
+      <w:r>
+        <w:t xml:space="preserve">5.5 Scalability</w:t>
+      </w:r>
+    </w:p>
+    <w:p>
+      <w:pPr>
+        <w:pStyle w:val="ListParagraph"/>
+        <w:numPr>
+          <w:ilvl w:val="0"/>
+          <w:numId w:val="2"/>
+        </w:numPr>
+        <w:spacing w:after="60"/>
+      </w:pPr>
+      <w:r>
+        <w:t xml:space="preserve">EC2: vertical (bigger instance) or manual horizontal via an Auto Scaling Group; capacity must be provisioned ahead of demand and reacts slowly.</w:t>
+      </w:r>
+    </w:p>
+    <w:p>
+      <w:pPr>
+        <w:pStyle w:val="ListParagraph"/>
+        <w:numPr>
+          <w:ilvl w:val="0"/>
+          <w:numId w:val="2"/>
+        </w:numPr>
+        <w:spacing w:after="60"/>
+      </w:pPr>
+      <w:r>
+        <w:t xml:space="preserve">Lambda: automatic, near-instant, per-request horizontal scaling up to the account concurrency limit (default ~1000; a new account may need a quota increase).</w:t>
+      </w:r>
+    </w:p>
+    <w:p>
+      <w:pPr>
+        <w:pStyle w:val="ListParagraph"/>
+        <w:numPr>
+          <w:ilvl w:val="0"/>
+          <w:numId w:val="2"/>
+        </w:numPr>
+        <w:spacing w:after="60"/>
+      </w:pPr>
+      <w:r>
+        <w:t xml:space="preserve">Shared ceiling: at ~1000 users the binding constraint is Amazon Bedrock’s per-minute request/token quota — identical for both architectures. Beyond that point, only a Bedrock quota increase helps.</w:t>
+      </w:r>
+    </w:p>
+    <w:p>
+      <w:pPr>
+        <w:pStyle w:val="Heading2"/>
+      </w:pPr>
+      <w:r>
+        <w:t xml:space="preserve">5.6 Resource usage</w:t>
+      </w:r>
+    </w:p>
+    <w:p>
+      <w:pPr>
+        <w:pStyle w:val="ListParagraph"/>
+        <w:numPr>
+          <w:ilvl w:val="0"/>
+          <w:numId w:val="2"/>
+        </w:numPr>
+        <w:spacing w:after="60"/>
+      </w:pPr>
+      <w:r>
+        <w:t xml:space="preserve">EC2 t3.small (2 vCPU, 2 GB): the workload is I/O-bound (waiting on Bedrock), so CPU stays low; the real limit is connection/threadpool concurrency (saturated at ~200 connections above). Burstable CPU credits can also throttle sustained load.</w:t>
+      </w:r>
+    </w:p>
+    <w:p>
+      <w:pPr>
+        <w:pStyle w:val="ListParagraph"/>
+        <w:numPr>
+          <w:ilvl w:val="0"/>
+          <w:numId w:val="2"/>
+        </w:numPr>
+        <w:spacing w:after="60"/>
+      </w:pPr>
+      <w:r>
+        <w:t xml:space="preserve">Lambda: 2048 MB per concurrent execution (~1.2 vCPU each), fully isolated; at 1000 concurrency that is ~2 TB of aggregate transient memory, managed by AWS.</w:t>
+      </w:r>
+    </w:p>
+    <w:p>
+      <w:pPr>
+        <w:pStyle w:val="Heading2"/>
+      </w:pPr>
+      <w:r>
+        <w:t xml:space="preserve">5.7 Billing under load (estimated, per 1,000 itineraries)</w:t>
+      </w:r>
+    </w:p>
+    <w:tbl>
+      <w:tblPr>
+        <w:tblW w:type="dxa" w:w="9360"/>
+        <w:tblBorders>
+          <w:top w:val="single" w:color="auto" w:sz="4"/>
+          <w:left w:val="single" w:color="auto" w:sz="4"/>
+          <w:bottom w:val="single" w:color="auto" w:sz="4"/>
+          <w:right w:val="single" w:color="auto" w:sz="4"/>
+          <w:insideH w:val="single" w:color="auto" w:sz="4"/>
+          <w:insideV w:val="single" w:color="auto" w:sz="4"/>
+        </w:tblBorders>
+      </w:tblPr>
+      <w:tblGrid>
+        <w:gridCol w:w="3120"/>
+        <w:gridCol w:w="3120"/>
+        <w:gridCol w:w="3120"/>
+      </w:tblGrid>
+      <w:tr>
+        <w:trPr>
+          <w:tblHeader/>
+        </w:trPr>
+        <w:tc>
+          <w:tcPr>
+            <w:tcW w:type="dxa" w:w="3120"/>
+            <w:tcBorders>
+              <w:top w:val="single" w:color="CCCCCC" w:sz="1"/>
+              <w:left w:val="single" w:color="CCCCCC" w:sz="1"/>
+              <w:bottom w:val="single" w:color="CCCCCC" w:sz="1"/>
+              <w:right w:val="single" w:color="CCCCCC" w:sz="1"/>
+            </w:tcBorders>
+            <w:shd w:fill="D5E8F0" w:val="clear"/>
+            <w:tcMar>
+              <w:top w:type="dxa" w:w="60"/>
+              <w:left w:type="dxa" w:w="110"/>
+              <w:bottom w:type="dxa" w:w="60"/>
+              <w:right w:type="dxa" w:w="110"/>
+            </w:tcMar>
+            <w:vAlign w:val="center"/>
+          </w:tcPr>
+          <w:p>
+            <w:pPr>
+              <w:spacing w:after="0"/>
+            </w:pPr>
+            <w:r>
+              <w:rPr>
+                <w:b/>
+                <w:bCs/>
+                <w:color w:val="0F172A"/>
+                <w:sz w:val="20"/>
+                <w:szCs w:val="20"/>
+              </w:rPr>
+              <w:t xml:space="preserve">Component</w:t>
+            </w:r>
+          </w:p>
+        </w:tc>
+        <w:tc>
+          <w:tcPr>
+            <w:tcW w:type="dxa" w:w="3120"/>
+            <w:tcBorders>
+              <w:top w:val="single" w:color="CCCCCC" w:sz="1"/>
+              <w:left w:val="single" w:color="CCCCCC" w:sz="1"/>
+              <w:bottom w:val="single" w:color="CCCCCC" w:sz="1"/>
+              <w:right w:val="single" w:color="CCCCCC" w:sz="1"/>
+            </w:tcBorders>
+            <w:shd w:fill="D5E8F0" w:val="clear"/>
+            <w:tcMar>
+              <w:top w:type="dxa" w:w="60"/>
+              <w:left w:type="dxa" w:w="110"/>
+              <w:bottom w:type="dxa" w:w="60"/>
+              <w:right w:type="dxa" w:w="110"/>
+            </w:tcMar>
+            <w:vAlign w:val="center"/>
+          </w:tcPr>
+          <w:p>
+            <w:pPr>
+              <w:spacing w:after="0"/>
+            </w:pPr>
+            <w:r>
+              <w:rPr>
+                <w:b/>
+                <w:bCs/>
+                <w:color w:val="0F172A"/>
+                <w:sz w:val="20"/>
+                <w:szCs w:val="20"/>
+              </w:rPr>
+              <w:t xml:space="preserve">EC2 path</w:t>
+            </w:r>
+          </w:p>
+        </w:tc>
+        <w:tc>
+          <w:tcPr>
+            <w:tcW w:type="dxa" w:w="3120"/>
+            <w:tcBorders>
+              <w:top w:val="single" w:color="CCCCCC" w:sz="1"/>
+              <w:left w:val="single" w:color="CCCCCC" w:sz="1"/>
+              <w:bottom w:val="single" w:color="CCCCCC" w:sz="1"/>
+              <w:right w:val="single" w:color="CCCCCC" w:sz="1"/>
+            </w:tcBorders>
+            <w:shd w:fill="D5E8F0" w:val="clear"/>
+            <w:tcMar>
+              <w:top w:type="dxa" w:w="60"/>
+              <w:left w:type="dxa" w:w="110"/>
+              <w:bottom w:type="dxa" w:w="60"/>
+              <w:right w:type="dxa" w:w="110"/>
+            </w:tcMar>
+            <w:vAlign w:val="center"/>
+          </w:tcPr>
+          <w:p>
+            <w:pPr>
+              <w:spacing w:after="0"/>
+            </w:pPr>
+            <w:r>
+              <w:rPr>
+                <w:b/>
+                <w:bCs/>
+                <w:color w:val="0F172A"/>
+                <w:sz w:val="20"/>
+                <w:szCs w:val="20"/>
+              </w:rPr>
+              <w:t xml:space="preserve">Lambda path</w:t>
+            </w:r>
+          </w:p>
+        </w:tc>
+      </w:tr>
+      <w:tr>
+        <w:trPr>
+          <w:tblHeader w:val="false"/>
+        </w:trPr>
+        <w:tc>
+          <w:tcPr>
+            <w:tcW w:type="dxa" w:w="3120"/>
+            <w:tcBorders>
+              <w:top w:val="single" w:color="CCCCCC" w:sz="1"/>
+              <w:left w:val="single" w:color="CCCCCC" w:sz="1"/>
+              <w:bottom w:val="single" w:color="CCCCCC" w:sz="1"/>
+              <w:right w:val="single" w:color="CCCCCC" w:sz="1"/>
+            </w:tcBorders>
+            <w:tcMar>
+              <w:top w:type="dxa" w:w="60"/>
+              <w:left w:type="dxa" w:w="110"/>
+              <w:bottom w:type="dxa" w:w="60"/>
+              <w:right w:type="dxa" w:w="110"/>
+            </w:tcMar>
+            <w:vAlign w:val="center"/>
+          </w:tcPr>
+          <w:p>
+            <w:pPr>
+              <w:spacing w:after="0"/>
+            </w:pPr>
+            <w:r>
+              <w:rPr>
+                <w:b w:val="false"/>
+                <w:bCs w:val="false"/>
+                <w:sz w:val="20"/>
+                <w:szCs w:val="20"/>
+              </w:rPr>
+              <w:t xml:space="preserve">Amazon Bedrock (Claude)</w:t>
+            </w:r>
+          </w:p>
+        </w:tc>
+        <w:tc>
+          <w:tcPr>
+            <w:tcW w:type="dxa" w:w="3120"/>
+            <w:tcBorders>
+              <w:top w:val="single" w:color="CCCCCC" w:sz="1"/>
+              <w:left w:val="single" w:color="CCCCCC" w:sz="1"/>
+              <w:bottom w:val="single" w:color="CCCCCC" w:sz="1"/>
+              <w:right w:val="single" w:color="CCCCCC" w:sz="1"/>
+            </w:tcBorders>
+            <w:tcMar>
+              <w:top w:type="dxa" w:w="60"/>
+              <w:left w:type="dxa" w:w="110"/>
+              <w:bottom w:type="dxa" w:w="60"/>
+              <w:right w:type="dxa" w:w="110"/>
+            </w:tcMar>
+            <w:vAlign w:val="center"/>
+          </w:tcPr>
+          <w:p>
+            <w:pPr>
+              <w:spacing w:after="0"/>
+            </w:pPr>
+            <w:r>
+              <w:rPr>
+                <w:b w:val="false"/>
+                <w:bCs w:val="false"/>
+                <w:sz w:val="20"/>
+                <w:szCs w:val="20"/>
+              </w:rPr>
+              <w:t xml:space="preserve">~$40 (dominant, identical)</w:t>
+            </w:r>
+          </w:p>
+        </w:tc>
+        <w:tc>
+          <w:tcPr>
+            <w:tcW w:type="dxa" w:w="3120"/>
+            <w:tcBorders>
+              <w:top w:val="single" w:color="CCCCCC" w:sz="1"/>
+              <w:left w:val="single" w:color="CCCCCC" w:sz="1"/>
+              <w:bottom w:val="single" w:color="CCCCCC" w:sz="1"/>
+              <w:right w:val="single" w:color="CCCCCC" w:sz="1"/>
+            </w:tcBorders>
+            <w:tcMar>
+              <w:top w:type="dxa" w:w="60"/>
+              <w:left w:type="dxa" w:w="110"/>
+              <w:bottom w:type="dxa" w:w="60"/>
+              <w:right w:type="dxa" w:w="110"/>
+            </w:tcMar>
+            <w:vAlign w:val="center"/>
+          </w:tcPr>
+          <w:p>
+            <w:pPr>
+              <w:spacing w:after="0"/>
+            </w:pPr>
+            <w:r>
+              <w:rPr>
+                <w:b w:val="false"/>
+                <w:bCs w:val="false"/>
+                <w:sz w:val="20"/>
+                <w:szCs w:val="20"/>
+              </w:rPr>
+              <w:t xml:space="preserve">~$40 (dominant, identical)</w:t>
+            </w:r>
+          </w:p>
+        </w:tc>
+      </w:tr>
+      <w:tr>
+        <w:trPr>
+          <w:tblHeader w:val="false"/>
+        </w:trPr>
+        <w:tc>
+          <w:tcPr>
+            <w:tcW w:type="dxa" w:w="3120"/>
+            <w:tcBorders>
+              <w:top w:val="single" w:color="CCCCCC" w:sz="1"/>
+              <w:left w:val="single" w:color="CCCCCC" w:sz="1"/>
+              <w:bottom w:val="single" w:color="CCCCCC" w:sz="1"/>
+              <w:right w:val="single" w:color="CCCCCC" w:sz="1"/>
+            </w:tcBorders>
+            <w:tcMar>
+              <w:top w:type="dxa" w:w="60"/>
+              <w:left w:type="dxa" w:w="110"/>
+              <w:bottom w:type="dxa" w:w="60"/>
+              <w:right w:type="dxa" w:w="110"/>
+            </w:tcMar>
+            <w:vAlign w:val="center"/>
+          </w:tcPr>
+          <w:p>
+            <w:pPr>
+              <w:spacing w:after="0"/>
+            </w:pPr>
+            <w:r>
+              <w:rPr>
+                <w:b w:val="false"/>
+                <w:bCs w:val="false"/>
+                <w:sz w:val="20"/>
+                <w:szCs w:val="20"/>
+              </w:rPr>
+              <w:t xml:space="preserve">Compute</w:t>
+            </w:r>
+          </w:p>
+        </w:tc>
+        <w:tc>
+          <w:tcPr>
+            <w:tcW w:type="dxa" w:w="3120"/>
+            <w:tcBorders>
+              <w:top w:val="single" w:color="CCCCCC" w:sz="1"/>
+              <w:left w:val="single" w:color="CCCCCC" w:sz="1"/>
+              <w:bottom w:val="single" w:color="CCCCCC" w:sz="1"/>
+              <w:right w:val="single" w:color="CCCCCC" w:sz="1"/>
+            </w:tcBorders>
+            <w:tcMar>
+              <w:top w:type="dxa" w:w="60"/>
+              <w:left w:type="dxa" w:w="110"/>
+              <w:bottom w:type="dxa" w:w="60"/>
+              <w:right w:type="dxa" w:w="110"/>
+            </w:tcMar>
+            <w:vAlign w:val="center"/>
+          </w:tcPr>
+          <w:p>
+            <w:pPr>
+              <w:spacing w:after="0"/>
+            </w:pPr>
+            <w:r>
+              <w:rPr>
+                <w:b w:val="false"/>
+                <w:bCs w:val="false"/>
+                <w:sz w:val="20"/>
+                <w:szCs w:val="20"/>
+              </w:rPr>
+              <w:t xml:space="preserve">$15.6/mo fixed per instance; needs a fleet+ALB for ≥200 users</w:t>
+            </w:r>
+          </w:p>
+        </w:tc>
+        <w:tc>
+          <w:tcPr>
+            <w:tcW w:type="dxa" w:w="3120"/>
+            <w:tcBorders>
+              <w:top w:val="single" w:color="CCCCCC" w:sz="1"/>
+              <w:left w:val="single" w:color="CCCCCC" w:sz="1"/>
+              <w:bottom w:val="single" w:color="CCCCCC" w:sz="1"/>
+              <w:right w:val="single" w:color="CCCCCC" w:sz="1"/>
+            </w:tcBorders>
+            <w:tcMar>
+              <w:top w:type="dxa" w:w="60"/>
+              <w:left w:type="dxa" w:w="110"/>
+              <w:bottom w:type="dxa" w:w="60"/>
+              <w:right w:type="dxa" w:w="110"/>
+            </w:tcMar>
+            <w:vAlign w:val="center"/>
+          </w:tcPr>
+          <w:p>
+            <w:pPr>
+              <w:spacing w:after="0"/>
+            </w:pPr>
+            <w:r>
+              <w:rPr>
+                <w:b w:val="false"/>
+                <w:bCs w:val="false"/>
+                <w:sz w:val="20"/>
+                <w:szCs w:val="20"/>
+              </w:rPr>
+              <w:t xml:space="preserve">~$0.56 per 1,000 + $0 when idle</w:t>
+            </w:r>
+          </w:p>
+        </w:tc>
+      </w:tr>
+      <w:tr>
+        <w:trPr>
+          <w:tblHeader w:val="false"/>
+        </w:trPr>
+        <w:tc>
+          <w:tcPr>
+            <w:tcW w:type="dxa" w:w="3120"/>
+            <w:tcBorders>
+              <w:top w:val="single" w:color="CCCCCC" w:sz="1"/>
+              <w:left w:val="single" w:color="CCCCCC" w:sz="1"/>
+              <w:bottom w:val="single" w:color="CCCCCC" w:sz="1"/>
+              <w:right w:val="single" w:color="CCCCCC" w:sz="1"/>
+            </w:tcBorders>
+            <w:tcMar>
+              <w:top w:type="dxa" w:w="60"/>
+              <w:left w:type="dxa" w:w="110"/>
+              <w:bottom w:type="dxa" w:w="60"/>
+              <w:right w:type="dxa" w:w="110"/>
+            </w:tcMar>
+            <w:vAlign w:val="center"/>
+          </w:tcPr>
+          <w:p>
+            <w:pPr>
+              <w:spacing w:after="0"/>
+            </w:pPr>
+            <w:r>
+              <w:rPr>
+                <w:b w:val="false"/>
+                <w:bCs w:val="false"/>
+                <w:sz w:val="20"/>
+                <w:szCs w:val="20"/>
+              </w:rPr>
+              <w:t xml:space="preserve">Gateway / state</w:t>
+            </w:r>
+          </w:p>
+        </w:tc>
+        <w:tc>
+          <w:tcPr>
+            <w:tcW w:type="dxa" w:w="3120"/>
+            <w:tcBorders>
+              <w:top w:val="single" w:color="CCCCCC" w:sz="1"/>
+              <w:left w:val="single" w:color="CCCCCC" w:sz="1"/>
+              <w:bottom w:val="single" w:color="CCCCCC" w:sz="1"/>
+              <w:right w:val="single" w:color="CCCCCC" w:sz="1"/>
+            </w:tcBorders>
+            <w:tcMar>
+              <w:top w:type="dxa" w:w="60"/>
+              <w:left w:type="dxa" w:w="110"/>
+              <w:bottom w:type="dxa" w:w="60"/>
+              <w:right w:type="dxa" w:w="110"/>
+            </w:tcMar>
+            <w:vAlign w:val="center"/>
+          </w:tcPr>
+          <w:p>
+            <w:pPr>
+              <w:spacing w:after="0"/>
+            </w:pPr>
+            <w:r>
+              <w:rPr>
+                <w:b w:val="false"/>
+                <w:bCs w:val="false"/>
+                <w:sz w:val="20"/>
+                <w:szCs w:val="20"/>
+              </w:rPr>
+              <w:t xml:space="preserve">n/a / pennies</w:t>
+            </w:r>
+          </w:p>
+        </w:tc>
+        <w:tc>
+          <w:tcPr>
+            <w:tcW w:type="dxa" w:w="3120"/>
+            <w:tcBorders>
+              <w:top w:val="single" w:color="CCCCCC" w:sz="1"/>
+              <w:left w:val="single" w:color="CCCCCC" w:sz="1"/>
+              <w:bottom w:val="single" w:color="CCCCCC" w:sz="1"/>
+              <w:right w:val="single" w:color="CCCCCC" w:sz="1"/>
+            </w:tcBorders>
+            <w:tcMar>
+              <w:top w:type="dxa" w:w="60"/>
+              <w:left w:type="dxa" w:w="110"/>
+              <w:bottom w:type="dxa" w:w="60"/>
+              <w:right w:type="dxa" w:w="110"/>
+            </w:tcMar>
+            <w:vAlign w:val="center"/>
+          </w:tcPr>
+          <w:p>
+            <w:pPr>
+              <w:spacing w:after="0"/>
+            </w:pPr>
+            <w:r>
+              <w:rPr>
+                <w:b w:val="false"/>
+                <w:bCs w:val="false"/>
+                <w:sz w:val="20"/>
+                <w:szCs w:val="20"/>
+              </w:rPr>
+              <w:t xml:space="preserve">~$1 per million / pennies</w:t>
+            </w:r>
+          </w:p>
+        </w:tc>
+      </w:tr>
+    </w:tbl>
+    <w:p>
+      <w:pPr>
+        <w:spacing w:after="120"/>
+      </w:pPr>
+      <w:r>
+        <w:rPr>
+          <w:b/>
+          <w:bCs/>
+        </w:rPr>
+        <w:t xml:space="preserve">Billing conclusion: the LLM (Bedrock) is ~95%+ of the cost and is identical for both architectures — the compute choice is a rounding error on the total bill. Lambda wins on variable, spiky, or low-to-medium load (zero idle cost, no capacity planning); EC2 only competes when a single instance is kept near 100% utilised around the clock, and it requires an Auto Scaling Group plus a load balancer to survive 200+ concurrent users.</w:t>
       </w:r>
     </w:p>
     <w:p>

</xml_diff>

<commit_message>
Add EC2 saturation sweep: spike point, curve chart, and report update
Concurrency sweep (25-400) on /health locates the breaking point: throughput peaks at ~25 conc (322 req/s), latency spikes at 150-200 (p95>5s), instance broken by 300+ (p95~15s). Adds loadchart.png saturation curve and the sweep table to report Section 5 (267 paragraphs) and RESULTS.md.
</commit_message>
<xml_diff>
--- a/report/BZ-Agent_Report.docx
+++ b/report/BZ-Agent_Report.docx
@@ -2069,7 +2069,15 @@
         <w:spacing w:after="120"/>
       </w:pPr>
       <w:r>
-        <w:t xml:space="preserve">Single-request latency (EC2 t3.small, warm): six sequential requests averaged 16.9 s (min 14.7 s, max 18.4 s); Lambda was comparable (~13–15 s warm, ~17.8 s cold). Latency is dominated by the three sequential Bedrock calls, so it is similar for both architectures. Raw infrastructure concurrency on /health:</w:t>
+        <w:t xml:space="preserve">Single-request latency (EC2 t3.small, warm): six sequential requests averaged 16.9 s (min 14.7 s, max 18.4 s); Lambda was comparable (~13–15 s warm, ~17.8 s cold). Latency is dominated by the three sequential Bedrock calls, so it is similar for both architectures.</w:t>
+      </w:r>
+    </w:p>
+    <w:p>
+      <w:pPr>
+        <w:spacing w:after="120"/>
+      </w:pPr>
+      <w:r>
+        <w:t xml:space="preserve">To locate the instance’s breaking point, the cost-free /health endpoint was swept across rising concurrency:</w:t>
       </w:r>
     </w:p>
     <w:tbl>
@@ -2085,12 +2093,10 @@
         </w:tblBorders>
       </w:tblPr>
       <w:tblGrid>
-        <w:gridCol w:w="1560"/>
-        <w:gridCol w:w="1560"/>
-        <w:gridCol w:w="1560"/>
-        <w:gridCol w:w="1560"/>
-        <w:gridCol w:w="1560"/>
-        <w:gridCol w:w="1560"/>
+        <w:gridCol w:w="2340"/>
+        <w:gridCol w:w="2340"/>
+        <w:gridCol w:w="2340"/>
+        <w:gridCol w:w="2340"/>
       </w:tblGrid>
       <w:tr>
         <w:trPr>
@@ -2098,7 +2104,7 @@
         </w:trPr>
         <w:tc>
           <w:tcPr>
-            <w:tcW w:type="dxa" w:w="1560"/>
+            <w:tcW w:type="dxa" w:w="2340"/>
             <w:tcBorders>
               <w:top w:val="single" w:color="CCCCCC" w:sz="1"/>
               <w:left w:val="single" w:color="CCCCCC" w:sz="1"/>
@@ -2126,13 +2132,13 @@
                 <w:sz w:val="20"/>
                 <w:szCs w:val="20"/>
               </w:rPr>
-              <w:t xml:space="preserve">Concurrency</w:t>
-            </w:r>
-          </w:p>
-        </w:tc>
-        <w:tc>
-          <w:tcPr>
-            <w:tcW w:type="dxa" w:w="1560"/>
+              <w:t xml:space="preserve">Concurrent connections</w:t>
+            </w:r>
+          </w:p>
+        </w:tc>
+        <w:tc>
+          <w:tcPr>
+            <w:tcW w:type="dxa" w:w="2340"/>
             <w:tcBorders>
               <w:top w:val="single" w:color="CCCCCC" w:sz="1"/>
               <w:left w:val="single" w:color="CCCCCC" w:sz="1"/>
@@ -2160,13 +2166,13 @@
                 <w:sz w:val="20"/>
                 <w:szCs w:val="20"/>
               </w:rPr>
-              <w:t xml:space="preserve">Throughput</w:t>
-            </w:r>
-          </w:p>
-        </w:tc>
-        <w:tc>
-          <w:tcPr>
-            <w:tcW w:type="dxa" w:w="1560"/>
+              <w:t xml:space="preserve">Throughput (req/s)</w:t>
+            </w:r>
+          </w:p>
+        </w:tc>
+        <w:tc>
+          <w:tcPr>
+            <w:tcW w:type="dxa" w:w="2340"/>
             <w:tcBorders>
               <w:top w:val="single" w:color="CCCCCC" w:sz="1"/>
               <w:left w:val="single" w:color="CCCCCC" w:sz="1"/>
@@ -2194,13 +2200,13 @@
                 <w:sz w:val="20"/>
                 <w:szCs w:val="20"/>
               </w:rPr>
-              <w:t xml:space="preserve">p50</w:t>
-            </w:r>
-          </w:p>
-        </w:tc>
-        <w:tc>
-          <w:tcPr>
-            <w:tcW w:type="dxa" w:w="1560"/>
+              <w:t xml:space="preserve">p50 latency</w:t>
+            </w:r>
+          </w:p>
+        </w:tc>
+        <w:tc>
+          <w:tcPr>
+            <w:tcW w:type="dxa" w:w="2340"/>
             <w:tcBorders>
               <w:top w:val="single" w:color="CCCCCC" w:sz="1"/>
               <w:left w:val="single" w:color="CCCCCC" w:sz="1"/>
@@ -2228,75 +2234,7 @@
                 <w:sz w:val="20"/>
                 <w:szCs w:val="20"/>
               </w:rPr>
-              <w:t xml:space="preserve">p95</w:t>
-            </w:r>
-          </w:p>
-        </w:tc>
-        <w:tc>
-          <w:tcPr>
-            <w:tcW w:type="dxa" w:w="1560"/>
-            <w:tcBorders>
-              <w:top w:val="single" w:color="CCCCCC" w:sz="1"/>
-              <w:left w:val="single" w:color="CCCCCC" w:sz="1"/>
-              <w:bottom w:val="single" w:color="CCCCCC" w:sz="1"/>
-              <w:right w:val="single" w:color="CCCCCC" w:sz="1"/>
-            </w:tcBorders>
-            <w:shd w:fill="D5E8F0" w:val="clear"/>
-            <w:tcMar>
-              <w:top w:type="dxa" w:w="60"/>
-              <w:left w:type="dxa" w:w="110"/>
-              <w:bottom w:type="dxa" w:w="60"/>
-              <w:right w:type="dxa" w:w="110"/>
-            </w:tcMar>
-            <w:vAlign w:val="center"/>
-          </w:tcPr>
-          <w:p>
-            <w:pPr>
-              <w:spacing w:after="0"/>
-            </w:pPr>
-            <w:r>
-              <w:rPr>
-                <w:b/>
-                <w:bCs/>
-                <w:color w:val="0F172A"/>
-                <w:sz w:val="20"/>
-                <w:szCs w:val="20"/>
-              </w:rPr>
-              <w:t xml:space="preserve">p99</w:t>
-            </w:r>
-          </w:p>
-        </w:tc>
-        <w:tc>
-          <w:tcPr>
-            <w:tcW w:type="dxa" w:w="1560"/>
-            <w:tcBorders>
-              <w:top w:val="single" w:color="CCCCCC" w:sz="1"/>
-              <w:left w:val="single" w:color="CCCCCC" w:sz="1"/>
-              <w:bottom w:val="single" w:color="CCCCCC" w:sz="1"/>
-              <w:right w:val="single" w:color="CCCCCC" w:sz="1"/>
-            </w:tcBorders>
-            <w:shd w:fill="D5E8F0" w:val="clear"/>
-            <w:tcMar>
-              <w:top w:type="dxa" w:w="60"/>
-              <w:left w:type="dxa" w:w="110"/>
-              <w:bottom w:type="dxa" w:w="60"/>
-              <w:right w:type="dxa" w:w="110"/>
-            </w:tcMar>
-            <w:vAlign w:val="center"/>
-          </w:tcPr>
-          <w:p>
-            <w:pPr>
-              <w:spacing w:after="0"/>
-            </w:pPr>
-            <w:r>
-              <w:rPr>
-                <w:b/>
-                <w:bCs/>
-                <w:color w:val="0F172A"/>
-                <w:sz w:val="20"/>
-                <w:szCs w:val="20"/>
-              </w:rPr>
-              <w:t xml:space="preserve">Errors</w:t>
+              <w:t xml:space="preserve">p95 latency</w:t>
             </w:r>
           </w:p>
         </w:tc>
@@ -2307,193 +2245,129 @@
         </w:trPr>
         <w:tc>
           <w:tcPr>
-            <w:tcW w:type="dxa" w:w="1560"/>
-            <w:tcBorders>
-              <w:top w:val="single" w:color="CCCCCC" w:sz="1"/>
-              <w:left w:val="single" w:color="CCCCCC" w:sz="1"/>
-              <w:bottom w:val="single" w:color="CCCCCC" w:sz="1"/>
-              <w:right w:val="single" w:color="CCCCCC" w:sz="1"/>
-            </w:tcBorders>
-            <w:tcMar>
-              <w:top w:type="dxa" w:w="60"/>
-              <w:left w:type="dxa" w:w="110"/>
-              <w:bottom w:type="dxa" w:w="60"/>
-              <w:right w:type="dxa" w:w="110"/>
-            </w:tcMar>
-            <w:vAlign w:val="center"/>
-          </w:tcPr>
-          <w:p>
-            <w:pPr>
-              <w:spacing w:after="0"/>
-            </w:pPr>
-            <w:r>
-              <w:rPr>
-                <w:b w:val="false"/>
-                <w:bCs w:val="false"/>
-                <w:sz w:val="20"/>
-                <w:szCs w:val="20"/>
-              </w:rPr>
-              <w:t xml:space="preserve">50</w:t>
-            </w:r>
-          </w:p>
-        </w:tc>
-        <w:tc>
-          <w:tcPr>
-            <w:tcW w:type="dxa" w:w="1560"/>
-            <w:tcBorders>
-              <w:top w:val="single" w:color="CCCCCC" w:sz="1"/>
-              <w:left w:val="single" w:color="CCCCCC" w:sz="1"/>
-              <w:bottom w:val="single" w:color="CCCCCC" w:sz="1"/>
-              <w:right w:val="single" w:color="CCCCCC" w:sz="1"/>
-            </w:tcBorders>
-            <w:tcMar>
-              <w:top w:type="dxa" w:w="60"/>
-              <w:left w:type="dxa" w:w="110"/>
-              <w:bottom w:type="dxa" w:w="60"/>
-              <w:right w:type="dxa" w:w="110"/>
-            </w:tcMar>
-            <w:vAlign w:val="center"/>
-          </w:tcPr>
-          <w:p>
-            <w:pPr>
-              <w:spacing w:after="0"/>
-            </w:pPr>
-            <w:r>
-              <w:rPr>
-                <w:b w:val="false"/>
-                <w:bCs w:val="false"/>
-                <w:sz w:val="20"/>
-                <w:szCs w:val="20"/>
-              </w:rPr>
-              <w:t xml:space="preserve">252 req/s</w:t>
-            </w:r>
-          </w:p>
-        </w:tc>
-        <w:tc>
-          <w:tcPr>
-            <w:tcW w:type="dxa" w:w="1560"/>
-            <w:tcBorders>
-              <w:top w:val="single" w:color="CCCCCC" w:sz="1"/>
-              <w:left w:val="single" w:color="CCCCCC" w:sz="1"/>
-              <w:bottom w:val="single" w:color="CCCCCC" w:sz="1"/>
-              <w:right w:val="single" w:color="CCCCCC" w:sz="1"/>
-            </w:tcBorders>
-            <w:tcMar>
-              <w:top w:type="dxa" w:w="60"/>
-              <w:left w:type="dxa" w:w="110"/>
-              <w:bottom w:type="dxa" w:w="60"/>
-              <w:right w:type="dxa" w:w="110"/>
-            </w:tcMar>
-            <w:vAlign w:val="center"/>
-          </w:tcPr>
-          <w:p>
-            <w:pPr>
-              <w:spacing w:after="0"/>
-            </w:pPr>
-            <w:r>
-              <w:rPr>
-                <w:b w:val="false"/>
-                <w:bCs w:val="false"/>
-                <w:sz w:val="20"/>
-                <w:szCs w:val="20"/>
-              </w:rPr>
-              <w:t xml:space="preserve">76 ms</w:t>
-            </w:r>
-          </w:p>
-        </w:tc>
-        <w:tc>
-          <w:tcPr>
-            <w:tcW w:type="dxa" w:w="1560"/>
-            <w:tcBorders>
-              <w:top w:val="single" w:color="CCCCCC" w:sz="1"/>
-              <w:left w:val="single" w:color="CCCCCC" w:sz="1"/>
-              <w:bottom w:val="single" w:color="CCCCCC" w:sz="1"/>
-              <w:right w:val="single" w:color="CCCCCC" w:sz="1"/>
-            </w:tcBorders>
-            <w:tcMar>
-              <w:top w:type="dxa" w:w="60"/>
-              <w:left w:type="dxa" w:w="110"/>
-              <w:bottom w:type="dxa" w:w="60"/>
-              <w:right w:type="dxa" w:w="110"/>
-            </w:tcMar>
-            <w:vAlign w:val="center"/>
-          </w:tcPr>
-          <w:p>
-            <w:pPr>
-              <w:spacing w:after="0"/>
-            </w:pPr>
-            <w:r>
-              <w:rPr>
-                <w:b w:val="false"/>
-                <w:bCs w:val="false"/>
-                <w:sz w:val="20"/>
-                <w:szCs w:val="20"/>
-              </w:rPr>
-              <w:t xml:space="preserve">733 ms</w:t>
-            </w:r>
-          </w:p>
-        </w:tc>
-        <w:tc>
-          <w:tcPr>
-            <w:tcW w:type="dxa" w:w="1560"/>
-            <w:tcBorders>
-              <w:top w:val="single" w:color="CCCCCC" w:sz="1"/>
-              <w:left w:val="single" w:color="CCCCCC" w:sz="1"/>
-              <w:bottom w:val="single" w:color="CCCCCC" w:sz="1"/>
-              <w:right w:val="single" w:color="CCCCCC" w:sz="1"/>
-            </w:tcBorders>
-            <w:tcMar>
-              <w:top w:type="dxa" w:w="60"/>
-              <w:left w:type="dxa" w:w="110"/>
-              <w:bottom w:type="dxa" w:w="60"/>
-              <w:right w:type="dxa" w:w="110"/>
-            </w:tcMar>
-            <w:vAlign w:val="center"/>
-          </w:tcPr>
-          <w:p>
-            <w:pPr>
-              <w:spacing w:after="0"/>
-            </w:pPr>
-            <w:r>
-              <w:rPr>
-                <w:b w:val="false"/>
-                <w:bCs w:val="false"/>
-                <w:sz w:val="20"/>
-                <w:szCs w:val="20"/>
-              </w:rPr>
-              <w:t xml:space="preserve">1153 ms</w:t>
-            </w:r>
-          </w:p>
-        </w:tc>
-        <w:tc>
-          <w:tcPr>
-            <w:tcW w:type="dxa" w:w="1560"/>
-            <w:tcBorders>
-              <w:top w:val="single" w:color="CCCCCC" w:sz="1"/>
-              <w:left w:val="single" w:color="CCCCCC" w:sz="1"/>
-              <w:bottom w:val="single" w:color="CCCCCC" w:sz="1"/>
-              <w:right w:val="single" w:color="CCCCCC" w:sz="1"/>
-            </w:tcBorders>
-            <w:tcMar>
-              <w:top w:type="dxa" w:w="60"/>
-              <w:left w:type="dxa" w:w="110"/>
-              <w:bottom w:type="dxa" w:w="60"/>
-              <w:right w:type="dxa" w:w="110"/>
-            </w:tcMar>
-            <w:vAlign w:val="center"/>
-          </w:tcPr>
-          <w:p>
-            <w:pPr>
-              <w:spacing w:after="0"/>
-            </w:pPr>
-            <w:r>
-              <w:rPr>
-                <w:b w:val="false"/>
-                <w:bCs w:val="false"/>
-                <w:sz w:val="20"/>
-                <w:szCs w:val="20"/>
-              </w:rPr>
-              <w:t xml:space="preserve">0.07%</w:t>
+            <w:tcW w:type="dxa" w:w="2340"/>
+            <w:tcBorders>
+              <w:top w:val="single" w:color="CCCCCC" w:sz="1"/>
+              <w:left w:val="single" w:color="CCCCCC" w:sz="1"/>
+              <w:bottom w:val="single" w:color="CCCCCC" w:sz="1"/>
+              <w:right w:val="single" w:color="CCCCCC" w:sz="1"/>
+            </w:tcBorders>
+            <w:tcMar>
+              <w:top w:type="dxa" w:w="60"/>
+              <w:left w:type="dxa" w:w="110"/>
+              <w:bottom w:type="dxa" w:w="60"/>
+              <w:right w:type="dxa" w:w="110"/>
+            </w:tcMar>
+            <w:vAlign w:val="center"/>
+          </w:tcPr>
+          <w:p>
+            <w:pPr>
+              <w:spacing w:after="0"/>
+            </w:pPr>
+            <w:r>
+              <w:rPr>
+                <w:b w:val="false"/>
+                <w:bCs w:val="false"/>
+                <w:sz w:val="20"/>
+                <w:szCs w:val="20"/>
+              </w:rPr>
+              <w:t xml:space="preserve">25</w:t>
+            </w:r>
+          </w:p>
+        </w:tc>
+        <w:tc>
+          <w:tcPr>
+            <w:tcW w:type="dxa" w:w="2340"/>
+            <w:tcBorders>
+              <w:top w:val="single" w:color="CCCCCC" w:sz="1"/>
+              <w:left w:val="single" w:color="CCCCCC" w:sz="1"/>
+              <w:bottom w:val="single" w:color="CCCCCC" w:sz="1"/>
+              <w:right w:val="single" w:color="CCCCCC" w:sz="1"/>
+            </w:tcBorders>
+            <w:tcMar>
+              <w:top w:type="dxa" w:w="60"/>
+              <w:left w:type="dxa" w:w="110"/>
+              <w:bottom w:type="dxa" w:w="60"/>
+              <w:right w:type="dxa" w:w="110"/>
+            </w:tcMar>
+            <w:vAlign w:val="center"/>
+          </w:tcPr>
+          <w:p>
+            <w:pPr>
+              <w:spacing w:after="0"/>
+            </w:pPr>
+            <w:r>
+              <w:rPr>
+                <w:b w:val="false"/>
+                <w:bCs w:val="false"/>
+                <w:sz w:val="20"/>
+                <w:szCs w:val="20"/>
+              </w:rPr>
+              <w:t xml:space="preserve">322  (peak)</w:t>
+            </w:r>
+          </w:p>
+        </w:tc>
+        <w:tc>
+          <w:tcPr>
+            <w:tcW w:type="dxa" w:w="2340"/>
+            <w:tcBorders>
+              <w:top w:val="single" w:color="CCCCCC" w:sz="1"/>
+              <w:left w:val="single" w:color="CCCCCC" w:sz="1"/>
+              <w:bottom w:val="single" w:color="CCCCCC" w:sz="1"/>
+              <w:right w:val="single" w:color="CCCCCC" w:sz="1"/>
+            </w:tcBorders>
+            <w:tcMar>
+              <w:top w:type="dxa" w:w="60"/>
+              <w:left w:type="dxa" w:w="110"/>
+              <w:bottom w:type="dxa" w:w="60"/>
+              <w:right w:type="dxa" w:w="110"/>
+            </w:tcMar>
+            <w:vAlign w:val="center"/>
+          </w:tcPr>
+          <w:p>
+            <w:pPr>
+              <w:spacing w:after="0"/>
+            </w:pPr>
+            <w:r>
+              <w:rPr>
+                <w:b w:val="false"/>
+                <w:bCs w:val="false"/>
+                <w:sz w:val="20"/>
+                <w:szCs w:val="20"/>
+              </w:rPr>
+              <w:t xml:space="preserve">56 ms</w:t>
+            </w:r>
+          </w:p>
+        </w:tc>
+        <w:tc>
+          <w:tcPr>
+            <w:tcW w:type="dxa" w:w="2340"/>
+            <w:tcBorders>
+              <w:top w:val="single" w:color="CCCCCC" w:sz="1"/>
+              <w:left w:val="single" w:color="CCCCCC" w:sz="1"/>
+              <w:bottom w:val="single" w:color="CCCCCC" w:sz="1"/>
+              <w:right w:val="single" w:color="CCCCCC" w:sz="1"/>
+            </w:tcBorders>
+            <w:tcMar>
+              <w:top w:type="dxa" w:w="60"/>
+              <w:left w:type="dxa" w:w="110"/>
+              <w:bottom w:type="dxa" w:w="60"/>
+              <w:right w:type="dxa" w:w="110"/>
+            </w:tcMar>
+            <w:vAlign w:val="center"/>
+          </w:tcPr>
+          <w:p>
+            <w:pPr>
+              <w:spacing w:after="0"/>
+            </w:pPr>
+            <w:r>
+              <w:rPr>
+                <w:b w:val="false"/>
+                <w:bCs w:val="false"/>
+                <w:sz w:val="20"/>
+                <w:szCs w:val="20"/>
+              </w:rPr>
+              <w:t xml:space="preserve">230 ms</w:t>
             </w:r>
           </w:p>
         </w:tc>
@@ -2504,7 +2378,406 @@
         </w:trPr>
         <w:tc>
           <w:tcPr>
-            <w:tcW w:type="dxa" w:w="1560"/>
+            <w:tcW w:type="dxa" w:w="2340"/>
+            <w:tcBorders>
+              <w:top w:val="single" w:color="CCCCCC" w:sz="1"/>
+              <w:left w:val="single" w:color="CCCCCC" w:sz="1"/>
+              <w:bottom w:val="single" w:color="CCCCCC" w:sz="1"/>
+              <w:right w:val="single" w:color="CCCCCC" w:sz="1"/>
+            </w:tcBorders>
+            <w:tcMar>
+              <w:top w:type="dxa" w:w="60"/>
+              <w:left w:type="dxa" w:w="110"/>
+              <w:bottom w:type="dxa" w:w="60"/>
+              <w:right w:type="dxa" w:w="110"/>
+            </w:tcMar>
+            <w:vAlign w:val="center"/>
+          </w:tcPr>
+          <w:p>
+            <w:pPr>
+              <w:spacing w:after="0"/>
+            </w:pPr>
+            <w:r>
+              <w:rPr>
+                <w:b w:val="false"/>
+                <w:bCs w:val="false"/>
+                <w:sz w:val="20"/>
+                <w:szCs w:val="20"/>
+              </w:rPr>
+              <w:t xml:space="preserve">50</w:t>
+            </w:r>
+          </w:p>
+        </w:tc>
+        <w:tc>
+          <w:tcPr>
+            <w:tcW w:type="dxa" w:w="2340"/>
+            <w:tcBorders>
+              <w:top w:val="single" w:color="CCCCCC" w:sz="1"/>
+              <w:left w:val="single" w:color="CCCCCC" w:sz="1"/>
+              <w:bottom w:val="single" w:color="CCCCCC" w:sz="1"/>
+              <w:right w:val="single" w:color="CCCCCC" w:sz="1"/>
+            </w:tcBorders>
+            <w:tcMar>
+              <w:top w:type="dxa" w:w="60"/>
+              <w:left w:type="dxa" w:w="110"/>
+              <w:bottom w:type="dxa" w:w="60"/>
+              <w:right w:type="dxa" w:w="110"/>
+            </w:tcMar>
+            <w:vAlign w:val="center"/>
+          </w:tcPr>
+          <w:p>
+            <w:pPr>
+              <w:spacing w:after="0"/>
+            </w:pPr>
+            <w:r>
+              <w:rPr>
+                <w:b w:val="false"/>
+                <w:bCs w:val="false"/>
+                <w:sz w:val="20"/>
+                <w:szCs w:val="20"/>
+              </w:rPr>
+              <w:t xml:space="preserve">187</w:t>
+            </w:r>
+          </w:p>
+        </w:tc>
+        <w:tc>
+          <w:tcPr>
+            <w:tcW w:type="dxa" w:w="2340"/>
+            <w:tcBorders>
+              <w:top w:val="single" w:color="CCCCCC" w:sz="1"/>
+              <w:left w:val="single" w:color="CCCCCC" w:sz="1"/>
+              <w:bottom w:val="single" w:color="CCCCCC" w:sz="1"/>
+              <w:right w:val="single" w:color="CCCCCC" w:sz="1"/>
+            </w:tcBorders>
+            <w:tcMar>
+              <w:top w:type="dxa" w:w="60"/>
+              <w:left w:type="dxa" w:w="110"/>
+              <w:bottom w:type="dxa" w:w="60"/>
+              <w:right w:type="dxa" w:w="110"/>
+            </w:tcMar>
+            <w:vAlign w:val="center"/>
+          </w:tcPr>
+          <w:p>
+            <w:pPr>
+              <w:spacing w:after="0"/>
+            </w:pPr>
+            <w:r>
+              <w:rPr>
+                <w:b w:val="false"/>
+                <w:bCs w:val="false"/>
+                <w:sz w:val="20"/>
+                <w:szCs w:val="20"/>
+              </w:rPr>
+              <w:t xml:space="preserve">223 ms</w:t>
+            </w:r>
+          </w:p>
+        </w:tc>
+        <w:tc>
+          <w:tcPr>
+            <w:tcW w:type="dxa" w:w="2340"/>
+            <w:tcBorders>
+              <w:top w:val="single" w:color="CCCCCC" w:sz="1"/>
+              <w:left w:val="single" w:color="CCCCCC" w:sz="1"/>
+              <w:bottom w:val="single" w:color="CCCCCC" w:sz="1"/>
+              <w:right w:val="single" w:color="CCCCCC" w:sz="1"/>
+            </w:tcBorders>
+            <w:tcMar>
+              <w:top w:type="dxa" w:w="60"/>
+              <w:left w:type="dxa" w:w="110"/>
+              <w:bottom w:type="dxa" w:w="60"/>
+              <w:right w:type="dxa" w:w="110"/>
+            </w:tcMar>
+            <w:vAlign w:val="center"/>
+          </w:tcPr>
+          <w:p>
+            <w:pPr>
+              <w:spacing w:after="0"/>
+            </w:pPr>
+            <w:r>
+              <w:rPr>
+                <w:b w:val="false"/>
+                <w:bCs w:val="false"/>
+                <w:sz w:val="20"/>
+                <w:szCs w:val="20"/>
+              </w:rPr>
+              <w:t xml:space="preserve">730 ms</w:t>
+            </w:r>
+          </w:p>
+        </w:tc>
+      </w:tr>
+      <w:tr>
+        <w:trPr>
+          <w:tblHeader w:val="false"/>
+        </w:trPr>
+        <w:tc>
+          <w:tcPr>
+            <w:tcW w:type="dxa" w:w="2340"/>
+            <w:tcBorders>
+              <w:top w:val="single" w:color="CCCCCC" w:sz="1"/>
+              <w:left w:val="single" w:color="CCCCCC" w:sz="1"/>
+              <w:bottom w:val="single" w:color="CCCCCC" w:sz="1"/>
+              <w:right w:val="single" w:color="CCCCCC" w:sz="1"/>
+            </w:tcBorders>
+            <w:tcMar>
+              <w:top w:type="dxa" w:w="60"/>
+              <w:left w:type="dxa" w:w="110"/>
+              <w:bottom w:type="dxa" w:w="60"/>
+              <w:right w:type="dxa" w:w="110"/>
+            </w:tcMar>
+            <w:vAlign w:val="center"/>
+          </w:tcPr>
+          <w:p>
+            <w:pPr>
+              <w:spacing w:after="0"/>
+            </w:pPr>
+            <w:r>
+              <w:rPr>
+                <w:b w:val="false"/>
+                <w:bCs w:val="false"/>
+                <w:sz w:val="20"/>
+                <w:szCs w:val="20"/>
+              </w:rPr>
+              <w:t xml:space="preserve">100</w:t>
+            </w:r>
+          </w:p>
+        </w:tc>
+        <w:tc>
+          <w:tcPr>
+            <w:tcW w:type="dxa" w:w="2340"/>
+            <w:tcBorders>
+              <w:top w:val="single" w:color="CCCCCC" w:sz="1"/>
+              <w:left w:val="single" w:color="CCCCCC" w:sz="1"/>
+              <w:bottom w:val="single" w:color="CCCCCC" w:sz="1"/>
+              <w:right w:val="single" w:color="CCCCCC" w:sz="1"/>
+            </w:tcBorders>
+            <w:tcMar>
+              <w:top w:type="dxa" w:w="60"/>
+              <w:left w:type="dxa" w:w="110"/>
+              <w:bottom w:type="dxa" w:w="60"/>
+              <w:right w:type="dxa" w:w="110"/>
+            </w:tcMar>
+            <w:vAlign w:val="center"/>
+          </w:tcPr>
+          <w:p>
+            <w:pPr>
+              <w:spacing w:after="0"/>
+            </w:pPr>
+            <w:r>
+              <w:rPr>
+                <w:b w:val="false"/>
+                <w:bCs w:val="false"/>
+                <w:sz w:val="20"/>
+                <w:szCs w:val="20"/>
+              </w:rPr>
+              <w:t xml:space="preserve">115</w:t>
+            </w:r>
+          </w:p>
+        </w:tc>
+        <w:tc>
+          <w:tcPr>
+            <w:tcW w:type="dxa" w:w="2340"/>
+            <w:tcBorders>
+              <w:top w:val="single" w:color="CCCCCC" w:sz="1"/>
+              <w:left w:val="single" w:color="CCCCCC" w:sz="1"/>
+              <w:bottom w:val="single" w:color="CCCCCC" w:sz="1"/>
+              <w:right w:val="single" w:color="CCCCCC" w:sz="1"/>
+            </w:tcBorders>
+            <w:tcMar>
+              <w:top w:type="dxa" w:w="60"/>
+              <w:left w:type="dxa" w:w="110"/>
+              <w:bottom w:type="dxa" w:w="60"/>
+              <w:right w:type="dxa" w:w="110"/>
+            </w:tcMar>
+            <w:vAlign w:val="center"/>
+          </w:tcPr>
+          <w:p>
+            <w:pPr>
+              <w:spacing w:after="0"/>
+            </w:pPr>
+            <w:r>
+              <w:rPr>
+                <w:b w:val="false"/>
+                <w:bCs w:val="false"/>
+                <w:sz w:val="20"/>
+                <w:szCs w:val="20"/>
+              </w:rPr>
+              <w:t xml:space="preserve">627 ms</w:t>
+            </w:r>
+          </w:p>
+        </w:tc>
+        <w:tc>
+          <w:tcPr>
+            <w:tcW w:type="dxa" w:w="2340"/>
+            <w:tcBorders>
+              <w:top w:val="single" w:color="CCCCCC" w:sz="1"/>
+              <w:left w:val="single" w:color="CCCCCC" w:sz="1"/>
+              <w:bottom w:val="single" w:color="CCCCCC" w:sz="1"/>
+              <w:right w:val="single" w:color="CCCCCC" w:sz="1"/>
+            </w:tcBorders>
+            <w:tcMar>
+              <w:top w:type="dxa" w:w="60"/>
+              <w:left w:type="dxa" w:w="110"/>
+              <w:bottom w:type="dxa" w:w="60"/>
+              <w:right w:type="dxa" w:w="110"/>
+            </w:tcMar>
+            <w:vAlign w:val="center"/>
+          </w:tcPr>
+          <w:p>
+            <w:pPr>
+              <w:spacing w:after="0"/>
+            </w:pPr>
+            <w:r>
+              <w:rPr>
+                <w:b w:val="false"/>
+                <w:bCs w:val="false"/>
+                <w:sz w:val="20"/>
+                <w:szCs w:val="20"/>
+              </w:rPr>
+              <w:t xml:space="preserve">2.6 s</w:t>
+            </w:r>
+          </w:p>
+        </w:tc>
+      </w:tr>
+      <w:tr>
+        <w:trPr>
+          <w:tblHeader w:val="false"/>
+        </w:trPr>
+        <w:tc>
+          <w:tcPr>
+            <w:tcW w:type="dxa" w:w="2340"/>
+            <w:tcBorders>
+              <w:top w:val="single" w:color="CCCCCC" w:sz="1"/>
+              <w:left w:val="single" w:color="CCCCCC" w:sz="1"/>
+              <w:bottom w:val="single" w:color="CCCCCC" w:sz="1"/>
+              <w:right w:val="single" w:color="CCCCCC" w:sz="1"/>
+            </w:tcBorders>
+            <w:tcMar>
+              <w:top w:type="dxa" w:w="60"/>
+              <w:left w:type="dxa" w:w="110"/>
+              <w:bottom w:type="dxa" w:w="60"/>
+              <w:right w:type="dxa" w:w="110"/>
+            </w:tcMar>
+            <w:vAlign w:val="center"/>
+          </w:tcPr>
+          <w:p>
+            <w:pPr>
+              <w:spacing w:after="0"/>
+            </w:pPr>
+            <w:r>
+              <w:rPr>
+                <w:b w:val="false"/>
+                <w:bCs w:val="false"/>
+                <w:sz w:val="20"/>
+                <w:szCs w:val="20"/>
+              </w:rPr>
+              <w:t xml:space="preserve">150</w:t>
+            </w:r>
+          </w:p>
+        </w:tc>
+        <w:tc>
+          <w:tcPr>
+            <w:tcW w:type="dxa" w:w="2340"/>
+            <w:tcBorders>
+              <w:top w:val="single" w:color="CCCCCC" w:sz="1"/>
+              <w:left w:val="single" w:color="CCCCCC" w:sz="1"/>
+              <w:bottom w:val="single" w:color="CCCCCC" w:sz="1"/>
+              <w:right w:val="single" w:color="CCCCCC" w:sz="1"/>
+            </w:tcBorders>
+            <w:tcMar>
+              <w:top w:type="dxa" w:w="60"/>
+              <w:left w:type="dxa" w:w="110"/>
+              <w:bottom w:type="dxa" w:w="60"/>
+              <w:right w:type="dxa" w:w="110"/>
+            </w:tcMar>
+            <w:vAlign w:val="center"/>
+          </w:tcPr>
+          <w:p>
+            <w:pPr>
+              <w:spacing w:after="0"/>
+            </w:pPr>
+            <w:r>
+              <w:rPr>
+                <w:b w:val="false"/>
+                <w:bCs w:val="false"/>
+                <w:sz w:val="20"/>
+                <w:szCs w:val="20"/>
+              </w:rPr>
+              <w:t xml:space="preserve">97</w:t>
+            </w:r>
+          </w:p>
+        </w:tc>
+        <w:tc>
+          <w:tcPr>
+            <w:tcW w:type="dxa" w:w="2340"/>
+            <w:tcBorders>
+              <w:top w:val="single" w:color="CCCCCC" w:sz="1"/>
+              <w:left w:val="single" w:color="CCCCCC" w:sz="1"/>
+              <w:bottom w:val="single" w:color="CCCCCC" w:sz="1"/>
+              <w:right w:val="single" w:color="CCCCCC" w:sz="1"/>
+            </w:tcBorders>
+            <w:tcMar>
+              <w:top w:type="dxa" w:w="60"/>
+              <w:left w:type="dxa" w:w="110"/>
+              <w:bottom w:type="dxa" w:w="60"/>
+              <w:right w:type="dxa" w:w="110"/>
+            </w:tcMar>
+            <w:vAlign w:val="center"/>
+          </w:tcPr>
+          <w:p>
+            <w:pPr>
+              <w:spacing w:after="0"/>
+            </w:pPr>
+            <w:r>
+              <w:rPr>
+                <w:b w:val="false"/>
+                <w:bCs w:val="false"/>
+                <w:sz w:val="20"/>
+                <w:szCs w:val="20"/>
+              </w:rPr>
+              <w:t xml:space="preserve">1.1 s</w:t>
+            </w:r>
+          </w:p>
+        </w:tc>
+        <w:tc>
+          <w:tcPr>
+            <w:tcW w:type="dxa" w:w="2340"/>
+            <w:tcBorders>
+              <w:top w:val="single" w:color="CCCCCC" w:sz="1"/>
+              <w:left w:val="single" w:color="CCCCCC" w:sz="1"/>
+              <w:bottom w:val="single" w:color="CCCCCC" w:sz="1"/>
+              <w:right w:val="single" w:color="CCCCCC" w:sz="1"/>
+            </w:tcBorders>
+            <w:tcMar>
+              <w:top w:type="dxa" w:w="60"/>
+              <w:left w:type="dxa" w:w="110"/>
+              <w:bottom w:type="dxa" w:w="60"/>
+              <w:right w:type="dxa" w:w="110"/>
+            </w:tcMar>
+            <w:vAlign w:val="center"/>
+          </w:tcPr>
+          <w:p>
+            <w:pPr>
+              <w:spacing w:after="0"/>
+            </w:pPr>
+            <w:r>
+              <w:rPr>
+                <w:b w:val="false"/>
+                <w:bCs w:val="false"/>
+                <w:sz w:val="20"/>
+                <w:szCs w:val="20"/>
+              </w:rPr>
+              <w:t xml:space="preserve">5.0 s</w:t>
+            </w:r>
+          </w:p>
+        </w:tc>
+      </w:tr>
+      <w:tr>
+        <w:trPr>
+          <w:tblHeader w:val="false"/>
+        </w:trPr>
+        <w:tc>
+          <w:tcPr>
+            <w:tcW w:type="dxa" w:w="2340"/>
             <w:tcBorders>
               <w:top w:val="single" w:color="CCCCCC" w:sz="1"/>
               <w:left w:val="single" w:color="CCCCCC" w:sz="1"/>
@@ -2536,166 +2809,414 @@
         </w:tc>
         <w:tc>
           <w:tcPr>
-            <w:tcW w:type="dxa" w:w="1560"/>
-            <w:tcBorders>
-              <w:top w:val="single" w:color="CCCCCC" w:sz="1"/>
-              <w:left w:val="single" w:color="CCCCCC" w:sz="1"/>
-              <w:bottom w:val="single" w:color="CCCCCC" w:sz="1"/>
-              <w:right w:val="single" w:color="CCCCCC" w:sz="1"/>
-            </w:tcBorders>
-            <w:tcMar>
-              <w:top w:type="dxa" w:w="60"/>
-              <w:left w:type="dxa" w:w="110"/>
-              <w:bottom w:type="dxa" w:w="60"/>
-              <w:right w:type="dxa" w:w="110"/>
-            </w:tcMar>
-            <w:vAlign w:val="center"/>
-          </w:tcPr>
-          <w:p>
-            <w:pPr>
-              <w:spacing w:after="0"/>
-            </w:pPr>
-            <w:r>
-              <w:rPr>
-                <w:b w:val="false"/>
-                <w:bCs w:val="false"/>
-                <w:sz w:val="20"/>
-                <w:szCs w:val="20"/>
-              </w:rPr>
-              <w:t xml:space="preserve">90 req/s</w:t>
-            </w:r>
-          </w:p>
-        </w:tc>
-        <w:tc>
-          <w:tcPr>
-            <w:tcW w:type="dxa" w:w="1560"/>
-            <w:tcBorders>
-              <w:top w:val="single" w:color="CCCCCC" w:sz="1"/>
-              <w:left w:val="single" w:color="CCCCCC" w:sz="1"/>
-              <w:bottom w:val="single" w:color="CCCCCC" w:sz="1"/>
-              <w:right w:val="single" w:color="CCCCCC" w:sz="1"/>
-            </w:tcBorders>
-            <w:tcMar>
-              <w:top w:type="dxa" w:w="60"/>
-              <w:left w:type="dxa" w:w="110"/>
-              <w:bottom w:type="dxa" w:w="60"/>
-              <w:right w:type="dxa" w:w="110"/>
-            </w:tcMar>
-            <w:vAlign w:val="center"/>
-          </w:tcPr>
-          <w:p>
-            <w:pPr>
-              <w:spacing w:after="0"/>
-            </w:pPr>
-            <w:r>
-              <w:rPr>
-                <w:b w:val="false"/>
-                <w:bCs w:val="false"/>
-                <w:sz w:val="20"/>
-                <w:szCs w:val="20"/>
-              </w:rPr>
-              <w:t xml:space="preserve">1673 ms</w:t>
-            </w:r>
-          </w:p>
-        </w:tc>
-        <w:tc>
-          <w:tcPr>
-            <w:tcW w:type="dxa" w:w="1560"/>
-            <w:tcBorders>
-              <w:top w:val="single" w:color="CCCCCC" w:sz="1"/>
-              <w:left w:val="single" w:color="CCCCCC" w:sz="1"/>
-              <w:bottom w:val="single" w:color="CCCCCC" w:sz="1"/>
-              <w:right w:val="single" w:color="CCCCCC" w:sz="1"/>
-            </w:tcBorders>
-            <w:tcMar>
-              <w:top w:type="dxa" w:w="60"/>
-              <w:left w:type="dxa" w:w="110"/>
-              <w:bottom w:type="dxa" w:w="60"/>
-              <w:right w:type="dxa" w:w="110"/>
-            </w:tcMar>
-            <w:vAlign w:val="center"/>
-          </w:tcPr>
-          <w:p>
-            <w:pPr>
-              <w:spacing w:after="0"/>
-            </w:pPr>
-            <w:r>
-              <w:rPr>
-                <w:b w:val="false"/>
-                <w:bCs w:val="false"/>
-                <w:sz w:val="20"/>
-                <w:szCs w:val="20"/>
-              </w:rPr>
-              <w:t xml:space="preserve">5879 ms</w:t>
-            </w:r>
-          </w:p>
-        </w:tc>
-        <w:tc>
-          <w:tcPr>
-            <w:tcW w:type="dxa" w:w="1560"/>
-            <w:tcBorders>
-              <w:top w:val="single" w:color="CCCCCC" w:sz="1"/>
-              <w:left w:val="single" w:color="CCCCCC" w:sz="1"/>
-              <w:bottom w:val="single" w:color="CCCCCC" w:sz="1"/>
-              <w:right w:val="single" w:color="CCCCCC" w:sz="1"/>
-            </w:tcBorders>
-            <w:tcMar>
-              <w:top w:type="dxa" w:w="60"/>
-              <w:left w:type="dxa" w:w="110"/>
-              <w:bottom w:type="dxa" w:w="60"/>
-              <w:right w:type="dxa" w:w="110"/>
-            </w:tcMar>
-            <w:vAlign w:val="center"/>
-          </w:tcPr>
-          <w:p>
-            <w:pPr>
-              <w:spacing w:after="0"/>
-            </w:pPr>
-            <w:r>
-              <w:rPr>
-                <w:b w:val="false"/>
-                <w:bCs w:val="false"/>
-                <w:sz w:val="20"/>
-                <w:szCs w:val="20"/>
-              </w:rPr>
-              <w:t xml:space="preserve">6547 ms</w:t>
-            </w:r>
-          </w:p>
-        </w:tc>
-        <w:tc>
-          <w:tcPr>
-            <w:tcW w:type="dxa" w:w="1560"/>
-            <w:tcBorders>
-              <w:top w:val="single" w:color="CCCCCC" w:sz="1"/>
-              <w:left w:val="single" w:color="CCCCCC" w:sz="1"/>
-              <w:bottom w:val="single" w:color="CCCCCC" w:sz="1"/>
-              <w:right w:val="single" w:color="CCCCCC" w:sz="1"/>
-            </w:tcBorders>
-            <w:tcMar>
-              <w:top w:type="dxa" w:w="60"/>
-              <w:left w:type="dxa" w:w="110"/>
-              <w:bottom w:type="dxa" w:w="60"/>
-              <w:right w:type="dxa" w:w="110"/>
-            </w:tcMar>
-            <w:vAlign w:val="center"/>
-          </w:tcPr>
-          <w:p>
-            <w:pPr>
-              <w:spacing w:after="0"/>
-            </w:pPr>
-            <w:r>
-              <w:rPr>
-                <w:b w:val="false"/>
-                <w:bCs w:val="false"/>
-                <w:sz w:val="20"/>
-                <w:szCs w:val="20"/>
-              </w:rPr>
-              <w:t xml:space="preserve">0.55%</w:t>
+            <w:tcW w:type="dxa" w:w="2340"/>
+            <w:tcBorders>
+              <w:top w:val="single" w:color="CCCCCC" w:sz="1"/>
+              <w:left w:val="single" w:color="CCCCCC" w:sz="1"/>
+              <w:bottom w:val="single" w:color="CCCCCC" w:sz="1"/>
+              <w:right w:val="single" w:color="CCCCCC" w:sz="1"/>
+            </w:tcBorders>
+            <w:tcMar>
+              <w:top w:type="dxa" w:w="60"/>
+              <w:left w:type="dxa" w:w="110"/>
+              <w:bottom w:type="dxa" w:w="60"/>
+              <w:right w:type="dxa" w:w="110"/>
+            </w:tcMar>
+            <w:vAlign w:val="center"/>
+          </w:tcPr>
+          <w:p>
+            <w:pPr>
+              <w:spacing w:after="0"/>
+            </w:pPr>
+            <w:r>
+              <w:rPr>
+                <w:b w:val="false"/>
+                <w:bCs w:val="false"/>
+                <w:sz w:val="20"/>
+                <w:szCs w:val="20"/>
+              </w:rPr>
+              <w:t xml:space="preserve">88</w:t>
+            </w:r>
+          </w:p>
+        </w:tc>
+        <w:tc>
+          <w:tcPr>
+            <w:tcW w:type="dxa" w:w="2340"/>
+            <w:tcBorders>
+              <w:top w:val="single" w:color="CCCCCC" w:sz="1"/>
+              <w:left w:val="single" w:color="CCCCCC" w:sz="1"/>
+              <w:bottom w:val="single" w:color="CCCCCC" w:sz="1"/>
+              <w:right w:val="single" w:color="CCCCCC" w:sz="1"/>
+            </w:tcBorders>
+            <w:tcMar>
+              <w:top w:type="dxa" w:w="60"/>
+              <w:left w:type="dxa" w:w="110"/>
+              <w:bottom w:type="dxa" w:w="60"/>
+              <w:right w:type="dxa" w:w="110"/>
+            </w:tcMar>
+            <w:vAlign w:val="center"/>
+          </w:tcPr>
+          <w:p>
+            <w:pPr>
+              <w:spacing w:after="0"/>
+            </w:pPr>
+            <w:r>
+              <w:rPr>
+                <w:b w:val="false"/>
+                <w:bCs w:val="false"/>
+                <w:sz w:val="20"/>
+                <w:szCs w:val="20"/>
+              </w:rPr>
+              <w:t xml:space="preserve">2.2 s</w:t>
+            </w:r>
+          </w:p>
+        </w:tc>
+        <w:tc>
+          <w:tcPr>
+            <w:tcW w:type="dxa" w:w="2340"/>
+            <w:tcBorders>
+              <w:top w:val="single" w:color="CCCCCC" w:sz="1"/>
+              <w:left w:val="single" w:color="CCCCCC" w:sz="1"/>
+              <w:bottom w:val="single" w:color="CCCCCC" w:sz="1"/>
+              <w:right w:val="single" w:color="CCCCCC" w:sz="1"/>
+            </w:tcBorders>
+            <w:tcMar>
+              <w:top w:type="dxa" w:w="60"/>
+              <w:left w:type="dxa" w:w="110"/>
+              <w:bottom w:type="dxa" w:w="60"/>
+              <w:right w:type="dxa" w:w="110"/>
+            </w:tcMar>
+            <w:vAlign w:val="center"/>
+          </w:tcPr>
+          <w:p>
+            <w:pPr>
+              <w:spacing w:after="0"/>
+            </w:pPr>
+            <w:r>
+              <w:rPr>
+                <w:b w:val="false"/>
+                <w:bCs w:val="false"/>
+                <w:sz w:val="20"/>
+                <w:szCs w:val="20"/>
+              </w:rPr>
+              <w:t xml:space="preserve">7.0 s</w:t>
+            </w:r>
+          </w:p>
+        </w:tc>
+      </w:tr>
+      <w:tr>
+        <w:trPr>
+          <w:tblHeader w:val="false"/>
+        </w:trPr>
+        <w:tc>
+          <w:tcPr>
+            <w:tcW w:type="dxa" w:w="2340"/>
+            <w:tcBorders>
+              <w:top w:val="single" w:color="CCCCCC" w:sz="1"/>
+              <w:left w:val="single" w:color="CCCCCC" w:sz="1"/>
+              <w:bottom w:val="single" w:color="CCCCCC" w:sz="1"/>
+              <w:right w:val="single" w:color="CCCCCC" w:sz="1"/>
+            </w:tcBorders>
+            <w:tcMar>
+              <w:top w:type="dxa" w:w="60"/>
+              <w:left w:type="dxa" w:w="110"/>
+              <w:bottom w:type="dxa" w:w="60"/>
+              <w:right w:type="dxa" w:w="110"/>
+            </w:tcMar>
+            <w:vAlign w:val="center"/>
+          </w:tcPr>
+          <w:p>
+            <w:pPr>
+              <w:spacing w:after="0"/>
+            </w:pPr>
+            <w:r>
+              <w:rPr>
+                <w:b w:val="false"/>
+                <w:bCs w:val="false"/>
+                <w:sz w:val="20"/>
+                <w:szCs w:val="20"/>
+              </w:rPr>
+              <w:t xml:space="preserve">300</w:t>
+            </w:r>
+          </w:p>
+        </w:tc>
+        <w:tc>
+          <w:tcPr>
+            <w:tcW w:type="dxa" w:w="2340"/>
+            <w:tcBorders>
+              <w:top w:val="single" w:color="CCCCCC" w:sz="1"/>
+              <w:left w:val="single" w:color="CCCCCC" w:sz="1"/>
+              <w:bottom w:val="single" w:color="CCCCCC" w:sz="1"/>
+              <w:right w:val="single" w:color="CCCCCC" w:sz="1"/>
+            </w:tcBorders>
+            <w:tcMar>
+              <w:top w:type="dxa" w:w="60"/>
+              <w:left w:type="dxa" w:w="110"/>
+              <w:bottom w:type="dxa" w:w="60"/>
+              <w:right w:type="dxa" w:w="110"/>
+            </w:tcMar>
+            <w:vAlign w:val="center"/>
+          </w:tcPr>
+          <w:p>
+            <w:pPr>
+              <w:spacing w:after="0"/>
+            </w:pPr>
+            <w:r>
+              <w:rPr>
+                <w:b w:val="false"/>
+                <w:bCs w:val="false"/>
+                <w:sz w:val="20"/>
+                <w:szCs w:val="20"/>
+              </w:rPr>
+              <w:t xml:space="preserve">78</w:t>
+            </w:r>
+          </w:p>
+        </w:tc>
+        <w:tc>
+          <w:tcPr>
+            <w:tcW w:type="dxa" w:w="2340"/>
+            <w:tcBorders>
+              <w:top w:val="single" w:color="CCCCCC" w:sz="1"/>
+              <w:left w:val="single" w:color="CCCCCC" w:sz="1"/>
+              <w:bottom w:val="single" w:color="CCCCCC" w:sz="1"/>
+              <w:right w:val="single" w:color="CCCCCC" w:sz="1"/>
+            </w:tcBorders>
+            <w:tcMar>
+              <w:top w:type="dxa" w:w="60"/>
+              <w:left w:type="dxa" w:w="110"/>
+              <w:bottom w:type="dxa" w:w="60"/>
+              <w:right w:type="dxa" w:w="110"/>
+            </w:tcMar>
+            <w:vAlign w:val="center"/>
+          </w:tcPr>
+          <w:p>
+            <w:pPr>
+              <w:spacing w:after="0"/>
+            </w:pPr>
+            <w:r>
+              <w:rPr>
+                <w:b w:val="false"/>
+                <w:bCs w:val="false"/>
+                <w:sz w:val="20"/>
+                <w:szCs w:val="20"/>
+              </w:rPr>
+              <w:t xml:space="preserve">5.2 s</w:t>
+            </w:r>
+          </w:p>
+        </w:tc>
+        <w:tc>
+          <w:tcPr>
+            <w:tcW w:type="dxa" w:w="2340"/>
+            <w:tcBorders>
+              <w:top w:val="single" w:color="CCCCCC" w:sz="1"/>
+              <w:left w:val="single" w:color="CCCCCC" w:sz="1"/>
+              <w:bottom w:val="single" w:color="CCCCCC" w:sz="1"/>
+              <w:right w:val="single" w:color="CCCCCC" w:sz="1"/>
+            </w:tcBorders>
+            <w:tcMar>
+              <w:top w:type="dxa" w:w="60"/>
+              <w:left w:type="dxa" w:w="110"/>
+              <w:bottom w:type="dxa" w:w="60"/>
+              <w:right w:type="dxa" w:w="110"/>
+            </w:tcMar>
+            <w:vAlign w:val="center"/>
+          </w:tcPr>
+          <w:p>
+            <w:pPr>
+              <w:spacing w:after="0"/>
+            </w:pPr>
+            <w:r>
+              <w:rPr>
+                <w:b w:val="false"/>
+                <w:bCs w:val="false"/>
+                <w:sz w:val="20"/>
+                <w:szCs w:val="20"/>
+              </w:rPr>
+              <w:t xml:space="preserve">14.7 s</w:t>
+            </w:r>
+          </w:p>
+        </w:tc>
+      </w:tr>
+      <w:tr>
+        <w:trPr>
+          <w:tblHeader w:val="false"/>
+        </w:trPr>
+        <w:tc>
+          <w:tcPr>
+            <w:tcW w:type="dxa" w:w="2340"/>
+            <w:tcBorders>
+              <w:top w:val="single" w:color="CCCCCC" w:sz="1"/>
+              <w:left w:val="single" w:color="CCCCCC" w:sz="1"/>
+              <w:bottom w:val="single" w:color="CCCCCC" w:sz="1"/>
+              <w:right w:val="single" w:color="CCCCCC" w:sz="1"/>
+            </w:tcBorders>
+            <w:tcMar>
+              <w:top w:type="dxa" w:w="60"/>
+              <w:left w:type="dxa" w:w="110"/>
+              <w:bottom w:type="dxa" w:w="60"/>
+              <w:right w:type="dxa" w:w="110"/>
+            </w:tcMar>
+            <w:vAlign w:val="center"/>
+          </w:tcPr>
+          <w:p>
+            <w:pPr>
+              <w:spacing w:after="0"/>
+            </w:pPr>
+            <w:r>
+              <w:rPr>
+                <w:b w:val="false"/>
+                <w:bCs w:val="false"/>
+                <w:sz w:val="20"/>
+                <w:szCs w:val="20"/>
+              </w:rPr>
+              <w:t xml:space="preserve">400</w:t>
+            </w:r>
+          </w:p>
+        </w:tc>
+        <w:tc>
+          <w:tcPr>
+            <w:tcW w:type="dxa" w:w="2340"/>
+            <w:tcBorders>
+              <w:top w:val="single" w:color="CCCCCC" w:sz="1"/>
+              <w:left w:val="single" w:color="CCCCCC" w:sz="1"/>
+              <w:bottom w:val="single" w:color="CCCCCC" w:sz="1"/>
+              <w:right w:val="single" w:color="CCCCCC" w:sz="1"/>
+            </w:tcBorders>
+            <w:tcMar>
+              <w:top w:type="dxa" w:w="60"/>
+              <w:left w:type="dxa" w:w="110"/>
+              <w:bottom w:type="dxa" w:w="60"/>
+              <w:right w:type="dxa" w:w="110"/>
+            </w:tcMar>
+            <w:vAlign w:val="center"/>
+          </w:tcPr>
+          <w:p>
+            <w:pPr>
+              <w:spacing w:after="0"/>
+            </w:pPr>
+            <w:r>
+              <w:rPr>
+                <w:b w:val="false"/>
+                <w:bCs w:val="false"/>
+                <w:sz w:val="20"/>
+                <w:szCs w:val="20"/>
+              </w:rPr>
+              <w:t xml:space="preserve">90</w:t>
+            </w:r>
+          </w:p>
+        </w:tc>
+        <w:tc>
+          <w:tcPr>
+            <w:tcW w:type="dxa" w:w="2340"/>
+            <w:tcBorders>
+              <w:top w:val="single" w:color="CCCCCC" w:sz="1"/>
+              <w:left w:val="single" w:color="CCCCCC" w:sz="1"/>
+              <w:bottom w:val="single" w:color="CCCCCC" w:sz="1"/>
+              <w:right w:val="single" w:color="CCCCCC" w:sz="1"/>
+            </w:tcBorders>
+            <w:tcMar>
+              <w:top w:type="dxa" w:w="60"/>
+              <w:left w:type="dxa" w:w="110"/>
+              <w:bottom w:type="dxa" w:w="60"/>
+              <w:right w:type="dxa" w:w="110"/>
+            </w:tcMar>
+            <w:vAlign w:val="center"/>
+          </w:tcPr>
+          <w:p>
+            <w:pPr>
+              <w:spacing w:after="0"/>
+            </w:pPr>
+            <w:r>
+              <w:rPr>
+                <w:b w:val="false"/>
+                <w:bCs w:val="false"/>
+                <w:sz w:val="20"/>
+                <w:szCs w:val="20"/>
+              </w:rPr>
+              <w:t xml:space="preserve">6.9 s</w:t>
+            </w:r>
+          </w:p>
+        </w:tc>
+        <w:tc>
+          <w:tcPr>
+            <w:tcW w:type="dxa" w:w="2340"/>
+            <w:tcBorders>
+              <w:top w:val="single" w:color="CCCCCC" w:sz="1"/>
+              <w:left w:val="single" w:color="CCCCCC" w:sz="1"/>
+              <w:bottom w:val="single" w:color="CCCCCC" w:sz="1"/>
+              <w:right w:val="single" w:color="CCCCCC" w:sz="1"/>
+            </w:tcBorders>
+            <w:tcMar>
+              <w:top w:type="dxa" w:w="60"/>
+              <w:left w:type="dxa" w:w="110"/>
+              <w:bottom w:type="dxa" w:w="60"/>
+              <w:right w:type="dxa" w:w="110"/>
+            </w:tcMar>
+            <w:vAlign w:val="center"/>
+          </w:tcPr>
+          <w:p>
+            <w:pPr>
+              <w:spacing w:after="0"/>
+            </w:pPr>
+            <w:r>
+              <w:rPr>
+                <w:b w:val="false"/>
+                <w:bCs w:val="false"/>
+                <w:sz w:val="20"/>
+                <w:szCs w:val="20"/>
+              </w:rPr>
+              <w:t xml:space="preserve">15.0 s</w:t>
             </w:r>
           </w:p>
         </w:tc>
       </w:tr>
     </w:tbl>
+    <w:p>
+      <w:pPr>
+        <w:spacing w:after="120" w:before="120"/>
+        <w:jc w:val="center"/>
+      </w:pPr>
+      <w:r>
+        <w:drawing>
+          <wp:inline distT="0" distB="0" distL="0" distR="0">
+            <wp:extent cx="5143500" cy="2857500"/>
+            <wp:effectExtent t="0" r="0" b="0" l="0"/>
+            <wp:docPr id="1" name="loadchart" descr="EC2 t3.small throughput and latency vs concurrency" title="Saturation curve"/>
+            <wp:cNvGraphicFramePr>
+              <a:graphicFrameLocks xmlns:a="http://schemas.openxmlformats.org/drawingml/2006/main" noChangeAspect="1"/>
+            </wp:cNvGraphicFramePr>
+            <a:graphic xmlns:a="http://schemas.openxmlformats.org/drawingml/2006/main">
+              <a:graphicData uri="http://schemas.openxmlformats.org/drawingml/2006/picture">
+                <pic:pic xmlns:pic="http://schemas.openxmlformats.org/drawingml/2006/picture">
+                  <pic:nvPicPr>
+                    <pic:cNvPr id="0" name="" descr=""/>
+                    <pic:cNvPicPr>
+                      <a:picLocks noChangeAspect="1" noChangeArrowheads="1"/>
+                    </pic:cNvPicPr>
+                  </pic:nvPicPr>
+                  <pic:blipFill>
+                    <a:blip r:embed="rId9" cstate="none"/>
+                    <a:srcRect/>
+                    <a:stretch>
+                      <a:fillRect/>
+                    </a:stretch>
+                  </pic:blipFill>
+                  <pic:spPr bwMode="auto">
+                    <a:xfrm>
+                      <a:off x="0" y="0"/>
+                      <a:ext cx="5143500" cy="2857500"/>
+                    </a:xfrm>
+                    <a:prstGeom prst="rect">
+                      <a:avLst/>
+                    </a:prstGeom>
+                  </pic:spPr>
+                </pic:pic>
+              </a:graphicData>
+            </a:graphic>
+          </wp:inline>
+        </w:drawing>
+      </w:r>
+    </w:p>
     <w:p>
       <w:pPr>
         <w:spacing w:after="120"/>
@@ -2705,7 +3226,7 @@
           <w:b/>
           <w:bCs/>
         </w:rPr>
-        <w:t xml:space="preserve">Key finding: from 50 to 200 concurrent connections the single instance’s throughput fell (252 → 90 req/s) while latency rose roughly 20×. The t3.small is already saturating at 200 concurrent connections even on a trivial endpoint — direct evidence of EC2’s single-instance scaling limit.</w:t>
+        <w:t xml:space="preserve">Key finding: throughput peaks at ~25 concurrent connections (322 req/s) and then collapses, while latency climbs steadily. The spike is sharpest between 150 and 200 concurrent connections (p95 crosses 5 s); by 300+ the instance is effectively broken, with p95 ≈ 15 s even on a trivial endpoint. The single t3.small’s usable ceiling is therefore ~50 concurrent connections, with breakdown at ~150–200 — direct, measured evidence of EC2’s single-instance scaling limit. (Run-to-run variance is normal for these network-bound tests; an earlier isolated run measured 252 req/s at concurrency 50.)</w:t>
       </w:r>
     </w:p>
     <w:p>

</xml_diff>

<commit_message>
Regenerate report .docx with elasticity + failure experiments (317 paragraphs)
</commit_message>
<xml_diff>
--- a/report/BZ-Agent_Report.docx
+++ b/report/BZ-Agent_Report.docx
@@ -874,6 +874,144 @@
           </w:p>
         </w:tc>
       </w:tr>
+      <w:tr>
+        <w:trPr>
+          <w:tblHeader w:val="false"/>
+        </w:trPr>
+        <w:tc>
+          <w:tcPr>
+            <w:tcW w:type="dxa" w:w="2400"/>
+            <w:tcBorders>
+              <w:top w:val="single" w:color="CCCCCC" w:sz="1"/>
+              <w:left w:val="single" w:color="CCCCCC" w:sz="1"/>
+              <w:bottom w:val="single" w:color="CCCCCC" w:sz="1"/>
+              <w:right w:val="single" w:color="CCCCCC" w:sz="1"/>
+            </w:tcBorders>
+            <w:tcMar>
+              <w:top w:type="dxa" w:w="60"/>
+              <w:left w:type="dxa" w:w="110"/>
+              <w:bottom w:type="dxa" w:w="60"/>
+              <w:right w:type="dxa" w:w="110"/>
+            </w:tcMar>
+            <w:vAlign w:val="center"/>
+          </w:tcPr>
+          <w:p>
+            <w:pPr>
+              <w:spacing w:after="0"/>
+            </w:pPr>
+            <w:r>
+              <w:rPr>
+                <w:b w:val="false"/>
+                <w:bCs w:val="false"/>
+                <w:sz w:val="20"/>
+                <w:szCs w:val="20"/>
+              </w:rPr>
+              <w:t xml:space="preserve">Elastic Load Balancing</w:t>
+            </w:r>
+          </w:p>
+        </w:tc>
+        <w:tc>
+          <w:tcPr>
+            <w:tcW w:type="dxa" w:w="6960"/>
+            <w:tcBorders>
+              <w:top w:val="single" w:color="CCCCCC" w:sz="1"/>
+              <w:left w:val="single" w:color="CCCCCC" w:sz="1"/>
+              <w:bottom w:val="single" w:color="CCCCCC" w:sz="1"/>
+              <w:right w:val="single" w:color="CCCCCC" w:sz="1"/>
+            </w:tcBorders>
+            <w:tcMar>
+              <w:top w:type="dxa" w:w="60"/>
+              <w:left w:type="dxa" w:w="110"/>
+              <w:bottom w:type="dxa" w:w="60"/>
+              <w:right w:type="dxa" w:w="110"/>
+            </w:tcMar>
+            <w:vAlign w:val="center"/>
+          </w:tcPr>
+          <w:p>
+            <w:pPr>
+              <w:spacing w:after="0"/>
+            </w:pPr>
+            <w:r>
+              <w:rPr>
+                <w:b w:val="false"/>
+                <w:bCs w:val="false"/>
+                <w:sz w:val="20"/>
+                <w:szCs w:val="20"/>
+              </w:rPr>
+              <w:t xml:space="preserve">Application Load Balancer distributing traffic across the fleet (elasticity experiment).</w:t>
+            </w:r>
+          </w:p>
+        </w:tc>
+      </w:tr>
+      <w:tr>
+        <w:trPr>
+          <w:tblHeader w:val="false"/>
+        </w:trPr>
+        <w:tc>
+          <w:tcPr>
+            <w:tcW w:type="dxa" w:w="2400"/>
+            <w:tcBorders>
+              <w:top w:val="single" w:color="CCCCCC" w:sz="1"/>
+              <w:left w:val="single" w:color="CCCCCC" w:sz="1"/>
+              <w:bottom w:val="single" w:color="CCCCCC" w:sz="1"/>
+              <w:right w:val="single" w:color="CCCCCC" w:sz="1"/>
+            </w:tcBorders>
+            <w:tcMar>
+              <w:top w:type="dxa" w:w="60"/>
+              <w:left w:type="dxa" w:w="110"/>
+              <w:bottom w:type="dxa" w:w="60"/>
+              <w:right w:type="dxa" w:w="110"/>
+            </w:tcMar>
+            <w:vAlign w:val="center"/>
+          </w:tcPr>
+          <w:p>
+            <w:pPr>
+              <w:spacing w:after="0"/>
+            </w:pPr>
+            <w:r>
+              <w:rPr>
+                <w:b w:val="false"/>
+                <w:bCs w:val="false"/>
+                <w:sz w:val="20"/>
+                <w:szCs w:val="20"/>
+              </w:rPr>
+              <w:t xml:space="preserve">EC2 Auto Scaling</w:t>
+            </w:r>
+          </w:p>
+        </w:tc>
+        <w:tc>
+          <w:tcPr>
+            <w:tcW w:type="dxa" w:w="6960"/>
+            <w:tcBorders>
+              <w:top w:val="single" w:color="CCCCCC" w:sz="1"/>
+              <w:left w:val="single" w:color="CCCCCC" w:sz="1"/>
+              <w:bottom w:val="single" w:color="CCCCCC" w:sz="1"/>
+              <w:right w:val="single" w:color="CCCCCC" w:sz="1"/>
+            </w:tcBorders>
+            <w:tcMar>
+              <w:top w:type="dxa" w:w="60"/>
+              <w:left w:type="dxa" w:w="110"/>
+              <w:bottom w:type="dxa" w:w="60"/>
+              <w:right w:type="dxa" w:w="110"/>
+            </w:tcMar>
+            <w:vAlign w:val="center"/>
+          </w:tcPr>
+          <w:p>
+            <w:pPr>
+              <w:spacing w:after="0"/>
+            </w:pPr>
+            <w:r>
+              <w:rPr>
+                <w:b w:val="false"/>
+                <w:bCs w:val="false"/>
+                <w:sz w:val="20"/>
+                <w:szCs w:val="20"/>
+              </w:rPr>
+              <w:t xml:space="preserve">Auto Scaling Group that scales instance count and self-heals failed instances.</w:t>
+            </w:r>
+          </w:p>
+        </w:tc>
+      </w:tr>
     </w:tbl>
     <w:p>
       <w:pPr>
@@ -4872,6 +5010,1329 @@
     </w:p>
     <w:p>
       <w:pPr>
+        <w:pStyle w:val="Heading2"/>
+      </w:pPr>
+      <w:r>
+        <w:t xml:space="preserve">5.8 Elasticity experiment — horizontal scaling</w:t>
+      </w:r>
+    </w:p>
+    <w:p>
+      <w:pPr>
+        <w:spacing w:after="120"/>
+      </w:pPr>
+      <w:r>
+        <w:t xml:space="preserve">The single t3.small is a “pet” (the course’s term for a non-scalable, hand-tended server). To demonstrate elasticity, the EC2 workload was placed behind an Application Load Balancer and an Auto Scaling Group (desired 2 instances, across two Availability Zones) — turning it into “cattle”. The concurrency sweep was then re-run against the load balancer and compared to the single-instance baseline.</w:t>
+      </w:r>
+    </w:p>
+    <w:tbl>
+      <w:tblPr>
+        <w:tblW w:type="dxa" w:w="9360"/>
+        <w:tblBorders>
+          <w:top w:val="single" w:color="auto" w:sz="4"/>
+          <w:left w:val="single" w:color="auto" w:sz="4"/>
+          <w:bottom w:val="single" w:color="auto" w:sz="4"/>
+          <w:right w:val="single" w:color="auto" w:sz="4"/>
+          <w:insideH w:val="single" w:color="auto" w:sz="4"/>
+          <w:insideV w:val="single" w:color="auto" w:sz="4"/>
+        </w:tblBorders>
+      </w:tblPr>
+      <w:tblGrid>
+        <w:gridCol w:w="1760"/>
+        <w:gridCol w:w="1900"/>
+        <w:gridCol w:w="1900"/>
+        <w:gridCol w:w="1900"/>
+        <w:gridCol w:w="1900"/>
+      </w:tblGrid>
+      <w:tr>
+        <w:trPr>
+          <w:tblHeader/>
+        </w:trPr>
+        <w:tc>
+          <w:tcPr>
+            <w:tcW w:type="dxa" w:w="1760"/>
+            <w:tcBorders>
+              <w:top w:val="single" w:color="CCCCCC" w:sz="1"/>
+              <w:left w:val="single" w:color="CCCCCC" w:sz="1"/>
+              <w:bottom w:val="single" w:color="CCCCCC" w:sz="1"/>
+              <w:right w:val="single" w:color="CCCCCC" w:sz="1"/>
+            </w:tcBorders>
+            <w:shd w:fill="D5E8F0" w:val="clear"/>
+            <w:tcMar>
+              <w:top w:type="dxa" w:w="60"/>
+              <w:left w:type="dxa" w:w="110"/>
+              <w:bottom w:type="dxa" w:w="60"/>
+              <w:right w:type="dxa" w:w="110"/>
+            </w:tcMar>
+            <w:vAlign w:val="center"/>
+          </w:tcPr>
+          <w:p>
+            <w:pPr>
+              <w:spacing w:after="0"/>
+            </w:pPr>
+            <w:r>
+              <w:rPr>
+                <w:b/>
+                <w:bCs/>
+                <w:color w:val="0F172A"/>
+                <w:sz w:val="20"/>
+                <w:szCs w:val="20"/>
+              </w:rPr>
+              <w:t xml:space="preserve">Concurrency</w:t>
+            </w:r>
+          </w:p>
+        </w:tc>
+        <w:tc>
+          <w:tcPr>
+            <w:tcW w:type="dxa" w:w="1900"/>
+            <w:tcBorders>
+              <w:top w:val="single" w:color="CCCCCC" w:sz="1"/>
+              <w:left w:val="single" w:color="CCCCCC" w:sz="1"/>
+              <w:bottom w:val="single" w:color="CCCCCC" w:sz="1"/>
+              <w:right w:val="single" w:color="CCCCCC" w:sz="1"/>
+            </w:tcBorders>
+            <w:shd w:fill="D5E8F0" w:val="clear"/>
+            <w:tcMar>
+              <w:top w:type="dxa" w:w="60"/>
+              <w:left w:type="dxa" w:w="110"/>
+              <w:bottom w:type="dxa" w:w="60"/>
+              <w:right w:type="dxa" w:w="110"/>
+            </w:tcMar>
+            <w:vAlign w:val="center"/>
+          </w:tcPr>
+          <w:p>
+            <w:pPr>
+              <w:spacing w:after="0"/>
+            </w:pPr>
+            <w:r>
+              <w:rPr>
+                <w:b/>
+                <w:bCs/>
+                <w:color w:val="0F172A"/>
+                <w:sz w:val="20"/>
+                <w:szCs w:val="20"/>
+              </w:rPr>
+              <w:t xml:space="preserve">Single (req/s)</w:t>
+            </w:r>
+          </w:p>
+        </w:tc>
+        <w:tc>
+          <w:tcPr>
+            <w:tcW w:type="dxa" w:w="1900"/>
+            <w:tcBorders>
+              <w:top w:val="single" w:color="CCCCCC" w:sz="1"/>
+              <w:left w:val="single" w:color="CCCCCC" w:sz="1"/>
+              <w:bottom w:val="single" w:color="CCCCCC" w:sz="1"/>
+              <w:right w:val="single" w:color="CCCCCC" w:sz="1"/>
+            </w:tcBorders>
+            <w:shd w:fill="D5E8F0" w:val="clear"/>
+            <w:tcMar>
+              <w:top w:type="dxa" w:w="60"/>
+              <w:left w:type="dxa" w:w="110"/>
+              <w:bottom w:type="dxa" w:w="60"/>
+              <w:right w:type="dxa" w:w="110"/>
+            </w:tcMar>
+            <w:vAlign w:val="center"/>
+          </w:tcPr>
+          <w:p>
+            <w:pPr>
+              <w:spacing w:after="0"/>
+            </w:pPr>
+            <w:r>
+              <w:rPr>
+                <w:b/>
+                <w:bCs/>
+                <w:color w:val="0F172A"/>
+                <w:sz w:val="20"/>
+                <w:szCs w:val="20"/>
+              </w:rPr>
+              <w:t xml:space="preserve">Fleet (req/s)</w:t>
+            </w:r>
+          </w:p>
+        </w:tc>
+        <w:tc>
+          <w:tcPr>
+            <w:tcW w:type="dxa" w:w="1900"/>
+            <w:tcBorders>
+              <w:top w:val="single" w:color="CCCCCC" w:sz="1"/>
+              <w:left w:val="single" w:color="CCCCCC" w:sz="1"/>
+              <w:bottom w:val="single" w:color="CCCCCC" w:sz="1"/>
+              <w:right w:val="single" w:color="CCCCCC" w:sz="1"/>
+            </w:tcBorders>
+            <w:shd w:fill="D5E8F0" w:val="clear"/>
+            <w:tcMar>
+              <w:top w:type="dxa" w:w="60"/>
+              <w:left w:type="dxa" w:w="110"/>
+              <w:bottom w:type="dxa" w:w="60"/>
+              <w:right w:type="dxa" w:w="110"/>
+            </w:tcMar>
+            <w:vAlign w:val="center"/>
+          </w:tcPr>
+          <w:p>
+            <w:pPr>
+              <w:spacing w:after="0"/>
+            </w:pPr>
+            <w:r>
+              <w:rPr>
+                <w:b/>
+                <w:bCs/>
+                <w:color w:val="0F172A"/>
+                <w:sz w:val="20"/>
+                <w:szCs w:val="20"/>
+              </w:rPr>
+              <w:t xml:space="preserve">Single p50</w:t>
+            </w:r>
+          </w:p>
+        </w:tc>
+        <w:tc>
+          <w:tcPr>
+            <w:tcW w:type="dxa" w:w="1900"/>
+            <w:tcBorders>
+              <w:top w:val="single" w:color="CCCCCC" w:sz="1"/>
+              <w:left w:val="single" w:color="CCCCCC" w:sz="1"/>
+              <w:bottom w:val="single" w:color="CCCCCC" w:sz="1"/>
+              <w:right w:val="single" w:color="CCCCCC" w:sz="1"/>
+            </w:tcBorders>
+            <w:shd w:fill="D5E8F0" w:val="clear"/>
+            <w:tcMar>
+              <w:top w:type="dxa" w:w="60"/>
+              <w:left w:type="dxa" w:w="110"/>
+              <w:bottom w:type="dxa" w:w="60"/>
+              <w:right w:type="dxa" w:w="110"/>
+            </w:tcMar>
+            <w:vAlign w:val="center"/>
+          </w:tcPr>
+          <w:p>
+            <w:pPr>
+              <w:spacing w:after="0"/>
+            </w:pPr>
+            <w:r>
+              <w:rPr>
+                <w:b/>
+                <w:bCs/>
+                <w:color w:val="0F172A"/>
+                <w:sz w:val="20"/>
+                <w:szCs w:val="20"/>
+              </w:rPr>
+              <w:t xml:space="preserve">Fleet p50</w:t>
+            </w:r>
+          </w:p>
+        </w:tc>
+      </w:tr>
+      <w:tr>
+        <w:trPr>
+          <w:tblHeader w:val="false"/>
+        </w:trPr>
+        <w:tc>
+          <w:tcPr>
+            <w:tcW w:type="dxa" w:w="1760"/>
+            <w:tcBorders>
+              <w:top w:val="single" w:color="CCCCCC" w:sz="1"/>
+              <w:left w:val="single" w:color="CCCCCC" w:sz="1"/>
+              <w:bottom w:val="single" w:color="CCCCCC" w:sz="1"/>
+              <w:right w:val="single" w:color="CCCCCC" w:sz="1"/>
+            </w:tcBorders>
+            <w:tcMar>
+              <w:top w:type="dxa" w:w="60"/>
+              <w:left w:type="dxa" w:w="110"/>
+              <w:bottom w:type="dxa" w:w="60"/>
+              <w:right w:type="dxa" w:w="110"/>
+            </w:tcMar>
+            <w:vAlign w:val="center"/>
+          </w:tcPr>
+          <w:p>
+            <w:pPr>
+              <w:spacing w:after="0"/>
+            </w:pPr>
+            <w:r>
+              <w:rPr>
+                <w:b w:val="false"/>
+                <w:bCs w:val="false"/>
+                <w:sz w:val="20"/>
+                <w:szCs w:val="20"/>
+              </w:rPr>
+              <w:t xml:space="preserve">50</w:t>
+            </w:r>
+          </w:p>
+        </w:tc>
+        <w:tc>
+          <w:tcPr>
+            <w:tcW w:type="dxa" w:w="1900"/>
+            <w:tcBorders>
+              <w:top w:val="single" w:color="CCCCCC" w:sz="1"/>
+              <w:left w:val="single" w:color="CCCCCC" w:sz="1"/>
+              <w:bottom w:val="single" w:color="CCCCCC" w:sz="1"/>
+              <w:right w:val="single" w:color="CCCCCC" w:sz="1"/>
+            </w:tcBorders>
+            <w:tcMar>
+              <w:top w:type="dxa" w:w="60"/>
+              <w:left w:type="dxa" w:w="110"/>
+              <w:bottom w:type="dxa" w:w="60"/>
+              <w:right w:type="dxa" w:w="110"/>
+            </w:tcMar>
+            <w:vAlign w:val="center"/>
+          </w:tcPr>
+          <w:p>
+            <w:pPr>
+              <w:spacing w:after="0"/>
+            </w:pPr>
+            <w:r>
+              <w:rPr>
+                <w:b w:val="false"/>
+                <w:bCs w:val="false"/>
+                <w:sz w:val="20"/>
+                <w:szCs w:val="20"/>
+              </w:rPr>
+              <w:t xml:space="preserve">187</w:t>
+            </w:r>
+          </w:p>
+        </w:tc>
+        <w:tc>
+          <w:tcPr>
+            <w:tcW w:type="dxa" w:w="1900"/>
+            <w:tcBorders>
+              <w:top w:val="single" w:color="CCCCCC" w:sz="1"/>
+              <w:left w:val="single" w:color="CCCCCC" w:sz="1"/>
+              <w:bottom w:val="single" w:color="CCCCCC" w:sz="1"/>
+              <w:right w:val="single" w:color="CCCCCC" w:sz="1"/>
+            </w:tcBorders>
+            <w:tcMar>
+              <w:top w:type="dxa" w:w="60"/>
+              <w:left w:type="dxa" w:w="110"/>
+              <w:bottom w:type="dxa" w:w="60"/>
+              <w:right w:type="dxa" w:w="110"/>
+            </w:tcMar>
+            <w:vAlign w:val="center"/>
+          </w:tcPr>
+          <w:p>
+            <w:pPr>
+              <w:spacing w:after="0"/>
+            </w:pPr>
+            <w:r>
+              <w:rPr>
+                <w:b w:val="false"/>
+                <w:bCs w:val="false"/>
+                <w:sz w:val="20"/>
+                <w:szCs w:val="20"/>
+              </w:rPr>
+              <w:t xml:space="preserve">248</w:t>
+            </w:r>
+          </w:p>
+        </w:tc>
+        <w:tc>
+          <w:tcPr>
+            <w:tcW w:type="dxa" w:w="1900"/>
+            <w:tcBorders>
+              <w:top w:val="single" w:color="CCCCCC" w:sz="1"/>
+              <w:left w:val="single" w:color="CCCCCC" w:sz="1"/>
+              <w:bottom w:val="single" w:color="CCCCCC" w:sz="1"/>
+              <w:right w:val="single" w:color="CCCCCC" w:sz="1"/>
+            </w:tcBorders>
+            <w:tcMar>
+              <w:top w:type="dxa" w:w="60"/>
+              <w:left w:type="dxa" w:w="110"/>
+              <w:bottom w:type="dxa" w:w="60"/>
+              <w:right w:type="dxa" w:w="110"/>
+            </w:tcMar>
+            <w:vAlign w:val="center"/>
+          </w:tcPr>
+          <w:p>
+            <w:pPr>
+              <w:spacing w:after="0"/>
+            </w:pPr>
+            <w:r>
+              <w:rPr>
+                <w:b w:val="false"/>
+                <w:bCs w:val="false"/>
+                <w:sz w:val="20"/>
+                <w:szCs w:val="20"/>
+              </w:rPr>
+              <w:t xml:space="preserve">223 ms</w:t>
+            </w:r>
+          </w:p>
+        </w:tc>
+        <w:tc>
+          <w:tcPr>
+            <w:tcW w:type="dxa" w:w="1900"/>
+            <w:tcBorders>
+              <w:top w:val="single" w:color="CCCCCC" w:sz="1"/>
+              <w:left w:val="single" w:color="CCCCCC" w:sz="1"/>
+              <w:bottom w:val="single" w:color="CCCCCC" w:sz="1"/>
+              <w:right w:val="single" w:color="CCCCCC" w:sz="1"/>
+            </w:tcBorders>
+            <w:tcMar>
+              <w:top w:type="dxa" w:w="60"/>
+              <w:left w:type="dxa" w:w="110"/>
+              <w:bottom w:type="dxa" w:w="60"/>
+              <w:right w:type="dxa" w:w="110"/>
+            </w:tcMar>
+            <w:vAlign w:val="center"/>
+          </w:tcPr>
+          <w:p>
+            <w:pPr>
+              <w:spacing w:after="0"/>
+            </w:pPr>
+            <w:r>
+              <w:rPr>
+                <w:b w:val="false"/>
+                <w:bCs w:val="false"/>
+                <w:sz w:val="20"/>
+                <w:szCs w:val="20"/>
+              </w:rPr>
+              <w:t xml:space="preserve">99 ms</w:t>
+            </w:r>
+          </w:p>
+        </w:tc>
+      </w:tr>
+      <w:tr>
+        <w:trPr>
+          <w:tblHeader w:val="false"/>
+        </w:trPr>
+        <w:tc>
+          <w:tcPr>
+            <w:tcW w:type="dxa" w:w="1760"/>
+            <w:tcBorders>
+              <w:top w:val="single" w:color="CCCCCC" w:sz="1"/>
+              <w:left w:val="single" w:color="CCCCCC" w:sz="1"/>
+              <w:bottom w:val="single" w:color="CCCCCC" w:sz="1"/>
+              <w:right w:val="single" w:color="CCCCCC" w:sz="1"/>
+            </w:tcBorders>
+            <w:tcMar>
+              <w:top w:type="dxa" w:w="60"/>
+              <w:left w:type="dxa" w:w="110"/>
+              <w:bottom w:type="dxa" w:w="60"/>
+              <w:right w:type="dxa" w:w="110"/>
+            </w:tcMar>
+            <w:vAlign w:val="center"/>
+          </w:tcPr>
+          <w:p>
+            <w:pPr>
+              <w:spacing w:after="0"/>
+            </w:pPr>
+            <w:r>
+              <w:rPr>
+                <w:b w:val="false"/>
+                <w:bCs w:val="false"/>
+                <w:sz w:val="20"/>
+                <w:szCs w:val="20"/>
+              </w:rPr>
+              <w:t xml:space="preserve">100</w:t>
+            </w:r>
+          </w:p>
+        </w:tc>
+        <w:tc>
+          <w:tcPr>
+            <w:tcW w:type="dxa" w:w="1900"/>
+            <w:tcBorders>
+              <w:top w:val="single" w:color="CCCCCC" w:sz="1"/>
+              <w:left w:val="single" w:color="CCCCCC" w:sz="1"/>
+              <w:bottom w:val="single" w:color="CCCCCC" w:sz="1"/>
+              <w:right w:val="single" w:color="CCCCCC" w:sz="1"/>
+            </w:tcBorders>
+            <w:tcMar>
+              <w:top w:type="dxa" w:w="60"/>
+              <w:left w:type="dxa" w:w="110"/>
+              <w:bottom w:type="dxa" w:w="60"/>
+              <w:right w:type="dxa" w:w="110"/>
+            </w:tcMar>
+            <w:vAlign w:val="center"/>
+          </w:tcPr>
+          <w:p>
+            <w:pPr>
+              <w:spacing w:after="0"/>
+            </w:pPr>
+            <w:r>
+              <w:rPr>
+                <w:b w:val="false"/>
+                <w:bCs w:val="false"/>
+                <w:sz w:val="20"/>
+                <w:szCs w:val="20"/>
+              </w:rPr>
+              <w:t xml:space="preserve">115</w:t>
+            </w:r>
+          </w:p>
+        </w:tc>
+        <w:tc>
+          <w:tcPr>
+            <w:tcW w:type="dxa" w:w="1900"/>
+            <w:tcBorders>
+              <w:top w:val="single" w:color="CCCCCC" w:sz="1"/>
+              <w:left w:val="single" w:color="CCCCCC" w:sz="1"/>
+              <w:bottom w:val="single" w:color="CCCCCC" w:sz="1"/>
+              <w:right w:val="single" w:color="CCCCCC" w:sz="1"/>
+            </w:tcBorders>
+            <w:tcMar>
+              <w:top w:type="dxa" w:w="60"/>
+              <w:left w:type="dxa" w:w="110"/>
+              <w:bottom w:type="dxa" w:w="60"/>
+              <w:right w:type="dxa" w:w="110"/>
+            </w:tcMar>
+            <w:vAlign w:val="center"/>
+          </w:tcPr>
+          <w:p>
+            <w:pPr>
+              <w:spacing w:after="0"/>
+            </w:pPr>
+            <w:r>
+              <w:rPr>
+                <w:b w:val="false"/>
+                <w:bCs w:val="false"/>
+                <w:sz w:val="20"/>
+                <w:szCs w:val="20"/>
+              </w:rPr>
+              <w:t xml:space="preserve">142</w:t>
+            </w:r>
+          </w:p>
+        </w:tc>
+        <w:tc>
+          <w:tcPr>
+            <w:tcW w:type="dxa" w:w="1900"/>
+            <w:tcBorders>
+              <w:top w:val="single" w:color="CCCCCC" w:sz="1"/>
+              <w:left w:val="single" w:color="CCCCCC" w:sz="1"/>
+              <w:bottom w:val="single" w:color="CCCCCC" w:sz="1"/>
+              <w:right w:val="single" w:color="CCCCCC" w:sz="1"/>
+            </w:tcBorders>
+            <w:tcMar>
+              <w:top w:type="dxa" w:w="60"/>
+              <w:left w:type="dxa" w:w="110"/>
+              <w:bottom w:type="dxa" w:w="60"/>
+              <w:right w:type="dxa" w:w="110"/>
+            </w:tcMar>
+            <w:vAlign w:val="center"/>
+          </w:tcPr>
+          <w:p>
+            <w:pPr>
+              <w:spacing w:after="0"/>
+            </w:pPr>
+            <w:r>
+              <w:rPr>
+                <w:b w:val="false"/>
+                <w:bCs w:val="false"/>
+                <w:sz w:val="20"/>
+                <w:szCs w:val="20"/>
+              </w:rPr>
+              <w:t xml:space="preserve">627 ms</w:t>
+            </w:r>
+          </w:p>
+        </w:tc>
+        <w:tc>
+          <w:tcPr>
+            <w:tcW w:type="dxa" w:w="1900"/>
+            <w:tcBorders>
+              <w:top w:val="single" w:color="CCCCCC" w:sz="1"/>
+              <w:left w:val="single" w:color="CCCCCC" w:sz="1"/>
+              <w:bottom w:val="single" w:color="CCCCCC" w:sz="1"/>
+              <w:right w:val="single" w:color="CCCCCC" w:sz="1"/>
+            </w:tcBorders>
+            <w:tcMar>
+              <w:top w:type="dxa" w:w="60"/>
+              <w:left w:type="dxa" w:w="110"/>
+              <w:bottom w:type="dxa" w:w="60"/>
+              <w:right w:type="dxa" w:w="110"/>
+            </w:tcMar>
+            <w:vAlign w:val="center"/>
+          </w:tcPr>
+          <w:p>
+            <w:pPr>
+              <w:spacing w:after="0"/>
+            </w:pPr>
+            <w:r>
+              <w:rPr>
+                <w:b w:val="false"/>
+                <w:bCs w:val="false"/>
+                <w:sz w:val="20"/>
+                <w:szCs w:val="20"/>
+              </w:rPr>
+              <w:t xml:space="preserve">469 ms</w:t>
+            </w:r>
+          </w:p>
+        </w:tc>
+      </w:tr>
+      <w:tr>
+        <w:trPr>
+          <w:tblHeader w:val="false"/>
+        </w:trPr>
+        <w:tc>
+          <w:tcPr>
+            <w:tcW w:type="dxa" w:w="1760"/>
+            <w:tcBorders>
+              <w:top w:val="single" w:color="CCCCCC" w:sz="1"/>
+              <w:left w:val="single" w:color="CCCCCC" w:sz="1"/>
+              <w:bottom w:val="single" w:color="CCCCCC" w:sz="1"/>
+              <w:right w:val="single" w:color="CCCCCC" w:sz="1"/>
+            </w:tcBorders>
+            <w:tcMar>
+              <w:top w:type="dxa" w:w="60"/>
+              <w:left w:type="dxa" w:w="110"/>
+              <w:bottom w:type="dxa" w:w="60"/>
+              <w:right w:type="dxa" w:w="110"/>
+            </w:tcMar>
+            <w:vAlign w:val="center"/>
+          </w:tcPr>
+          <w:p>
+            <w:pPr>
+              <w:spacing w:after="0"/>
+            </w:pPr>
+            <w:r>
+              <w:rPr>
+                <w:b w:val="false"/>
+                <w:bCs w:val="false"/>
+                <w:sz w:val="20"/>
+                <w:szCs w:val="20"/>
+              </w:rPr>
+              <w:t xml:space="preserve">200</w:t>
+            </w:r>
+          </w:p>
+        </w:tc>
+        <w:tc>
+          <w:tcPr>
+            <w:tcW w:type="dxa" w:w="1900"/>
+            <w:tcBorders>
+              <w:top w:val="single" w:color="CCCCCC" w:sz="1"/>
+              <w:left w:val="single" w:color="CCCCCC" w:sz="1"/>
+              <w:bottom w:val="single" w:color="CCCCCC" w:sz="1"/>
+              <w:right w:val="single" w:color="CCCCCC" w:sz="1"/>
+            </w:tcBorders>
+            <w:tcMar>
+              <w:top w:type="dxa" w:w="60"/>
+              <w:left w:type="dxa" w:w="110"/>
+              <w:bottom w:type="dxa" w:w="60"/>
+              <w:right w:type="dxa" w:w="110"/>
+            </w:tcMar>
+            <w:vAlign w:val="center"/>
+          </w:tcPr>
+          <w:p>
+            <w:pPr>
+              <w:spacing w:after="0"/>
+            </w:pPr>
+            <w:r>
+              <w:rPr>
+                <w:b w:val="false"/>
+                <w:bCs w:val="false"/>
+                <w:sz w:val="20"/>
+                <w:szCs w:val="20"/>
+              </w:rPr>
+              <w:t xml:space="preserve">88</w:t>
+            </w:r>
+          </w:p>
+        </w:tc>
+        <w:tc>
+          <w:tcPr>
+            <w:tcW w:type="dxa" w:w="1900"/>
+            <w:tcBorders>
+              <w:top w:val="single" w:color="CCCCCC" w:sz="1"/>
+              <w:left w:val="single" w:color="CCCCCC" w:sz="1"/>
+              <w:bottom w:val="single" w:color="CCCCCC" w:sz="1"/>
+              <w:right w:val="single" w:color="CCCCCC" w:sz="1"/>
+            </w:tcBorders>
+            <w:tcMar>
+              <w:top w:type="dxa" w:w="60"/>
+              <w:left w:type="dxa" w:w="110"/>
+              <w:bottom w:type="dxa" w:w="60"/>
+              <w:right w:type="dxa" w:w="110"/>
+            </w:tcMar>
+            <w:vAlign w:val="center"/>
+          </w:tcPr>
+          <w:p>
+            <w:pPr>
+              <w:spacing w:after="0"/>
+            </w:pPr>
+            <w:r>
+              <w:rPr>
+                <w:b w:val="false"/>
+                <w:bCs w:val="false"/>
+                <w:sz w:val="20"/>
+                <w:szCs w:val="20"/>
+              </w:rPr>
+              <w:t xml:space="preserve">125</w:t>
+            </w:r>
+          </w:p>
+        </w:tc>
+        <w:tc>
+          <w:tcPr>
+            <w:tcW w:type="dxa" w:w="1900"/>
+            <w:tcBorders>
+              <w:top w:val="single" w:color="CCCCCC" w:sz="1"/>
+              <w:left w:val="single" w:color="CCCCCC" w:sz="1"/>
+              <w:bottom w:val="single" w:color="CCCCCC" w:sz="1"/>
+              <w:right w:val="single" w:color="CCCCCC" w:sz="1"/>
+            </w:tcBorders>
+            <w:tcMar>
+              <w:top w:type="dxa" w:w="60"/>
+              <w:left w:type="dxa" w:w="110"/>
+              <w:bottom w:type="dxa" w:w="60"/>
+              <w:right w:type="dxa" w:w="110"/>
+            </w:tcMar>
+            <w:vAlign w:val="center"/>
+          </w:tcPr>
+          <w:p>
+            <w:pPr>
+              <w:spacing w:after="0"/>
+            </w:pPr>
+            <w:r>
+              <w:rPr>
+                <w:b w:val="false"/>
+                <w:bCs w:val="false"/>
+                <w:sz w:val="20"/>
+                <w:szCs w:val="20"/>
+              </w:rPr>
+              <w:t xml:space="preserve">2213 ms</w:t>
+            </w:r>
+          </w:p>
+        </w:tc>
+        <w:tc>
+          <w:tcPr>
+            <w:tcW w:type="dxa" w:w="1900"/>
+            <w:tcBorders>
+              <w:top w:val="single" w:color="CCCCCC" w:sz="1"/>
+              <w:left w:val="single" w:color="CCCCCC" w:sz="1"/>
+              <w:bottom w:val="single" w:color="CCCCCC" w:sz="1"/>
+              <w:right w:val="single" w:color="CCCCCC" w:sz="1"/>
+            </w:tcBorders>
+            <w:tcMar>
+              <w:top w:type="dxa" w:w="60"/>
+              <w:left w:type="dxa" w:w="110"/>
+              <w:bottom w:type="dxa" w:w="60"/>
+              <w:right w:type="dxa" w:w="110"/>
+            </w:tcMar>
+            <w:vAlign w:val="center"/>
+          </w:tcPr>
+          <w:p>
+            <w:pPr>
+              <w:spacing w:after="0"/>
+            </w:pPr>
+            <w:r>
+              <w:rPr>
+                <w:b w:val="false"/>
+                <w:bCs w:val="false"/>
+                <w:sz w:val="20"/>
+                <w:szCs w:val="20"/>
+              </w:rPr>
+              <w:t xml:space="preserve">1088 ms</w:t>
+            </w:r>
+          </w:p>
+        </w:tc>
+      </w:tr>
+      <w:tr>
+        <w:trPr>
+          <w:tblHeader w:val="false"/>
+        </w:trPr>
+        <w:tc>
+          <w:tcPr>
+            <w:tcW w:type="dxa" w:w="1760"/>
+            <w:tcBorders>
+              <w:top w:val="single" w:color="CCCCCC" w:sz="1"/>
+              <w:left w:val="single" w:color="CCCCCC" w:sz="1"/>
+              <w:bottom w:val="single" w:color="CCCCCC" w:sz="1"/>
+              <w:right w:val="single" w:color="CCCCCC" w:sz="1"/>
+            </w:tcBorders>
+            <w:tcMar>
+              <w:top w:type="dxa" w:w="60"/>
+              <w:left w:type="dxa" w:w="110"/>
+              <w:bottom w:type="dxa" w:w="60"/>
+              <w:right w:type="dxa" w:w="110"/>
+            </w:tcMar>
+            <w:vAlign w:val="center"/>
+          </w:tcPr>
+          <w:p>
+            <w:pPr>
+              <w:spacing w:after="0"/>
+            </w:pPr>
+            <w:r>
+              <w:rPr>
+                <w:b w:val="false"/>
+                <w:bCs w:val="false"/>
+                <w:sz w:val="20"/>
+                <w:szCs w:val="20"/>
+              </w:rPr>
+              <w:t xml:space="preserve">300</w:t>
+            </w:r>
+          </w:p>
+        </w:tc>
+        <w:tc>
+          <w:tcPr>
+            <w:tcW w:type="dxa" w:w="1900"/>
+            <w:tcBorders>
+              <w:top w:val="single" w:color="CCCCCC" w:sz="1"/>
+              <w:left w:val="single" w:color="CCCCCC" w:sz="1"/>
+              <w:bottom w:val="single" w:color="CCCCCC" w:sz="1"/>
+              <w:right w:val="single" w:color="CCCCCC" w:sz="1"/>
+            </w:tcBorders>
+            <w:tcMar>
+              <w:top w:type="dxa" w:w="60"/>
+              <w:left w:type="dxa" w:w="110"/>
+              <w:bottom w:type="dxa" w:w="60"/>
+              <w:right w:type="dxa" w:w="110"/>
+            </w:tcMar>
+            <w:vAlign w:val="center"/>
+          </w:tcPr>
+          <w:p>
+            <w:pPr>
+              <w:spacing w:after="0"/>
+            </w:pPr>
+            <w:r>
+              <w:rPr>
+                <w:b w:val="false"/>
+                <w:bCs w:val="false"/>
+                <w:sz w:val="20"/>
+                <w:szCs w:val="20"/>
+              </w:rPr>
+              <w:t xml:space="preserve">78</w:t>
+            </w:r>
+          </w:p>
+        </w:tc>
+        <w:tc>
+          <w:tcPr>
+            <w:tcW w:type="dxa" w:w="1900"/>
+            <w:tcBorders>
+              <w:top w:val="single" w:color="CCCCCC" w:sz="1"/>
+              <w:left w:val="single" w:color="CCCCCC" w:sz="1"/>
+              <w:bottom w:val="single" w:color="CCCCCC" w:sz="1"/>
+              <w:right w:val="single" w:color="CCCCCC" w:sz="1"/>
+            </w:tcBorders>
+            <w:tcMar>
+              <w:top w:type="dxa" w:w="60"/>
+              <w:left w:type="dxa" w:w="110"/>
+              <w:bottom w:type="dxa" w:w="60"/>
+              <w:right w:type="dxa" w:w="110"/>
+            </w:tcMar>
+            <w:vAlign w:val="center"/>
+          </w:tcPr>
+          <w:p>
+            <w:pPr>
+              <w:spacing w:after="0"/>
+            </w:pPr>
+            <w:r>
+              <w:rPr>
+                <w:b w:val="false"/>
+                <w:bCs w:val="false"/>
+                <w:sz w:val="20"/>
+                <w:szCs w:val="20"/>
+              </w:rPr>
+              <w:t xml:space="preserve">133</w:t>
+            </w:r>
+          </w:p>
+        </w:tc>
+        <w:tc>
+          <w:tcPr>
+            <w:tcW w:type="dxa" w:w="1900"/>
+            <w:tcBorders>
+              <w:top w:val="single" w:color="CCCCCC" w:sz="1"/>
+              <w:left w:val="single" w:color="CCCCCC" w:sz="1"/>
+              <w:bottom w:val="single" w:color="CCCCCC" w:sz="1"/>
+              <w:right w:val="single" w:color="CCCCCC" w:sz="1"/>
+            </w:tcBorders>
+            <w:tcMar>
+              <w:top w:type="dxa" w:w="60"/>
+              <w:left w:type="dxa" w:w="110"/>
+              <w:bottom w:type="dxa" w:w="60"/>
+              <w:right w:type="dxa" w:w="110"/>
+            </w:tcMar>
+            <w:vAlign w:val="center"/>
+          </w:tcPr>
+          <w:p>
+            <w:pPr>
+              <w:spacing w:after="0"/>
+            </w:pPr>
+            <w:r>
+              <w:rPr>
+                <w:b w:val="false"/>
+                <w:bCs w:val="false"/>
+                <w:sz w:val="20"/>
+                <w:szCs w:val="20"/>
+              </w:rPr>
+              <w:t xml:space="preserve">5172 ms</w:t>
+            </w:r>
+          </w:p>
+        </w:tc>
+        <w:tc>
+          <w:tcPr>
+            <w:tcW w:type="dxa" w:w="1900"/>
+            <w:tcBorders>
+              <w:top w:val="single" w:color="CCCCCC" w:sz="1"/>
+              <w:left w:val="single" w:color="CCCCCC" w:sz="1"/>
+              <w:bottom w:val="single" w:color="CCCCCC" w:sz="1"/>
+              <w:right w:val="single" w:color="CCCCCC" w:sz="1"/>
+            </w:tcBorders>
+            <w:tcMar>
+              <w:top w:type="dxa" w:w="60"/>
+              <w:left w:type="dxa" w:w="110"/>
+              <w:bottom w:type="dxa" w:w="60"/>
+              <w:right w:type="dxa" w:w="110"/>
+            </w:tcMar>
+            <w:vAlign w:val="center"/>
+          </w:tcPr>
+          <w:p>
+            <w:pPr>
+              <w:spacing w:after="0"/>
+            </w:pPr>
+            <w:r>
+              <w:rPr>
+                <w:b w:val="false"/>
+                <w:bCs w:val="false"/>
+                <w:sz w:val="20"/>
+                <w:szCs w:val="20"/>
+              </w:rPr>
+              <w:t xml:space="preserve">2188 ms</w:t>
+            </w:r>
+          </w:p>
+        </w:tc>
+      </w:tr>
+    </w:tbl>
+    <w:p>
+      <w:pPr>
+        <w:spacing w:after="120" w:before="120"/>
+        <w:jc w:val="center"/>
+      </w:pPr>
+      <w:r>
+        <w:drawing>
+          <wp:inline distT="0" distB="0" distL="0" distR="0">
+            <wp:extent cx="5715000" cy="2190750"/>
+            <wp:effectExtent t="0" r="0" b="0" l="0"/>
+            <wp:docPr id="1" name="elastic" descr="Single vs fleet throughput and latency" title="Elasticity"/>
+            <wp:cNvGraphicFramePr>
+              <a:graphicFrameLocks xmlns:a="http://schemas.openxmlformats.org/drawingml/2006/main" noChangeAspect="1"/>
+            </wp:cNvGraphicFramePr>
+            <a:graphic xmlns:a="http://schemas.openxmlformats.org/drawingml/2006/main">
+              <a:graphicData uri="http://schemas.openxmlformats.org/drawingml/2006/picture">
+                <pic:pic xmlns:pic="http://schemas.openxmlformats.org/drawingml/2006/picture">
+                  <pic:nvPicPr>
+                    <pic:cNvPr id="0" name="" descr=""/>
+                    <pic:cNvPicPr>
+                      <a:picLocks noChangeAspect="1" noChangeArrowheads="1"/>
+                    </pic:cNvPicPr>
+                  </pic:nvPicPr>
+                  <pic:blipFill>
+                    <a:blip r:embed="rId10" cstate="none"/>
+                    <a:srcRect/>
+                    <a:stretch>
+                      <a:fillRect/>
+                    </a:stretch>
+                  </pic:blipFill>
+                  <pic:spPr bwMode="auto">
+                    <a:xfrm>
+                      <a:off x="0" y="0"/>
+                      <a:ext cx="5715000" cy="2190750"/>
+                    </a:xfrm>
+                    <a:prstGeom prst="rect">
+                      <a:avLst/>
+                    </a:prstGeom>
+                  </pic:spPr>
+                </pic:pic>
+              </a:graphicData>
+            </a:graphic>
+          </wp:inline>
+        </w:drawing>
+      </w:r>
+    </w:p>
+    <w:p>
+      <w:pPr>
+        <w:spacing w:after="120"/>
+      </w:pPr>
+      <w:r>
+        <w:rPr>
+          <w:b/>
+          <w:bCs/>
+        </w:rPr>
+        <w:t xml:space="preserve">Finding: horizontal scaling raised both throughput and responsiveness, and the benefit grew with load — exactly when it is needed. At 300 concurrent connections the fleet delivered ~70% more throughput and roughly half the median latency, with 0% errors throughout. This is the elasticity the cloud is meant to provide: capacity follows demand instead of being fixed.</w:t>
+      </w:r>
+    </w:p>
+    <w:p>
+      <w:pPr>
+        <w:pStyle w:val="Heading2"/>
+      </w:pPr>
+      <w:r>
+        <w:t xml:space="preserve">5.9 Failure-recovery experiment — reliability</w:t>
+      </w:r>
+    </w:p>
+    <w:p>
+      <w:pPr>
+        <w:spacing w:after="120"/>
+      </w:pPr>
+      <w:r>
+        <w:t xml:space="preserve">To test resilience, the load balancer’s health endpoint was polled continuously while one of the two fleet instances was abruptly terminated; the Auto Scaling Group’s self-healing was then measured.</w:t>
+      </w:r>
+    </w:p>
+    <w:tbl>
+      <w:tblPr>
+        <w:tblW w:type="dxa" w:w="9360"/>
+        <w:tblBorders>
+          <w:top w:val="single" w:color="auto" w:sz="4"/>
+          <w:left w:val="single" w:color="auto" w:sz="4"/>
+          <w:bottom w:val="single" w:color="auto" w:sz="4"/>
+          <w:right w:val="single" w:color="auto" w:sz="4"/>
+          <w:insideH w:val="single" w:color="auto" w:sz="4"/>
+          <w:insideV w:val="single" w:color="auto" w:sz="4"/>
+        </w:tblBorders>
+      </w:tblPr>
+      <w:tblGrid>
+        <w:gridCol w:w="4680"/>
+        <w:gridCol w:w="4680"/>
+      </w:tblGrid>
+      <w:tr>
+        <w:trPr>
+          <w:tblHeader/>
+        </w:trPr>
+        <w:tc>
+          <w:tcPr>
+            <w:tcW w:type="dxa" w:w="4680"/>
+            <w:tcBorders>
+              <w:top w:val="single" w:color="CCCCCC" w:sz="1"/>
+              <w:left w:val="single" w:color="CCCCCC" w:sz="1"/>
+              <w:bottom w:val="single" w:color="CCCCCC" w:sz="1"/>
+              <w:right w:val="single" w:color="CCCCCC" w:sz="1"/>
+            </w:tcBorders>
+            <w:shd w:fill="D5E8F0" w:val="clear"/>
+            <w:tcMar>
+              <w:top w:type="dxa" w:w="60"/>
+              <w:left w:type="dxa" w:w="110"/>
+              <w:bottom w:type="dxa" w:w="60"/>
+              <w:right w:type="dxa" w:w="110"/>
+            </w:tcMar>
+            <w:vAlign w:val="center"/>
+          </w:tcPr>
+          <w:p>
+            <w:pPr>
+              <w:spacing w:after="0"/>
+            </w:pPr>
+            <w:r>
+              <w:rPr>
+                <w:b/>
+                <w:bCs/>
+                <w:color w:val="0F172A"/>
+                <w:sz w:val="20"/>
+                <w:szCs w:val="20"/>
+              </w:rPr>
+              <w:t xml:space="preserve">Metric</w:t>
+            </w:r>
+          </w:p>
+        </w:tc>
+        <w:tc>
+          <w:tcPr>
+            <w:tcW w:type="dxa" w:w="4680"/>
+            <w:tcBorders>
+              <w:top w:val="single" w:color="CCCCCC" w:sz="1"/>
+              <w:left w:val="single" w:color="CCCCCC" w:sz="1"/>
+              <w:bottom w:val="single" w:color="CCCCCC" w:sz="1"/>
+              <w:right w:val="single" w:color="CCCCCC" w:sz="1"/>
+            </w:tcBorders>
+            <w:shd w:fill="D5E8F0" w:val="clear"/>
+            <w:tcMar>
+              <w:top w:type="dxa" w:w="60"/>
+              <w:left w:type="dxa" w:w="110"/>
+              <w:bottom w:type="dxa" w:w="60"/>
+              <w:right w:type="dxa" w:w="110"/>
+            </w:tcMar>
+            <w:vAlign w:val="center"/>
+          </w:tcPr>
+          <w:p>
+            <w:pPr>
+              <w:spacing w:after="0"/>
+            </w:pPr>
+            <w:r>
+              <w:rPr>
+                <w:b/>
+                <w:bCs/>
+                <w:color w:val="0F172A"/>
+                <w:sz w:val="20"/>
+                <w:szCs w:val="20"/>
+              </w:rPr>
+              <w:t xml:space="preserve">Result</w:t>
+            </w:r>
+          </w:p>
+        </w:tc>
+      </w:tr>
+      <w:tr>
+        <w:trPr>
+          <w:tblHeader w:val="false"/>
+        </w:trPr>
+        <w:tc>
+          <w:tcPr>
+            <w:tcW w:type="dxa" w:w="4680"/>
+            <w:tcBorders>
+              <w:top w:val="single" w:color="CCCCCC" w:sz="1"/>
+              <w:left w:val="single" w:color="CCCCCC" w:sz="1"/>
+              <w:bottom w:val="single" w:color="CCCCCC" w:sz="1"/>
+              <w:right w:val="single" w:color="CCCCCC" w:sz="1"/>
+            </w:tcBorders>
+            <w:tcMar>
+              <w:top w:type="dxa" w:w="60"/>
+              <w:left w:type="dxa" w:w="110"/>
+              <w:bottom w:type="dxa" w:w="60"/>
+              <w:right w:type="dxa" w:w="110"/>
+            </w:tcMar>
+            <w:vAlign w:val="center"/>
+          </w:tcPr>
+          <w:p>
+            <w:pPr>
+              <w:spacing w:after="0"/>
+            </w:pPr>
+            <w:r>
+              <w:rPr>
+                <w:b w:val="false"/>
+                <w:bCs w:val="false"/>
+                <w:sz w:val="20"/>
+                <w:szCs w:val="20"/>
+              </w:rPr>
+              <w:t xml:space="preserve">Instance terminated</w:t>
+            </w:r>
+          </w:p>
+        </w:tc>
+        <w:tc>
+          <w:tcPr>
+            <w:tcW w:type="dxa" w:w="4680"/>
+            <w:tcBorders>
+              <w:top w:val="single" w:color="CCCCCC" w:sz="1"/>
+              <w:left w:val="single" w:color="CCCCCC" w:sz="1"/>
+              <w:bottom w:val="single" w:color="CCCCCC" w:sz="1"/>
+              <w:right w:val="single" w:color="CCCCCC" w:sz="1"/>
+            </w:tcBorders>
+            <w:tcMar>
+              <w:top w:type="dxa" w:w="60"/>
+              <w:left w:type="dxa" w:w="110"/>
+              <w:bottom w:type="dxa" w:w="60"/>
+              <w:right w:type="dxa" w:w="110"/>
+            </w:tcMar>
+            <w:vAlign w:val="center"/>
+          </w:tcPr>
+          <w:p>
+            <w:pPr>
+              <w:spacing w:after="0"/>
+            </w:pPr>
+            <w:r>
+              <w:rPr>
+                <w:b w:val="false"/>
+                <w:bCs w:val="false"/>
+                <w:sz w:val="20"/>
+                <w:szCs w:val="20"/>
+              </w:rPr>
+              <w:t xml:space="preserve">Removed from rotation in ~6 s</w:t>
+            </w:r>
+          </w:p>
+        </w:tc>
+      </w:tr>
+      <w:tr>
+        <w:trPr>
+          <w:tblHeader w:val="false"/>
+        </w:trPr>
+        <w:tc>
+          <w:tcPr>
+            <w:tcW w:type="dxa" w:w="4680"/>
+            <w:tcBorders>
+              <w:top w:val="single" w:color="CCCCCC" w:sz="1"/>
+              <w:left w:val="single" w:color="CCCCCC" w:sz="1"/>
+              <w:bottom w:val="single" w:color="CCCCCC" w:sz="1"/>
+              <w:right w:val="single" w:color="CCCCCC" w:sz="1"/>
+            </w:tcBorders>
+            <w:tcMar>
+              <w:top w:type="dxa" w:w="60"/>
+              <w:left w:type="dxa" w:w="110"/>
+              <w:bottom w:type="dxa" w:w="60"/>
+              <w:right w:type="dxa" w:w="110"/>
+            </w:tcMar>
+            <w:vAlign w:val="center"/>
+          </w:tcPr>
+          <w:p>
+            <w:pPr>
+              <w:spacing w:after="0"/>
+            </w:pPr>
+            <w:r>
+              <w:rPr>
+                <w:b w:val="false"/>
+                <w:bCs w:val="false"/>
+                <w:sz w:val="20"/>
+                <w:szCs w:val="20"/>
+              </w:rPr>
+              <w:t xml:space="preserve">Client-visible outage</w:t>
+            </w:r>
+          </w:p>
+        </w:tc>
+        <w:tc>
+          <w:tcPr>
+            <w:tcW w:type="dxa" w:w="4680"/>
+            <w:tcBorders>
+              <w:top w:val="single" w:color="CCCCCC" w:sz="1"/>
+              <w:left w:val="single" w:color="CCCCCC" w:sz="1"/>
+              <w:bottom w:val="single" w:color="CCCCCC" w:sz="1"/>
+              <w:right w:val="single" w:color="CCCCCC" w:sz="1"/>
+            </w:tcBorders>
+            <w:tcMar>
+              <w:top w:type="dxa" w:w="60"/>
+              <w:left w:type="dxa" w:w="110"/>
+              <w:bottom w:type="dxa" w:w="60"/>
+              <w:right w:type="dxa" w:w="110"/>
+            </w:tcMar>
+            <w:vAlign w:val="center"/>
+          </w:tcPr>
+          <w:p>
+            <w:pPr>
+              <w:spacing w:after="0"/>
+            </w:pPr>
+            <w:r>
+              <w:rPr>
+                <w:b w:val="false"/>
+                <w:bCs w:val="false"/>
+                <w:sz w:val="20"/>
+                <w:szCs w:val="20"/>
+              </w:rPr>
+              <w:t xml:space="preserve">NONE — 0 of 454 health checks failed (0.00%)</w:t>
+            </w:r>
+          </w:p>
+        </w:tc>
+      </w:tr>
+      <w:tr>
+        <w:trPr>
+          <w:tblHeader w:val="false"/>
+        </w:trPr>
+        <w:tc>
+          <w:tcPr>
+            <w:tcW w:type="dxa" w:w="4680"/>
+            <w:tcBorders>
+              <w:top w:val="single" w:color="CCCCCC" w:sz="1"/>
+              <w:left w:val="single" w:color="CCCCCC" w:sz="1"/>
+              <w:bottom w:val="single" w:color="CCCCCC" w:sz="1"/>
+              <w:right w:val="single" w:color="CCCCCC" w:sz="1"/>
+            </w:tcBorders>
+            <w:tcMar>
+              <w:top w:type="dxa" w:w="60"/>
+              <w:left w:type="dxa" w:w="110"/>
+              <w:bottom w:type="dxa" w:w="60"/>
+              <w:right w:type="dxa" w:w="110"/>
+            </w:tcMar>
+            <w:vAlign w:val="center"/>
+          </w:tcPr>
+          <w:p>
+            <w:pPr>
+              <w:spacing w:after="0"/>
+            </w:pPr>
+            <w:r>
+              <w:rPr>
+                <w:b w:val="false"/>
+                <w:bCs w:val="false"/>
+                <w:sz w:val="20"/>
+                <w:szCs w:val="20"/>
+              </w:rPr>
+              <w:t xml:space="preserve">Self-heal recovery</w:t>
+            </w:r>
+          </w:p>
+        </w:tc>
+        <w:tc>
+          <w:tcPr>
+            <w:tcW w:type="dxa" w:w="4680"/>
+            <w:tcBorders>
+              <w:top w:val="single" w:color="CCCCCC" w:sz="1"/>
+              <w:left w:val="single" w:color="CCCCCC" w:sz="1"/>
+              <w:bottom w:val="single" w:color="CCCCCC" w:sz="1"/>
+              <w:right w:val="single" w:color="CCCCCC" w:sz="1"/>
+            </w:tcBorders>
+            <w:tcMar>
+              <w:top w:type="dxa" w:w="60"/>
+              <w:left w:type="dxa" w:w="110"/>
+              <w:bottom w:type="dxa" w:w="60"/>
+              <w:right w:type="dxa" w:w="110"/>
+            </w:tcMar>
+            <w:vAlign w:val="center"/>
+          </w:tcPr>
+          <w:p>
+            <w:pPr>
+              <w:spacing w:after="0"/>
+            </w:pPr>
+            <w:r>
+              <w:rPr>
+                <w:b w:val="false"/>
+                <w:bCs w:val="false"/>
+                <w:sz w:val="20"/>
+                <w:szCs w:val="20"/>
+              </w:rPr>
+              <w:t xml:space="preserve">~117 s — the ASG launched and registered a replacement</w:t>
+            </w:r>
+          </w:p>
+        </w:tc>
+      </w:tr>
+      <w:tr>
+        <w:trPr>
+          <w:tblHeader w:val="false"/>
+        </w:trPr>
+        <w:tc>
+          <w:tcPr>
+            <w:tcW w:type="dxa" w:w="4680"/>
+            <w:tcBorders>
+              <w:top w:val="single" w:color="CCCCCC" w:sz="1"/>
+              <w:left w:val="single" w:color="CCCCCC" w:sz="1"/>
+              <w:bottom w:val="single" w:color="CCCCCC" w:sz="1"/>
+              <w:right w:val="single" w:color="CCCCCC" w:sz="1"/>
+            </w:tcBorders>
+            <w:tcMar>
+              <w:top w:type="dxa" w:w="60"/>
+              <w:left w:type="dxa" w:w="110"/>
+              <w:bottom w:type="dxa" w:w="60"/>
+              <w:right w:type="dxa" w:w="110"/>
+            </w:tcMar>
+            <w:vAlign w:val="center"/>
+          </w:tcPr>
+          <w:p>
+            <w:pPr>
+              <w:spacing w:after="0"/>
+            </w:pPr>
+            <w:r>
+              <w:rPr>
+                <w:b w:val="false"/>
+                <w:bCs w:val="false"/>
+                <w:sz w:val="20"/>
+                <w:szCs w:val="20"/>
+              </w:rPr>
+              <w:t xml:space="preserve">Single-instance equivalent</w:t>
+            </w:r>
+          </w:p>
+        </w:tc>
+        <w:tc>
+          <w:tcPr>
+            <w:tcW w:type="dxa" w:w="4680"/>
+            <w:tcBorders>
+              <w:top w:val="single" w:color="CCCCCC" w:sz="1"/>
+              <w:left w:val="single" w:color="CCCCCC" w:sz="1"/>
+              <w:bottom w:val="single" w:color="CCCCCC" w:sz="1"/>
+              <w:right w:val="single" w:color="CCCCCC" w:sz="1"/>
+            </w:tcBorders>
+            <w:tcMar>
+              <w:top w:type="dxa" w:w="60"/>
+              <w:left w:type="dxa" w:w="110"/>
+              <w:bottom w:type="dxa" w:w="60"/>
+              <w:right w:type="dxa" w:w="110"/>
+            </w:tcMar>
+            <w:vAlign w:val="center"/>
+          </w:tcPr>
+          <w:p>
+            <w:pPr>
+              <w:spacing w:after="0"/>
+            </w:pPr>
+            <w:r>
+              <w:rPr>
+                <w:b w:val="false"/>
+                <w:bCs w:val="false"/>
+                <w:sz w:val="20"/>
+                <w:szCs w:val="20"/>
+              </w:rPr>
+              <w:t xml:space="preserve">100% outage until a manual redeploy</w:t>
+            </w:r>
+          </w:p>
+        </w:tc>
+      </w:tr>
+    </w:tbl>
+    <w:p>
+      <w:pPr>
+        <w:spacing w:after="120"/>
+      </w:pPr>
+      <w:r>
+        <w:rPr>
+          <w:b/>
+          <w:bCs/>
+        </w:rPr>
+        <w:t xml:space="preserve">Finding: killing one instance caused zero client-visible downtime — the load balancer instantly routed traffic to the surviving instance — and the Auto Scaling Group automatically replaced the dead instance within ~2 minutes (desired-state reconciliation). This is the “cattle, not pets” model in action: in the single-instance design the same failure would be a total outage requiring manual intervention, whereas the elastic fleet absorbed it transparently and recovered on its own. Lambda is inherently resilient in the same way (each request runs in an isolated, automatically-managed environment).</w:t>
+      </w:r>
+    </w:p>
+    <w:p>
+      <w:pPr>
         <w:pStyle w:val="Heading1"/>
       </w:pPr>
       <w:r>
@@ -5428,6 +6889,52 @@
     </w:p>
     <w:p>
       <w:pPr>
+        <w:spacing w:after="120" w:before="120"/>
+        <w:jc w:val="center"/>
+      </w:pPr>
+      <w:r>
+        <w:drawing>
+          <wp:inline distT="0" distB="0" distL="0" distR="0">
+            <wp:extent cx="5334000" cy="3771900"/>
+            <wp:effectExtent t="0" r="0" b="0" l="0"/>
+            <wp:docPr id="1" name="vpc" descr="BZ-Agent custom VPC" title="VPC"/>
+            <wp:cNvGraphicFramePr>
+              <a:graphicFrameLocks xmlns:a="http://schemas.openxmlformats.org/drawingml/2006/main" noChangeAspect="1"/>
+            </wp:cNvGraphicFramePr>
+            <a:graphic xmlns:a="http://schemas.openxmlformats.org/drawingml/2006/main">
+              <a:graphicData uri="http://schemas.openxmlformats.org/drawingml/2006/picture">
+                <pic:pic xmlns:pic="http://schemas.openxmlformats.org/drawingml/2006/picture">
+                  <pic:nvPicPr>
+                    <pic:cNvPr id="0" name="" descr=""/>
+                    <pic:cNvPicPr>
+                      <a:picLocks noChangeAspect="1" noChangeArrowheads="1"/>
+                    </pic:cNvPicPr>
+                  </pic:nvPicPr>
+                  <pic:blipFill>
+                    <a:blip r:embed="rId11" cstate="none"/>
+                    <a:srcRect/>
+                    <a:stretch>
+                      <a:fillRect/>
+                    </a:stretch>
+                  </pic:blipFill>
+                  <pic:spPr bwMode="auto">
+                    <a:xfrm>
+                      <a:off x="0" y="0"/>
+                      <a:ext cx="5334000" cy="3771900"/>
+                    </a:xfrm>
+                    <a:prstGeom prst="rect">
+                      <a:avLst/>
+                    </a:prstGeom>
+                  </pic:spPr>
+                </pic:pic>
+              </a:graphicData>
+            </a:graphic>
+          </wp:inline>
+        </w:drawing>
+      </w:r>
+    </w:p>
+    <w:p>
+      <w:pPr>
         <w:pStyle w:val="ListParagraph"/>
         <w:numPr>
           <w:ilvl w:val="0"/>
@@ -5896,6 +7403,75 @@
                 <w:szCs w:val="20"/>
               </w:rPr>
               <w:t xml:space="preserve">Live: emits 3 progress events, then the itinerary</w:t>
+            </w:r>
+          </w:p>
+        </w:tc>
+      </w:tr>
+      <w:tr>
+        <w:trPr>
+          <w:tblHeader w:val="false"/>
+        </w:trPr>
+        <w:tc>
+          <w:tcPr>
+            <w:tcW w:type="dxa" w:w="3120"/>
+            <w:tcBorders>
+              <w:top w:val="single" w:color="CCCCCC" w:sz="1"/>
+              <w:left w:val="single" w:color="CCCCCC" w:sz="1"/>
+              <w:bottom w:val="single" w:color="CCCCCC" w:sz="1"/>
+              <w:right w:val="single" w:color="CCCCCC" w:sz="1"/>
+            </w:tcBorders>
+            <w:tcMar>
+              <w:top w:type="dxa" w:w="60"/>
+              <w:left w:type="dxa" w:w="110"/>
+              <w:bottom w:type="dxa" w:w="60"/>
+              <w:right w:type="dxa" w:w="110"/>
+            </w:tcMar>
+            <w:vAlign w:val="center"/>
+          </w:tcPr>
+          <w:p>
+            <w:pPr>
+              <w:spacing w:after="0"/>
+            </w:pPr>
+            <w:r>
+              <w:rPr>
+                <w:b w:val="false"/>
+                <w:bCs w:val="false"/>
+                <w:sz w:val="20"/>
+                <w:szCs w:val="20"/>
+              </w:rPr>
+              <w:t xml:space="preserve">Elastic fleet (ALB + ASG)</w:t>
+            </w:r>
+          </w:p>
+        </w:tc>
+        <w:tc>
+          <w:tcPr>
+            <w:tcW w:type="dxa" w:w="6240"/>
+            <w:tcBorders>
+              <w:top w:val="single" w:color="CCCCCC" w:sz="1"/>
+              <w:left w:val="single" w:color="CCCCCC" w:sz="1"/>
+              <w:bottom w:val="single" w:color="CCCCCC" w:sz="1"/>
+              <w:right w:val="single" w:color="CCCCCC" w:sz="1"/>
+            </w:tcBorders>
+            <w:tcMar>
+              <w:top w:type="dxa" w:w="60"/>
+              <w:left w:type="dxa" w:w="110"/>
+              <w:bottom w:type="dxa" w:w="60"/>
+              <w:right w:type="dxa" w:w="110"/>
+            </w:tcMar>
+            <w:vAlign w:val="center"/>
+          </w:tcPr>
+          <w:p>
+            <w:pPr>
+              <w:spacing w:after="0"/>
+            </w:pPr>
+            <w:r>
+              <w:rPr>
+                <w:b w:val="false"/>
+                <w:bCs w:val="false"/>
+                <w:sz w:val="20"/>
+                <w:szCs w:val="20"/>
+              </w:rPr>
+              <w:t xml:space="preserve">2 healthy targets; +70% throughput at 300 conc.; self-healed in ~117 s</w:t>
             </w:r>
           </w:p>
         </w:tc>
@@ -7007,6 +8583,19 @@
       </w:pPr>
       <w:r>
         <w:t xml:space="preserve">Live SASA bus / GTFS schedules so the Reasoner can suggest exact departures. (Not in the ODH public flat API; would require integrating SASA’s separate GTFS feed.)</w:t>
+      </w:r>
+    </w:p>
+    <w:p>
+      <w:pPr>
+        <w:pStyle w:val="ListParagraph"/>
+        <w:numPr>
+          <w:ilvl w:val="0"/>
+          <w:numId w:val="2"/>
+        </w:numPr>
+        <w:spacing w:after="60"/>
+      </w:pPr>
+      <w:r>
+        <w:t xml:space="preserve">Add a target-tracking auto-scaling policy so the fleet scales the instance count automatically on CPU/request metrics (the experiment used a fixed desired capacity of 2).</w:t>
       </w:r>
     </w:p>
     <w:p>

</xml_diff>

<commit_message>
Add authors, GitHub link, and project README
- Report title page + appendix now show authors (Nidhal Karchoud, Abdellah Derf) and the repo link
- Add top-level README.md so the GitHub homepage shows the project overview, authors, architecture, and key results
</commit_message>
<xml_diff>
--- a/report/BZ-Agent_Report.docx
+++ b/report/BZ-Agent_Report.docx
@@ -65,7 +65,47 @@
     </w:p>
     <w:p>
       <w:pPr>
-        <w:spacing w:before="1400"/>
+        <w:spacing w:before="360"/>
+        <w:jc w:val="center"/>
+      </w:pPr>
+      <w:r>
+        <w:rPr>
+          <w:b/>
+          <w:bCs/>
+          <w:color w:val="0F172A"/>
+          <w:sz w:val="24"/>
+          <w:szCs w:val="24"/>
+        </w:rPr>
+        <w:t xml:space="preserve">Nidhal Karchoud  ·  Abdellah Derf</w:t>
+      </w:r>
+    </w:p>
+    <w:p>
+      <w:pPr>
+        <w:spacing w:before="200"/>
+        <w:jc w:val="center"/>
+      </w:pPr>
+      <w:r>
+        <w:rPr>
+          <w:color w:val="475569"/>
+          <w:sz w:val="18"/>
+          <w:szCs w:val="18"/>
+        </w:rPr>
+        <w:t xml:space="preserve">Code repository: </w:t>
+      </w:r>
+      <w:hyperlink w:history="1" r:id="rIdkb1fliwzeooo9mt4r47am">
+        <w:r>
+          <w:rPr>
+            <w:rStyle w:val="Hyperlink"/>
+            <w:sz w:val="18"/>
+            <w:szCs w:val="18"/>
+          </w:rPr>
+          <w:t xml:space="preserve">https://github.com/yar01110/bz-agent</w:t>
+        </w:r>
+      </w:hyperlink>
+    </w:p>
+    <w:p>
+      <w:pPr>
+        <w:spacing w:before="1000"/>
         <w:jc w:val="center"/>
       </w:pPr>
       <w:r>
@@ -8631,6 +8671,26 @@
       <w:r>
         <w:t xml:space="preserve">Appendix A. Project Structure &amp; Endpoints</w:t>
       </w:r>
+    </w:p>
+    <w:p>
+      <w:pPr>
+        <w:spacing w:after="120"/>
+      </w:pPr>
+      <w:r>
+        <w:rPr>
+          <w:b/>
+          <w:bCs/>
+        </w:rPr>
+        <w:t xml:space="preserve">Full source code: </w:t>
+      </w:r>
+      <w:hyperlink w:history="1" r:id="rIdgz3zlefuuwb7fvv4bker5">
+        <w:r>
+          <w:rPr>
+            <w:rStyle w:val="Hyperlink"/>
+          </w:rPr>
+          <w:t xml:space="preserve">https://github.com/yar01110/bz-agent</w:t>
+        </w:r>
+      </w:hyperlink>
     </w:p>
     <w:p>
       <w:pPr>

</xml_diff>

<commit_message>
Set repository links to https://github.com/yar01110/bz-agent
README, report (.docx), and presentation (.pptx) all reference the repo URL.
</commit_message>
<xml_diff>
--- a/report/BZ-Agent_Report.docx
+++ b/report/BZ-Agent_Report.docx
@@ -92,7 +92,7 @@
         </w:rPr>
         <w:t xml:space="preserve">Code repository: </w:t>
       </w:r>
-      <w:hyperlink w:history="1" r:id="rIdkb1fliwzeooo9mt4r47am">
+      <w:hyperlink w:history="1" r:id="rId5gclmpkxzllgtkdswjs1t">
         <w:r>
           <w:rPr>
             <w:rStyle w:val="Hyperlink"/>
@@ -8683,7 +8683,7 @@
         </w:rPr>
         <w:t xml:space="preserve">Full source code: </w:t>
       </w:r>
-      <w:hyperlink w:history="1" r:id="rIdgz3zlefuuwb7fvv4bker5">
+      <w:hyperlink w:history="1" r:id="rIdcwapbolbrhzvbortmxxtj">
         <w:r>
           <w:rPr>
             <w:rStyle w:val="Hyperlink"/>

</xml_diff>